<commit_message>
docs: focus development on iOS and record backend deployment
</commit_message>
<xml_diff>
--- a/docs/UniPO-开发规划书-v1.0.docx
+++ b/docs/UniPO-开发规划书-v1.0.docx
@@ -20,7 +20,7 @@
           <w:rFonts w:ascii="Arial Unicode MS" w:hAnsi="Arial Unicode MS" w:eastAsia="Arial Unicode MS" w:cs="Arial Unicode MS"/>
           <w:color w:val="000000"/>
         </w:rPr>
-        <w:t>版本：1.0　基线日期：2026 年 10 月 21 日　适用范围：单校试点版本至可复制版本</w:t>
+        <w:t>版本：1.1　基线日期：2026 年 10 月 21 日　适用范围：iOS 单校试点版本至可复制版本</w:t>
       </w:r>
     </w:p>
     <w:p>
@@ -29,7 +29,7 @@
           <w:rFonts w:ascii="Arial Unicode MS" w:hAnsi="Arial Unicode MS" w:eastAsia="Arial Unicode MS" w:cs="Arial Unicode MS"/>
           <w:color w:val="000000"/>
         </w:rPr>
-        <w:t>面向：产品负责人、设计、后端、iOS、Web、测试、基础设施与校园运营。本文规定后续开发的交付范围、先后依赖、工作量假设和验收方式。所有排期、资源、试点规模与指标阈值均为规划建议，按实际人力与试点反馈调整。</w:t>
+        <w:t>面向：产品负责人、设计、后端、iOS、测试、基础设施与校园运营。本文规定后续开发的交付范围、先后依赖、工作量假设和验收方式。所有排期、资源、试点规模与指标阈值均为规划建议，按实际人力与试点反馈调整。</w:t>
       </w:r>
     </w:p>
     <w:p>
@@ -38,7 +38,7 @@
           <w:rFonts w:ascii="Arial Unicode MS" w:hAnsi="Arial Unicode MS" w:eastAsia="Arial Unicode MS" w:cs="Arial Unicode MS"/>
           <w:color w:val="000000"/>
         </w:rPr>
-        <w:t>本期目标是让一所学校、一个专业、一个年级的学生完成真实成长任务，并使团队能够维护内容、处理举报、解释数据和恢复服务。iOS 为主要使用端，Web 承接分享、阅读、轻量任务与管理后台。先完成安全与治理底线，再验证成长闭环和一个本地工具，最后根据连续试点数据决定扩展。</w:t>
+        <w:t>本期目标是让一所学校、一个专业、一个年级的学生在 iOS 内完成真实成长任务，并使团队能够维护内容、处理举报、解释数据和恢复服务。本期只开发原生 iOS、后端和基础设施；Web 用户端、网页分享、课表及新增管理网页暂缓。治理通过后端接口、受控工具和操作手册完成。先完成安全与治理底线，再验证成长闭环和一个本地工具，最后根据连续试点数据决定扩展。</w:t>
       </w:r>
     </w:p>
     <w:p>
@@ -319,7 +319,7 @@
           <w:rFonts w:ascii="Arial Unicode MS" w:hAnsi="Arial Unicode MS" w:eastAsia="Arial Unicode MS" w:cs="Arial Unicode MS"/>
           <w:color w:val="000000"/>
         </w:rPr>
-        <w:t>首个试点版本以五条用户旅程验收：访客阅读分享内容；登录并完善成长背景；查看并完成任务；使用图片转 PDF 并导出；提交举报并收到处理结果。私信、发 PO、收藏和个人主页沿用已有能力，补齐可靠性与错误恢复。</w:t>
+        <w:t>首个试点版本以五条用户旅程验收：iOS 内访客阅读允许公开的内容；登录并完善成长背景；查看并完成任务；使用图片转 PDF 并导出；提交举报并收到处理结果。私信、发 PO、收藏和个人主页沿用已有能力，补齐可靠性与错误恢复。</w:t>
       </w:r>
     </w:p>
     <w:p>
@@ -371,7 +371,7 @@
           <w:rFonts w:ascii="Arial Unicode MS" w:hAnsi="Arial Unicode MS" w:eastAsia="Arial Unicode MS" w:cs="Arial Unicode MS"/>
           <w:color w:val="000000"/>
         </w:rPr>
-        <w:t>Web 使用 httpOnly Cookie 与 CSRF；iOS 使用 Bearer 与 Keychain，URLSession 禁用 Cookie。</w:t>
+        <w:t>iOS 使用 Bearer 与 Keychain，URLSession 禁用 Cookie。既有 Cookie 与 CSRF 保留为后端兼容边界，不形成新增网页开发任务。</w:t>
       </w:r>
     </w:p>
     <w:p>
@@ -503,7 +503,7 @@
           <w:rFonts w:ascii="Arial Unicode MS" w:hAnsi="Arial Unicode MS" w:eastAsia="Arial Unicode MS" w:cs="Arial Unicode MS"/>
           <w:color w:val="000000"/>
         </w:rPr>
-        <w:t>仓库已有 Spring Boot 后端、MySQL 与 Flyway、MinIO、可选 Redis、Cookie 与 Bearer 双认证、WebSocket、帖子游标分页、OpenAPI 类型断言、管理后台和 CI。iOS 已有登录、引导、信息流、帖子详情、发布、私信、成就和个人主页。</w:t>
+        <w:t>仓库已有 Spring Boot 后端、MySQL 与 Flyway、MinIO、可选 Redis、Cookie 与 Bearer 双认证、WebSocket、帖子游标分页、OpenAPI 类型断言和 CI。iOS 已有登录、引导、信息流、帖子详情、发布、私信、成就和个人主页。既有 Web 与管理后台源码保留，当前暂停功能开发。</w:t>
       </w:r>
     </w:p>
     <w:p>
@@ -1020,7 +1020,7 @@
                 <w:color w:val="000000"/>
                 <w:sz w:val="21"/>
               </w:rPr>
-              <w:t>Web 承接</w:t>
+              <w:t>治理</w:t>
             </w:r>
           </w:p>
         </w:tc>
@@ -1046,7 +1046,7 @@
                 <w:color w:val="000000"/>
                 <w:sz w:val="21"/>
               </w:rPr>
-              <w:t>帖子详情用弹窗；缺独立任务及分享路由</w:t>
+              <w:t>可提交举报，缺完整处置与申诉</w:t>
             </w:r>
           </w:p>
         </w:tc>
@@ -1072,7 +1072,7 @@
                 <w:color w:val="000000"/>
                 <w:sz w:val="21"/>
               </w:rPr>
-              <w:t>可直接访问的帖子和任务链接，登录后返回原处</w:t>
+              <w:t>治理 API、受控操作工具、审计、iOS 回执、申诉及值守</w:t>
             </w:r>
           </w:p>
         </w:tc>
@@ -1103,7 +1103,7 @@
                 <w:color w:val="000000"/>
                 <w:sz w:val="21"/>
               </w:rPr>
-              <w:t>治理</w:t>
+              <w:t>可靠性</w:t>
             </w:r>
           </w:p>
         </w:tc>
@@ -1129,7 +1129,7 @@
                 <w:color w:val="000000"/>
                 <w:sz w:val="21"/>
               </w:rPr>
-              <w:t>可提交举报，缺完整后台处理与申诉</w:t>
+              <w:t>会话吊销、Redis 索引、事务投递和计数有风险待验证</w:t>
             </w:r>
           </w:p>
         </w:tc>
@@ -1155,7 +1155,7 @@
                 <w:color w:val="000000"/>
                 <w:sz w:val="21"/>
               </w:rPr>
-              <w:t>举报队列、处理、审计、回执、申诉及值守</w:t>
+              <w:t>针对性复现、修复与真实依赖集成测试</w:t>
             </w:r>
           </w:p>
         </w:tc>
@@ -1186,7 +1186,7 @@
                 <w:color w:val="000000"/>
                 <w:sz w:val="21"/>
               </w:rPr>
-              <w:t>可靠性</w:t>
+              <w:t>发布</w:t>
             </w:r>
           </w:p>
         </w:tc>
@@ -1212,7 +1212,7 @@
                 <w:color w:val="000000"/>
                 <w:sz w:val="21"/>
               </w:rPr>
-              <w:t>会话吊销、Redis 索引、事务投递和计数有风险待验证</w:t>
+              <w:t>iOS 地址已指向服务器 IP，签名配置与 HTTPS 仍待正式验收</w:t>
             </w:r>
           </w:p>
         </w:tc>
@@ -1238,7 +1238,7 @@
                 <w:color w:val="000000"/>
                 <w:sz w:val="21"/>
               </w:rPr>
-              <w:t>针对性复现、修复与真实依赖集成测试</w:t>
+              <w:t>区分开发与 Release，验证 HTTPS、签名、真机与推送</w:t>
             </w:r>
           </w:p>
         </w:tc>
@@ -1269,7 +1269,7 @@
                 <w:color w:val="000000"/>
                 <w:sz w:val="21"/>
               </w:rPr>
-              <w:t>发布</w:t>
+              <w:t>数据</w:t>
             </w:r>
           </w:p>
         </w:tc>
@@ -1295,7 +1295,7 @@
                 <w:color w:val="000000"/>
                 <w:sz w:val="21"/>
               </w:rPr>
-              <w:t>iOS 工程仍有 localhost 与开发签名配置</w:t>
+              <w:t>有分析表，尚无完整事件流水与漏斗</w:t>
             </w:r>
           </w:p>
         </w:tc>
@@ -1321,7 +1321,7 @@
                 <w:color w:val="000000"/>
                 <w:sz w:val="21"/>
               </w:rPr>
-              <w:t>区分开发与 Release，验证 HTTPS、签名、真机与推送</w:t>
+              <w:t>可复算指标与受控查询、导出，不新增网页报表</w:t>
             </w:r>
           </w:p>
         </w:tc>
@@ -1352,7 +1352,7 @@
                 <w:color w:val="000000"/>
                 <w:sz w:val="21"/>
               </w:rPr>
-              <w:t>数据</w:t>
+              <w:t>设计</w:t>
             </w:r>
           </w:p>
         </w:tc>
@@ -1378,7 +1378,7 @@
                 <w:color w:val="000000"/>
                 <w:sz w:val="21"/>
               </w:rPr>
-              <w:t>有分析表，尚无完整事件流水与漏斗</w:t>
+              <w:t>已有 iOS Theme 与主页样式，组件状态尚未收口</w:t>
             </w:r>
           </w:p>
         </w:tc>
@@ -1404,90 +1404,7 @@
                 <w:color w:val="000000"/>
                 <w:sz w:val="21"/>
               </w:rPr>
-              <w:t>可复算的激活、任务、留存和治理指标</w:t>
-            </w:r>
-          </w:p>
-        </w:tc>
-      </w:tr>
-      <w:tr>
-        <w:trPr>
-          <w:cantSplit/>
-        </w:trPr>
-        <w:tc>
-          <w:tcPr>
-            <w:tcW w:type="dxa" w:w="1915"/>
-            <w:vAlign w:val="center"/>
-            <w:shd w:fill="F3F6F9"/>
-            <w:tcMar>
-              <w:top w:w="90" w:type="dxa"/>
-              <w:bottom w:w="90" w:type="dxa"/>
-              <w:left w:w="100" w:type="dxa"/>
-              <w:right w:w="100" w:type="dxa"/>
-            </w:tcMar>
-          </w:tcPr>
-          <w:p>
-            <w:pPr>
-              <w:spacing w:after="0" w:line="269" w:lineRule="auto"/>
-            </w:pPr>
-            <w:r>
-              <w:rPr>
-                <w:rFonts w:ascii="Arial Unicode MS" w:hAnsi="Arial Unicode MS" w:eastAsia="Arial Unicode MS" w:cs="Arial Unicode MS"/>
-                <w:color w:val="000000"/>
-                <w:sz w:val="21"/>
-              </w:rPr>
-              <w:t>设计</w:t>
-            </w:r>
-          </w:p>
-        </w:tc>
-        <w:tc>
-          <w:tcPr>
-            <w:tcW w:type="dxa" w:w="4939"/>
-            <w:vAlign w:val="center"/>
-            <w:shd w:fill="F3F6F9"/>
-            <w:tcMar>
-              <w:top w:w="90" w:type="dxa"/>
-              <w:bottom w:w="90" w:type="dxa"/>
-              <w:left w:w="100" w:type="dxa"/>
-              <w:right w:w="100" w:type="dxa"/>
-            </w:tcMar>
-          </w:tcPr>
-          <w:p>
-            <w:pPr>
-              <w:spacing w:after="0" w:line="269" w:lineRule="auto"/>
-            </w:pPr>
-            <w:r>
-              <w:rPr>
-                <w:rFonts w:ascii="Arial Unicode MS" w:hAnsi="Arial Unicode MS" w:eastAsia="Arial Unicode MS" w:cs="Arial Unicode MS"/>
-                <w:color w:val="000000"/>
-                <w:sz w:val="21"/>
-              </w:rPr>
-              <w:t>有 iOS Theme 与主页样式，Web 语义尚未收口</w:t>
-            </w:r>
-          </w:p>
-        </w:tc>
-        <w:tc>
-          <w:tcPr>
-            <w:tcW w:type="dxa" w:w="3226"/>
-            <w:vAlign w:val="center"/>
-            <w:shd w:fill="F3F6F9"/>
-            <w:tcMar>
-              <w:top w:w="90" w:type="dxa"/>
-              <w:bottom w:w="90" w:type="dxa"/>
-              <w:left w:w="100" w:type="dxa"/>
-              <w:right w:w="100" w:type="dxa"/>
-            </w:tcMar>
-          </w:tcPr>
-          <w:p>
-            <w:pPr>
-              <w:spacing w:after="0" w:line="269" w:lineRule="auto"/>
-            </w:pPr>
-            <w:r>
-              <w:rPr>
-                <w:rFonts w:ascii="Arial Unicode MS" w:hAnsi="Arial Unicode MS" w:eastAsia="Arial Unicode MS" w:cs="Arial Unicode MS"/>
-                <w:color w:val="000000"/>
-                <w:sz w:val="21"/>
-              </w:rPr>
-              <w:t>共享语义与组件状态，保留平台和主页特定规则</w:t>
+              <w:t>完善 Swift 语义 tokens 与组件状态，保留主页特定规则</w:t>
             </w:r>
           </w:p>
         </w:tc>
@@ -1860,7 +1777,7 @@
                 <w:color w:val="000000"/>
                 <w:sz w:val="21"/>
               </w:rPr>
-              <w:t>单校 30 至 50 名种子用户</w:t>
+              <w:t>单校 30 至 50 名 iOS 种子用户</w:t>
             </w:r>
           </w:p>
         </w:tc>
@@ -1886,7 +1803,7 @@
                 <w:color w:val="000000"/>
                 <w:sz w:val="21"/>
               </w:rPr>
-              <w:t>治理闭环、一个工具、分享落地、核心埋点、恢复能力</w:t>
+              <w:t>治理闭环、一个工具、App 内阅读与任务回流、核心埋点、恢复能力</w:t>
             </w:r>
           </w:p>
         </w:tc>
@@ -2173,7 +2090,7 @@
           <w:rFonts w:ascii="Arial Unicode MS" w:hAnsi="Arial Unicode MS" w:eastAsia="Arial Unicode MS" w:cs="Arial Unicode MS"/>
           <w:color w:val="000000"/>
         </w:rPr>
-        <w:t>优先交付成长背景、阶段匹配、任务详情与完成记录、关联攻略、内容有效期、图片转 PDF、账号安全、举报与拉黑、Web 分享回流、关键消息可靠性、埋点、备份与发布配置。既有帖子、评论、收藏、个人主页保持可用并处理阻断缺陷。</w:t>
+        <w:t>优先交付成长背景、阶段匹配、任务详情与完成记录、关联攻略、内容有效期、图片转 PDF、账号安全、举报与拉黑、App 内内容回流、关键消息可靠性、埋点、备份与发布配置。既有 iOS 帖子、评论、收藏、个人主页保持可用并处理阻断缺陷。</w:t>
       </w:r>
     </w:p>
     <w:p>
@@ -2182,7 +2099,7 @@
           <w:rFonts w:ascii="Arial Unicode MS" w:hAnsi="Arial Unicode MS" w:eastAsia="Arial Unicode MS" w:cs="Arial Unicode MS"/>
           <w:color w:val="000000"/>
         </w:rPr>
-        <w:t>课程表首版建议明确为 Web 本机保存，提供字段说明、手工编辑与备份导出；若暂不实现导入，则隐藏导入成功的假动作。跨设备同步、教务抓取和 iOS 原生课表另立需求。</w:t>
+        <w:t>课程表整体暂缓，现有实现保留，不将原网页课表任务转成新的 iOS 课表需求。本期不安排网页分享路由、SEO、响应式、网页端工具、新增管理页面或 Web E2E。</w:t>
       </w:r>
     </w:p>
     <w:p>
@@ -2212,7 +2129,7 @@
           <w:rFonts w:ascii="Arial Unicode MS" w:hAnsi="Arial Unicode MS" w:eastAsia="Arial Unicode MS" w:cs="Arial Unicode MS"/>
           <w:color w:val="000000"/>
         </w:rPr>
-        <w:t>遇到进度压力时，先削减装饰动效、完整深色主题、次要工具、课表导入和高级报表；保留成长闭环、身份安全、举报处置、数据真实性和恢复能力。若关键安全或消息可靠性无法按期验收，顺延试点，或关闭对应未验收能力后重新评审范围。</w:t>
+        <w:t>遇到进度压力时，先削减装饰动效、完整深色主题、次要工具和高级分析；保留成长闭环、身份安全、举报处置、数据真实性和恢复能力。若关键安全或消息可靠性无法按期验收，顺延试点，或关闭对应未验收能力后重新评审范围。</w:t>
       </w:r>
     </w:p>
     <w:p>
@@ -2256,7 +2173,7 @@
           <w:rFonts w:ascii="Arial Unicode MS" w:hAnsi="Arial Unicode MS" w:eastAsia="Arial Unicode MS" w:cs="Arial Unicode MS"/>
           <w:color w:val="000000"/>
         </w:rPr>
-        <w:t>内容路径：分享链接 → Web 阅读 → 可选登录收藏或参与 → 返回原内容；App 已安装时可进入对应页面，未安装时继续 Web 阅读。</w:t>
+        <w:t>内容路径：iOS 内信息流或任务关联 → 阅读攻略 → 可选登录收藏或参与 → 返回原任务。通知进入时定位对应内容；网页阅读和未安装时的浏览器兜底不属于本期交付。</w:t>
       </w:r>
     </w:p>
     <w:p>
@@ -2286,44 +2203,7 @@
           <w:rFonts w:ascii="Arial Unicode MS" w:hAnsi="Arial Unicode MS" w:eastAsia="Arial Unicode MS" w:cs="Arial Unicode MS"/>
           <w:color w:val="000000"/>
         </w:rPr>
-        <w:t>iOS 保留首页、工具、成就、我的等现有核心入口，发 PO 为突出操作，消息从首页入口进入。未登录点我的仍触发登录，并在完成后进入个人主页。通过通知、分享或登录跳转进入时，返回栈需能解释当前页面来自哪里。</w:t>
-      </w:r>
-    </w:p>
-    <w:p>
-      <w:r>
-        <w:rPr>
-          <w:rFonts w:ascii="Arial Unicode MS" w:hAnsi="Arial Unicode MS" w:eastAsia="Arial Unicode MS" w:cs="Arial Unicode MS"/>
-          <w:color w:val="000000"/>
-        </w:rPr>
-        <w:t xml:space="preserve">Web 优先建立 </w:t>
-      </w:r>
-      <w:r>
-        <w:rPr>
-          <w:rFonts w:ascii="Arial Unicode MS" w:hAnsi="Arial Unicode MS" w:eastAsia="Arial Unicode MS" w:cs="Arial Unicode MS"/>
-          <w:color w:val="000000"/>
-        </w:rPr>
-        <w:t>/p/:id</w:t>
-      </w:r>
-      <w:r>
-        <w:rPr>
-          <w:rFonts w:ascii="Arial Unicode MS" w:hAnsi="Arial Unicode MS" w:eastAsia="Arial Unicode MS" w:cs="Arial Unicode MS"/>
-          <w:color w:val="000000"/>
-        </w:rPr>
-        <w:t xml:space="preserve"> 帖子详情和 </w:t>
-      </w:r>
-      <w:r>
-        <w:rPr>
-          <w:rFonts w:ascii="Arial Unicode MS" w:hAnsi="Arial Unicode MS" w:eastAsia="Arial Unicode MS" w:cs="Arial Unicode MS"/>
-          <w:color w:val="000000"/>
-        </w:rPr>
-        <w:t>/tasks/:id</w:t>
-      </w:r>
-      <w:r>
-        <w:rPr>
-          <w:rFonts w:ascii="Arial Unicode MS" w:hAnsi="Arial Unicode MS" w:eastAsia="Arial Unicode MS" w:cs="Arial Unicode MS"/>
-          <w:color w:val="000000"/>
-        </w:rPr>
-        <w:t xml:space="preserve"> 任务详情等独立地址，具体路由名在实现时确定。保留桌面信息流与后台效率，手机端提供可阅读、可操作的响应式页面。登录后恢复原链接，内容被删除或不可见时给出明确原因及返回入口。</w:t>
+        <w:t>iOS 保留首页、工具、成就、我的等现有核心入口，发 PO 为突出操作，消息从首页入口进入。未登录点我的仍触发登录，并在完成后进入个人主页。通过通知或登录跳转进入时，恢复原任务或内容，返回栈需能解释当前页面来自哪里。内容被删除或不可见时给出明确原因及返回入口。</w:t>
       </w:r>
     </w:p>
     <w:p>
@@ -2335,7 +2215,7 @@
           <w:rFonts w:ascii="Arial Unicode MS" w:hAnsi="Arial Unicode MS" w:eastAsia="Arial Unicode MS" w:cs="Arial Unicode MS"/>
           <w:color w:val="000000"/>
         </w:rPr>
-        <w:t>跨端行为约定</w:t>
+        <w:t>iOS 与服务端一致性</w:t>
       </w:r>
     </w:p>
     <w:p>
@@ -2344,7 +2224,7 @@
           <w:rFonts w:ascii="Arial Unicode MS" w:hAnsi="Arial Unicode MS" w:eastAsia="Arial Unicode MS" w:cs="Arial Unicode MS"/>
           <w:color w:val="000000"/>
         </w:rPr>
-        <w:t>同一任务的适用范围、完成记录、撤回结果和权限由服务端定义，两端不各算一套。纯本地工具文件不上传业务服务；Web 本地课表不承诺与 iOS 同步。不能提供的跨端能力应在界面上说明。</w:t>
+        <w:t>任务的适用范围、完成记录、撤回结果和权限由服务端定义，iOS 展示服务端事实。多设备、重新登录与应用重启后结果一致；缓存与离线状态有明确刷新规则。纯本地工具文件不上传业务服务，也不承诺在设备间同步文件。</w:t>
       </w:r>
     </w:p>
     <w:p>
@@ -2475,7 +2355,7 @@
           <w:rFonts w:ascii="Arial Unicode MS" w:hAnsi="Arial Unicode MS" w:eastAsia="Arial Unicode MS" w:cs="Arial Unicode MS"/>
           <w:color w:val="000000"/>
         </w:rPr>
-        <w:t>验收：重复完成请求只产生一条有效记录和一次奖励；撤回后进度重算且规则明确；任务下架或版本变更后历史可解释；跨端结果一致；若有经验值变动，完成与撤回都能追溯。有效分母仅包含当前适用且发布的任务。用户自报暂不适用时不发奖励，并显示排除数量与原因；已完成任务需先撤回再排除，保留历史，避免靠缩小分母制造成长结果。</w:t>
+        <w:t>验收：重复完成请求只产生一条有效记录和一次奖励；撤回后进度重算且规则明确；任务下架或版本变更后历史可解释；iOS 多设备与服务端结果一致；若有经验值变动，完成与撤回都能追溯。有效分母仅包含当前适用且发布的任务。用户自报暂不适用时不发奖励，并显示排除数量与原因；已完成任务需先撤回再排除，保留历史，避免靠缩小分母制造成长结果。</w:t>
       </w:r>
     </w:p>
     <w:p>
@@ -2487,7 +2367,7 @@
           <w:rFonts w:ascii="Arial Unicode MS" w:hAnsi="Arial Unicode MS" w:eastAsia="Arial Unicode MS" w:cs="Arial Unicode MS"/>
           <w:color w:val="000000"/>
         </w:rPr>
-        <w:t>PO 内容与分享回流</w:t>
+        <w:t>PO 内容与攻略关联</w:t>
       </w:r>
     </w:p>
     <w:p>
@@ -2505,7 +2385,7 @@
           <w:rFonts w:ascii="Arial Unicode MS" w:hAnsi="Arial Unicode MS" w:eastAsia="Arial Unicode MS" w:cs="Arial Unicode MS"/>
           <w:color w:val="000000"/>
         </w:rPr>
-        <w:t>增加任务关联 PO、内容有效期与帮助反馈。分享页面可匿名阅读允许公开的内容，按原权限控制评论、收藏和非公开内容；不为分享而扩大原数据可见性。动态预览和搜索收录的具体范围在公开发布前单独验收。</w:t>
+        <w:t>增加任务关联 PO、内容有效期与帮助反馈。iOS 内按原权限控制公开阅读、评论、收藏和非公开内容；任务进入攻略后可返回原步骤。系统分享可导出文本或工具文件，但不承诺新增网页落地、动态预览或搜索收录。</w:t>
       </w:r>
     </w:p>
     <w:p>
@@ -2514,7 +2394,7 @@
           <w:rFonts w:ascii="Arial Unicode MS" w:hAnsi="Arial Unicode MS" w:eastAsia="Arial Unicode MS" w:cs="Arial Unicode MS"/>
           <w:color w:val="000000"/>
         </w:rPr>
-        <w:t>验收：直接打开链接不依赖此前浏览状态；登录后返回同一对象；正文与图片上传失败不丢草稿；重复点击发布不产生重复帖；下架、删除、拉黑、权限不足和网络失败均可辨识。</w:t>
+        <w:t>验收：从任务或通知打开内容不依赖此前浏览状态；登录后返回同一对象；正文与图片上传失败不丢草稿；重复点击发布不产生重复帖；下架、删除、拉黑、权限不足和网络失败均可辨识。</w:t>
       </w:r>
     </w:p>
     <w:p>
@@ -2535,7 +2415,7 @@
           <w:rFonts w:ascii="Arial Unicode MS" w:hAnsi="Arial Unicode MS" w:eastAsia="Arial Unicode MS" w:cs="Arial Unicode MS"/>
           <w:color w:val="000000"/>
         </w:rPr>
-        <w:t>建议先在 iOS 交付本地图片转 PDF：选择照片或文件、排序、删除、预览、生成、系统分享与保存。后续在 Web 对齐同一用户任务。试点免费使用，不先接金币和配额。内存与文件数量上限由真机测试确定，界面在处理前提示。</w:t>
+        <w:t>在 iOS 交付本地图片转 PDF：选择照片或文件、排序、删除、预览、生成、系统分享与保存。试点免费使用，不先接金币和配额。内存与文件数量上限由真机测试确定，界面在处理前提示。</w:t>
       </w:r>
     </w:p>
     <w:p>
@@ -2643,7 +2523,7 @@
           <w:rFonts w:ascii="Arial Unicode MS" w:hAnsi="Arial Unicode MS" w:eastAsia="Arial Unicode MS" w:cs="Arial Unicode MS"/>
           <w:color w:val="000000"/>
         </w:rPr>
-        <w:t>运营后台与举报</w:t>
+        <w:t>治理接口与受控运营</w:t>
       </w:r>
     </w:p>
     <w:p>
@@ -2652,7 +2532,7 @@
           <w:rFonts w:ascii="Arial Unicode MS" w:hAnsi="Arial Unicode MS" w:eastAsia="Arial Unicode MS" w:cs="Arial Unicode MS"/>
           <w:color w:val="000000"/>
         </w:rPr>
-        <w:t>后台先补待处理队列、对象详情、筛选、指派、处理理由、证据快照、审计、用户回执与申诉。内容管理增加来源、适用范围、核验日、复核日和失效状态；成长任务内容使用版本与发布状态。试点期允许受控导入和审核发布，不要求先做完整 CMS。</w:t>
+        <w:t>后端补待处理查询、对象详情、筛选、指派、处理理由、证据快照、审计、iOS 用户回执与申诉接口。运营通过经鉴权的受控工具或脚本完成处理与导入导出，不新增管理网页或 CMS。内容管理增加来源、适用范围、核验日、复核日和失效状态；成长任务内容使用版本与发布状态。</w:t>
       </w:r>
     </w:p>
     <w:p>
@@ -2670,7 +2550,7 @@
           <w:rFonts w:ascii="Arial Unicode MS" w:hAnsi="Arial Unicode MS" w:eastAsia="Arial Unicode MS" w:cs="Arial Unicode MS"/>
           <w:color w:val="000000"/>
         </w:rPr>
-        <w:t>验收：运营能完成真实举报从创建到结案再申诉的旅程；所有处置记录操作者、时间、对象、理由和前后状态；用户看到有限结果，不暴露举报人或内部证据；无权和冲突操作返回稳定错误码。</w:t>
+        <w:t>验收：运营按操作手册使用受控工具，完成真实举报从创建到结案再申诉的旅程；所有写操作经过业务接口并记录操作者、时间、对象、理由和前后状态，禁止以直接改库代替治理；用户看到有限结果，不暴露举报人或内部证据；无权和冲突操作返回稳定错误码。工具凭据不写死、不输出到日志，导出文件受访问控制与保留期限约束。</w:t>
       </w:r>
     </w:p>
     <w:p>
@@ -2756,7 +2636,7 @@
           <w:rFonts w:ascii="Arial Unicode MS" w:hAnsi="Arial Unicode MS" w:eastAsia="Arial Unicode MS" w:cs="Arial Unicode MS"/>
           <w:color w:val="000000"/>
         </w:rPr>
-        <w:t>首页突出任务的具体动作和来源；信息流优先可扫描；任务详情优先步骤和完成条件；后台优先待办与可比较数据。每页明确一个主要动作，避免多个高强调按钮争夺注意。动效用于解释状态变化，不能延迟操作或制造虚假进度。</w:t>
+        <w:t>首页突出任务的具体动作和来源；信息流优先可扫描；任务详情优先步骤和完成条件。每页明确一个主要动作，避免多个高强调按钮争夺注意。动效用于解释状态变化，不能延迟操作或制造虚假进度。</w:t>
       </w:r>
     </w:p>
     <w:p>
@@ -2777,7 +2657,7 @@
           <w:rFonts w:ascii="Arial Unicode MS" w:hAnsi="Arial Unicode MS" w:eastAsia="Arial Unicode MS" w:cs="Arial Unicode MS"/>
           <w:color w:val="000000"/>
         </w:rPr>
-        <w:t>先建立语义 token 表和映射，覆盖背景、表面、主次文字、行动、成功、警告、危险、边框、焦点与遮罩。Web CSS 与 Swift 常量由同一说明维护，是否引入自动生成在工具成本明确后决定。</w:t>
+        <w:t>完善 UniPOUI 的语义 token 表与 Swift 常量，覆盖背景、表面、主次文字、行动、成功、警告、危险、边框、焦点与遮罩。设计说明与原生组件保持一致，本期不制作 CSS 映射或网页组件库。</w:t>
       </w:r>
     </w:p>
     <w:p>
@@ -3306,7 +3186,7 @@
                 <w:color w:val="000000"/>
                 <w:sz w:val="21"/>
               </w:rPr>
-              <w:t>同一错误在两端含义一致</w:t>
+              <w:t>文案与服务端错误码一致</w:t>
             </w:r>
           </w:p>
         </w:tc>
@@ -3420,7 +3300,7 @@
                 <w:color w:val="000000"/>
                 <w:sz w:val="21"/>
               </w:rPr>
-              <w:t>后台表格</w:t>
+              <w:t>举报与申诉</w:t>
             </w:r>
           </w:p>
         </w:tc>
@@ -3446,7 +3326,7 @@
                 <w:color w:val="000000"/>
                 <w:sz w:val="21"/>
               </w:rPr>
-              <w:t>筛选、排序、空、分页、冲突和审计</w:t>
+              <w:t>原因、提交、处理回执、申诉与状态</w:t>
             </w:r>
           </w:p>
         </w:tc>
@@ -3472,7 +3352,7 @@
                 <w:color w:val="000000"/>
                 <w:sz w:val="21"/>
               </w:rPr>
-              <w:t>一次完成举报闭环并可回查</w:t>
+              <w:t>iOS 内能查看结果并完成申诉</w:t>
             </w:r>
           </w:p>
         </w:tc>
@@ -3506,7 +3386,7 @@
           <w:rFonts w:ascii="Arial Unicode MS" w:hAnsi="Arial Unicode MS" w:eastAsia="Arial Unicode MS" w:cs="Arial Unicode MS"/>
           <w:color w:val="000000"/>
         </w:rPr>
-        <w:t>第一批完成信息架构、成长引导、阶段卡、任务详情和举报状态，先于对应功能编码。第二批完成 PO 详情与分享、工具、消息状态、账号设置。第三批补后台密度、发布素材和跨端一致性。每项交付包括页面标注、文案、交互、API 字段和完整状态样例。</w:t>
+        <w:t>第一批完成信息架构、成长引导、阶段卡、任务详情和举报状态，先于对应功能编码。第二批完成 PO 详情与攻略返回、工具、消息状态、账号设置。第三批补发布素材和 iOS 组件一致性。每项交付包括页面标注、文案、交互、API 字段和完整状态样例；受控运营工具另配字段说明与操作手册。</w:t>
       </w:r>
     </w:p>
     <w:p>
@@ -3536,7 +3416,7 @@
           <w:rFonts w:ascii="Arial Unicode MS" w:hAnsi="Arial Unicode MS" w:eastAsia="Arial Unicode MS" w:cs="Arial Unicode MS"/>
           <w:color w:val="000000"/>
         </w:rPr>
-        <w:t>Web 在 320、375、390、768、1440 px 检查导航、正文、弹窗、表格和键盘焦点，无横向意外溢出。iOS 检查最低支持版本 iOS 17 与当前运行版本、真机、安全区、Dynamic Type、VoiceOver、Reduce Motion 和主操作至少 44pt 触控区域。</w:t>
+        <w:t>iOS 检查小屏与常用 iPhone 尺寸、最低支持版本 iOS 17 与当前运行版本、真机、安全区、Dynamic Type、VoiceOver、Reduce Motion、键盘遮挡和主操作至少 44pt 触控区域。</w:t>
       </w:r>
     </w:p>
     <w:p>
@@ -4330,7 +4210,7 @@
           <w:rFonts w:ascii="Arial Unicode MS" w:hAnsi="Arial Unicode MS" w:eastAsia="Arial Unicode MS" w:cs="Arial Unicode MS"/>
           <w:color w:val="000000"/>
         </w:rPr>
-        <w:t>优先扩展现有用户资料与 Achievement API，提供当前阶段摘要、任务详情、完成及撤回、关联攻略、后台内容与举报处理接口。会话和消息提供游标端点。新端点路径在契约评审时确定，本文不把候选设计描述为已上线接口。</w:t>
+        <w:t>优先扩展现有用户资料与 Achievement API，提供当前阶段摘要、任务详情、完成及撤回、关联攻略、内容管理与举报处理接口。会话和消息提供游标端点。治理与数据接口供受控工具使用，不隐含网页工作台。新端点路径在契约评审时确定，本文不把候选设计描述为已上线接口。</w:t>
       </w:r>
     </w:p>
     <w:p>
@@ -4339,7 +4219,7 @@
           <w:rFonts w:ascii="Arial Unicode MS" w:hAnsi="Arial Unicode MS" w:eastAsia="Arial Unicode MS" w:cs="Arial Unicode MS"/>
           <w:color w:val="000000"/>
         </w:rPr>
-        <w:t>所有端点明确权限、请求/响应、空值、稳定错误码、幂等和分页；时间返回带偏移格式。写请求失败保留 HTTP 语义。后端 DTO 变更后生成前端类型并校验 Swift 模型；不手改 api-types.ts。iOS 旧版缺字段时有兼容行为，不能因新增字段强制崩溃。</w:t>
+        <w:t>所有端点明确权限、请求/响应、空值、稳定错误码、幂等和分页；时间返回带偏移格式。写请求失败保留 HTTP 语义。本期以 OpenAPI 与 Swift 模型校验契约；仓库既有生成类型和 CI 漂移检查继续遵守，不因暂停网页开发而移除或手改 api-types.ts。iOS 旧版缺字段时有兼容行为，不能因新增字段强制崩溃。</w:t>
       </w:r>
     </w:p>
     <w:p>
@@ -4434,7 +4314,7 @@
           <w:rFonts w:ascii="Arial Unicode MS" w:hAnsi="Arial Unicode MS" w:eastAsia="Arial Unicode MS" w:cs="Arial Unicode MS"/>
           <w:color w:val="000000"/>
         </w:rPr>
-        <w:t>客户端记录页面与操作：landing_viewed、onboarding_completed、stage_card_viewed、task_detail_viewed、guide_opened、guide_helpfulness_submitted、tool_started、tool_exported、session_started。服务端记录结果：signup_completed、task_completion_recorded、task_completion_reverted、post_published、report_created、report_resolved。</w:t>
+        <w:t>客户端记录原生入口与操作：app_opened、onboarding_completed、stage_card_viewed、task_detail_viewed、guide_opened、guide_helpfulness_submitted、tool_started、tool_exported、session_started。服务端记录结果：signup_completed、task_completion_recorded、task_completion_reverted、post_published、report_created、report_resolved。渠道记录来自受控招募，不预设网页分享归因。</w:t>
       </w:r>
     </w:p>
     <w:p>
@@ -5320,7 +5200,7 @@
           <w:rFonts w:ascii="Arial Unicode MS" w:hAnsi="Arial Unicode MS" w:eastAsia="Arial Unicode MS" w:cs="Arial Unicode MS"/>
           <w:color w:val="000000"/>
         </w:rPr>
-        <w:t>P0 为外部试点阻断项，P1 为本期核心交付，P2 为通过试点后再按资源安排。以下编号统一用于需求、提交说明与验收证据。BE 为后端，IOS 为 iOS，WEB 为 Web，QA 为测试，DS 为设计，OPS 为运营，PO 为产品负责人。</w:t>
+        <w:t>P0 为外部试点阻断项，P1 为本期核心交付，P2 为通过试点后再按资源安排。以下编号统一用于需求、提交说明与验收证据。BE 为后端，IOS 为 iOS，QA 为测试，DS 为设计，OPS 为运营，PO 为产品负责人。</w:t>
       </w:r>
     </w:p>
     <w:p>
@@ -5600,7 +5480,7 @@
                 <w:color w:val="000000"/>
                 <w:sz w:val="21"/>
               </w:rPr>
-              <w:t>BE IOS WEB</w:t>
+              <w:t>BE IOS</w:t>
             </w:r>
           </w:p>
         </w:tc>
@@ -5627,7 +5507,7 @@
                 <w:color w:val="000000"/>
                 <w:sz w:val="21"/>
               </w:rPr>
-              <w:t>3 至 4</w:t>
+              <w:t>2 至 3</w:t>
             </w:r>
           </w:p>
         </w:tc>
@@ -5820,7 +5700,7 @@
                 <w:color w:val="000000"/>
                 <w:sz w:val="21"/>
               </w:rPr>
-              <w:t>拉黑在内容与消息实际生效</w:t>
+              <w:t>拉黑在服务端生效与 iOS 呈现</w:t>
             </w:r>
           </w:p>
         </w:tc>
@@ -5872,7 +5752,7 @@
                 <w:color w:val="000000"/>
                 <w:sz w:val="21"/>
               </w:rPr>
-              <w:t>BE IOS WEB</w:t>
+              <w:t>BE IOS</w:t>
             </w:r>
           </w:p>
         </w:tc>
@@ -5899,7 +5779,7 @@
                 <w:color w:val="000000"/>
                 <w:sz w:val="21"/>
               </w:rPr>
-              <w:t>4 至 6</w:t>
+              <w:t>3 至 5</w:t>
             </w:r>
           </w:p>
         </w:tc>
@@ -5956,7 +5836,7 @@
                 <w:color w:val="000000"/>
                 <w:sz w:val="21"/>
               </w:rPr>
-              <w:t>举报处置、回执与申诉</w:t>
+              <w:t>治理 API、受控工具、iOS 回执与申诉</w:t>
             </w:r>
           </w:p>
         </w:tc>
@@ -6008,7 +5888,7 @@
                 <w:color w:val="000000"/>
                 <w:sz w:val="21"/>
               </w:rPr>
-              <w:t>BE WEB IOS</w:t>
+              <w:t>BE IOS</w:t>
             </w:r>
           </w:p>
         </w:tc>
@@ -6035,7 +5915,7 @@
                 <w:color w:val="000000"/>
                 <w:sz w:val="21"/>
               </w:rPr>
-              <w:t>7 至 10</w:t>
+              <w:t>6 至 9</w:t>
             </w:r>
           </w:p>
         </w:tc>
@@ -6144,7 +6024,7 @@
                 <w:color w:val="000000"/>
                 <w:sz w:val="21"/>
               </w:rPr>
-              <w:t>IOS BE WEB</w:t>
+              <w:t>IOS BE</w:t>
             </w:r>
           </w:p>
         </w:tc>
@@ -6171,7 +6051,7 @@
                 <w:color w:val="000000"/>
                 <w:sz w:val="21"/>
               </w:rPr>
-              <w:t>3 至 5</w:t>
+              <w:t>3 至 4</w:t>
             </w:r>
           </w:p>
         </w:tc>
@@ -6280,7 +6160,7 @@
                 <w:color w:val="000000"/>
                 <w:sz w:val="21"/>
               </w:rPr>
-              <w:t>BE QA</w:t>
+              <w:t>BE</w:t>
             </w:r>
           </w:p>
         </w:tc>
@@ -6500,7 +6380,7 @@
                 <w:color w:val="000000"/>
                 <w:sz w:val="21"/>
               </w:rPr>
-              <w:t>成长引导与背景修正</w:t>
+              <w:t>iOS 成长引导与背景修正</w:t>
             </w:r>
           </w:p>
         </w:tc>
@@ -6552,7 +6432,7 @@
                 <w:color w:val="000000"/>
                 <w:sz w:val="21"/>
               </w:rPr>
-              <w:t>IOS WEB</w:t>
+              <w:t>IOS</w:t>
             </w:r>
           </w:p>
         </w:tc>
@@ -6579,7 +6459,7 @@
                 <w:color w:val="000000"/>
                 <w:sz w:val="21"/>
               </w:rPr>
-              <w:t>4 至 6</w:t>
+              <w:t>3 至 5</w:t>
             </w:r>
           </w:p>
         </w:tc>
@@ -6824,7 +6704,7 @@
                 <w:color w:val="000000"/>
                 <w:sz w:val="21"/>
               </w:rPr>
-              <w:t>BE IOS WEB</w:t>
+              <w:t>BE IOS</w:t>
             </w:r>
           </w:p>
         </w:tc>
@@ -6851,7 +6731,7 @@
                 <w:color w:val="000000"/>
                 <w:sz w:val="21"/>
               </w:rPr>
-              <w:t>5 至 7</w:t>
+              <w:t>4 至 6</w:t>
             </w:r>
           </w:p>
         </w:tc>
@@ -6908,7 +6788,7 @@
                 <w:color w:val="000000"/>
                 <w:sz w:val="21"/>
               </w:rPr>
-              <w:t>内容来源有效期与受控导入</w:t>
+              <w:t>内容来源有效期与受控导入发布</w:t>
             </w:r>
           </w:p>
         </w:tc>
@@ -6960,7 +6840,7 @@
                 <w:color w:val="000000"/>
                 <w:sz w:val="21"/>
               </w:rPr>
-              <w:t>BE WEB</w:t>
+              <w:t>BE</w:t>
             </w:r>
           </w:p>
         </w:tc>
@@ -7154,7 +7034,7 @@
                 <w:color w:val="000000"/>
                 <w:sz w:val="21"/>
               </w:rPr>
-              <w:t>DP13 P1</w:t>
+              <w:t>DP14 P0</w:t>
             </w:r>
           </w:p>
         </w:tc>
@@ -7180,7 +7060,7 @@
                 <w:color w:val="000000"/>
                 <w:sz w:val="21"/>
               </w:rPr>
-              <w:t>Web 课表能力说明与假动作清理</w:t>
+              <w:t>Outbox 与事务后通知</w:t>
             </w:r>
           </w:p>
         </w:tc>
@@ -7232,7 +7112,7 @@
                 <w:color w:val="000000"/>
                 <w:sz w:val="21"/>
               </w:rPr>
-              <w:t>WEB</w:t>
+              <w:t>BE</w:t>
             </w:r>
           </w:p>
         </w:tc>
@@ -7259,7 +7139,7 @@
                 <w:color w:val="000000"/>
                 <w:sz w:val="21"/>
               </w:rPr>
-              <w:t>2 至 3</w:t>
+              <w:t>5 至 7</w:t>
             </w:r>
           </w:p>
         </w:tc>
@@ -7290,7 +7170,7 @@
                 <w:color w:val="000000"/>
                 <w:sz w:val="21"/>
               </w:rPr>
-              <w:t>DP14 P0</w:t>
+              <w:t>DP15 P0</w:t>
             </w:r>
           </w:p>
         </w:tc>
@@ -7316,7 +7196,7 @@
                 <w:color w:val="000000"/>
                 <w:sz w:val="21"/>
               </w:rPr>
-              <w:t>Outbox 与事务后通知</w:t>
+              <w:t>会话和消息分页与 iOS 发送重试</w:t>
             </w:r>
           </w:p>
         </w:tc>
@@ -7342,7 +7222,7 @@
                 <w:color w:val="000000"/>
                 <w:sz w:val="21"/>
               </w:rPr>
-              <w:t>DP01</w:t>
+              <w:t>DP14</w:t>
             </w:r>
           </w:p>
         </w:tc>
@@ -7368,7 +7248,7 @@
                 <w:color w:val="000000"/>
                 <w:sz w:val="21"/>
               </w:rPr>
-              <w:t>BE</w:t>
+              <w:t>BE IOS</w:t>
             </w:r>
           </w:p>
         </w:tc>
@@ -7395,7 +7275,7 @@
                 <w:color w:val="000000"/>
                 <w:sz w:val="21"/>
               </w:rPr>
-              <w:t>5 至 7</w:t>
+              <w:t>3 至 5</w:t>
             </w:r>
           </w:p>
         </w:tc>
@@ -7426,7 +7306,7 @@
                 <w:color w:val="000000"/>
                 <w:sz w:val="21"/>
               </w:rPr>
-              <w:t>DP15 P0</w:t>
+              <w:t>DP16 P0</w:t>
             </w:r>
           </w:p>
         </w:tc>
@@ -7452,7 +7332,7 @@
                 <w:color w:val="000000"/>
                 <w:sz w:val="21"/>
               </w:rPr>
-              <w:t>会话和消息分页与发送重试</w:t>
+              <w:t>Redis 续传及 iOS 跨实例恢复</w:t>
             </w:r>
           </w:p>
         </w:tc>
@@ -7504,7 +7384,7 @@
                 <w:color w:val="000000"/>
                 <w:sz w:val="21"/>
               </w:rPr>
-              <w:t>BE IOS WEB</w:t>
+              <w:t>BE IOS</w:t>
             </w:r>
           </w:p>
         </w:tc>
@@ -7531,7 +7411,7 @@
                 <w:color w:val="000000"/>
                 <w:sz w:val="21"/>
               </w:rPr>
-              <w:t>4 至 6</w:t>
+              <w:t>3 至 5</w:t>
             </w:r>
           </w:p>
         </w:tc>
@@ -7562,7 +7442,7 @@
                 <w:color w:val="000000"/>
                 <w:sz w:val="21"/>
               </w:rPr>
-              <w:t>DP16 P0</w:t>
+              <w:t>DP17 P0</w:t>
             </w:r>
           </w:p>
         </w:tc>
@@ -7588,7 +7468,7 @@
                 <w:color w:val="000000"/>
                 <w:sz w:val="21"/>
               </w:rPr>
-              <w:t>Redis 续传及跨实例恢复</w:t>
+              <w:t>互动计数幂等与并发一致性</w:t>
             </w:r>
           </w:p>
         </w:tc>
@@ -7614,7 +7494,7 @@
                 <w:color w:val="000000"/>
                 <w:sz w:val="21"/>
               </w:rPr>
-              <w:t>DP14</w:t>
+              <w:t>DP01</w:t>
             </w:r>
           </w:p>
         </w:tc>
@@ -7640,7 +7520,7 @@
                 <w:color w:val="000000"/>
                 <w:sz w:val="21"/>
               </w:rPr>
-              <w:t>BE IOS WEB</w:t>
+              <w:t>BE</w:t>
             </w:r>
           </w:p>
         </w:tc>
@@ -7667,7 +7547,7 @@
                 <w:color w:val="000000"/>
                 <w:sz w:val="21"/>
               </w:rPr>
-              <w:t>3 至 5</w:t>
+              <w:t>2 至 4</w:t>
             </w:r>
           </w:p>
         </w:tc>
@@ -7698,7 +7578,7 @@
                 <w:color w:val="000000"/>
                 <w:sz w:val="21"/>
               </w:rPr>
-              <w:t>DP17 P0</w:t>
+              <w:t>DP18 P1</w:t>
             </w:r>
           </w:p>
         </w:tc>
@@ -7724,7 +7604,7 @@
                 <w:color w:val="000000"/>
                 <w:sz w:val="21"/>
               </w:rPr>
-              <w:t>互动计数幂等与并发一致性</w:t>
+              <w:t>iOS 语义 tokens 与组件状态</w:t>
             </w:r>
           </w:p>
         </w:tc>
@@ -7776,7 +7656,7 @@
                 <w:color w:val="000000"/>
                 <w:sz w:val="21"/>
               </w:rPr>
-              <w:t>BE</w:t>
+              <w:t>IOS</w:t>
             </w:r>
           </w:p>
         </w:tc>
@@ -7803,7 +7683,7 @@
                 <w:color w:val="000000"/>
                 <w:sz w:val="21"/>
               </w:rPr>
-              <w:t>2 至 4</w:t>
+              <w:t>3 至 4</w:t>
             </w:r>
           </w:p>
         </w:tc>
@@ -7834,7 +7714,7 @@
                 <w:color w:val="000000"/>
                 <w:sz w:val="21"/>
               </w:rPr>
-              <w:t>DP18 P1</w:t>
+              <w:t>DP20 P1</w:t>
             </w:r>
           </w:p>
         </w:tc>
@@ -7860,7 +7740,7 @@
                 <w:color w:val="000000"/>
                 <w:sz w:val="21"/>
               </w:rPr>
-              <w:t>语义 tokens 与组件状态落地</w:t>
+              <w:t>iOS 埋点、cohort 与受控指标导出</w:t>
             </w:r>
           </w:p>
         </w:tc>
@@ -7886,7 +7766,7 @@
                 <w:color w:val="000000"/>
                 <w:sz w:val="21"/>
               </w:rPr>
-              <w:t>DP01</w:t>
+              <w:t>DP07 DP10 DP11</w:t>
             </w:r>
           </w:p>
         </w:tc>
@@ -7912,7 +7792,7 @@
                 <w:color w:val="000000"/>
                 <w:sz w:val="21"/>
               </w:rPr>
-              <w:t>IOS WEB</w:t>
+              <w:t>BE IOS</w:t>
             </w:r>
           </w:p>
         </w:tc>
@@ -7970,7 +7850,7 @@
                 <w:color w:val="000000"/>
                 <w:sz w:val="21"/>
               </w:rPr>
-              <w:t>DP19 P1</w:t>
+              <w:t>DP21 P0</w:t>
             </w:r>
           </w:p>
         </w:tc>
@@ -7996,7 +7876,7 @@
                 <w:color w:val="000000"/>
                 <w:sz w:val="21"/>
               </w:rPr>
-              <w:t>Web 分享路由与窄屏体验</w:t>
+              <w:t>后端集成与 iOS 自动化回归</w:t>
             </w:r>
           </w:p>
         </w:tc>
@@ -8022,7 +7902,7 @@
                 <w:color w:val="000000"/>
                 <w:sz w:val="21"/>
               </w:rPr>
-              <w:t>DP10 DP11 DP18</w:t>
+              <w:t>随 DP02 至 DP20 活动包分批，排除暂停项</w:t>
             </w:r>
           </w:p>
         </w:tc>
@@ -8048,7 +7928,7 @@
                 <w:color w:val="000000"/>
                 <w:sz w:val="21"/>
               </w:rPr>
-              <w:t>WEB</w:t>
+              <w:t>BE IOS</w:t>
             </w:r>
           </w:p>
         </w:tc>
@@ -8075,7 +7955,7 @@
                 <w:color w:val="000000"/>
                 <w:sz w:val="21"/>
               </w:rPr>
-              <w:t>4 至 6</w:t>
+              <w:t>5 至 7</w:t>
             </w:r>
           </w:p>
         </w:tc>
@@ -8106,7 +7986,7 @@
                 <w:color w:val="000000"/>
                 <w:sz w:val="21"/>
               </w:rPr>
-              <w:t>DP20 P1</w:t>
+              <w:t>DP22 P0</w:t>
             </w:r>
           </w:p>
         </w:tc>
@@ -8132,7 +8012,7 @@
                 <w:color w:val="000000"/>
                 <w:sz w:val="21"/>
               </w:rPr>
-              <w:t>埋点、cohort 与指标报表</w:t>
+              <w:t>真机、签名、推送与试点发布</w:t>
             </w:r>
           </w:p>
         </w:tc>
@@ -8158,7 +8038,7 @@
                 <w:color w:val="000000"/>
                 <w:sz w:val="21"/>
               </w:rPr>
-              <w:t>DP07 DP10 DP11</w:t>
+              <w:t>DP05 DP06 DP21</w:t>
             </w:r>
           </w:p>
         </w:tc>
@@ -8184,7 +8064,7 @@
                 <w:color w:val="000000"/>
                 <w:sz w:val="21"/>
               </w:rPr>
-              <w:t>BE WEB IOS</w:t>
+              <w:t>IOS BE</w:t>
             </w:r>
           </w:p>
         </w:tc>
@@ -8211,7 +8091,7 @@
                 <w:color w:val="000000"/>
                 <w:sz w:val="21"/>
               </w:rPr>
-              <w:t>5 至 7</w:t>
+              <w:t>3 至 5</w:t>
             </w:r>
           </w:p>
         </w:tc>
@@ -8242,7 +8122,7 @@
                 <w:color w:val="000000"/>
                 <w:sz w:val="21"/>
               </w:rPr>
-              <w:t>DP21 P0</w:t>
+              <w:t>DP23 P1</w:t>
             </w:r>
           </w:p>
         </w:tc>
@@ -8268,7 +8148,7 @@
                 <w:color w:val="000000"/>
                 <w:sz w:val="21"/>
               </w:rPr>
-              <w:t>核心旅程自动化与回归</w:t>
+              <w:t>单机压测、慢 SQL 与容量记录</w:t>
             </w:r>
           </w:p>
         </w:tc>
@@ -8294,7 +8174,7 @@
                 <w:color w:val="000000"/>
                 <w:sz w:val="21"/>
               </w:rPr>
-              <w:t>随 DP02 至 DP20 分批</w:t>
+              <w:t>DP14 DP15 DP16 DP17</w:t>
             </w:r>
           </w:p>
         </w:tc>
@@ -8320,7 +8200,7 @@
                 <w:color w:val="000000"/>
                 <w:sz w:val="21"/>
               </w:rPr>
-              <w:t>QA IOS WEB</w:t>
+              <w:t>BE</w:t>
             </w:r>
           </w:p>
         </w:tc>
@@ -8347,7 +8227,7 @@
                 <w:color w:val="000000"/>
                 <w:sz w:val="21"/>
               </w:rPr>
-              <w:t>6 至 8</w:t>
+              <w:t>3 至 5</w:t>
             </w:r>
           </w:p>
         </w:tc>
@@ -8378,7 +8258,7 @@
                 <w:color w:val="000000"/>
                 <w:sz w:val="21"/>
               </w:rPr>
-              <w:t>DP22 P0</w:t>
+              <w:t>DP24 P1</w:t>
             </w:r>
           </w:p>
         </w:tc>
@@ -8404,7 +8284,7 @@
                 <w:color w:val="000000"/>
                 <w:sz w:val="21"/>
               </w:rPr>
-              <w:t>真机、签名、推送与试点发布</w:t>
+              <w:t>试点反馈与第一轮缺陷修复</w:t>
             </w:r>
           </w:p>
         </w:tc>
@@ -8430,7 +8310,7 @@
                 <w:color w:val="000000"/>
                 <w:sz w:val="21"/>
               </w:rPr>
-              <w:t>DP05 DP06 DP21</w:t>
+              <w:t>DP22</w:t>
             </w:r>
           </w:p>
         </w:tc>
@@ -8456,7 +8336,7 @@
                 <w:color w:val="000000"/>
                 <w:sz w:val="21"/>
               </w:rPr>
-              <w:t>IOS BE QA</w:t>
+              <w:t>BE IOS</w:t>
             </w:r>
           </w:p>
         </w:tc>
@@ -8484,278 +8364,6 @@
                 <w:sz w:val="21"/>
               </w:rPr>
               <w:t>3 至 5</w:t>
-            </w:r>
-          </w:p>
-        </w:tc>
-      </w:tr>
-      <w:tr>
-        <w:trPr>
-          <w:cantSplit/>
-        </w:trPr>
-        <w:tc>
-          <w:tcPr>
-            <w:tcW w:type="dxa" w:w="1411"/>
-            <w:vAlign w:val="center"/>
-            <w:shd w:fill="FFFFFF"/>
-            <w:tcMar>
-              <w:top w:w="90" w:type="dxa"/>
-              <w:bottom w:w="90" w:type="dxa"/>
-              <w:left w:w="100" w:type="dxa"/>
-              <w:right w:w="100" w:type="dxa"/>
-            </w:tcMar>
-          </w:tcPr>
-          <w:p>
-            <w:pPr>
-              <w:spacing w:after="0" w:line="269" w:lineRule="auto"/>
-            </w:pPr>
-            <w:r>
-              <w:rPr>
-                <w:rFonts w:ascii="Arial Unicode MS" w:hAnsi="Arial Unicode MS" w:eastAsia="Arial Unicode MS" w:cs="Arial Unicode MS"/>
-                <w:color w:val="000000"/>
-                <w:sz w:val="21"/>
-              </w:rPr>
-              <w:t>DP23 P1</w:t>
-            </w:r>
-          </w:p>
-        </w:tc>
-        <w:tc>
-          <w:tcPr>
-            <w:tcW w:type="dxa" w:w="3830"/>
-            <w:vAlign w:val="center"/>
-            <w:shd w:fill="FFFFFF"/>
-            <w:tcMar>
-              <w:top w:w="90" w:type="dxa"/>
-              <w:bottom w:w="90" w:type="dxa"/>
-              <w:left w:w="100" w:type="dxa"/>
-              <w:right w:w="100" w:type="dxa"/>
-            </w:tcMar>
-          </w:tcPr>
-          <w:p>
-            <w:pPr>
-              <w:spacing w:after="0" w:line="269" w:lineRule="auto"/>
-            </w:pPr>
-            <w:r>
-              <w:rPr>
-                <w:rFonts w:ascii="Arial Unicode MS" w:hAnsi="Arial Unicode MS" w:eastAsia="Arial Unicode MS" w:cs="Arial Unicode MS"/>
-                <w:color w:val="000000"/>
-                <w:sz w:val="21"/>
-              </w:rPr>
-              <w:t>单机压测、慢 SQL 与容量记录</w:t>
-            </w:r>
-          </w:p>
-        </w:tc>
-        <w:tc>
-          <w:tcPr>
-            <w:tcW w:type="dxa" w:w="1814"/>
-            <w:vAlign w:val="center"/>
-            <w:shd w:fill="FFFFFF"/>
-            <w:tcMar>
-              <w:top w:w="90" w:type="dxa"/>
-              <w:bottom w:w="90" w:type="dxa"/>
-              <w:left w:w="100" w:type="dxa"/>
-              <w:right w:w="100" w:type="dxa"/>
-            </w:tcMar>
-          </w:tcPr>
-          <w:p>
-            <w:pPr>
-              <w:spacing w:after="0" w:line="269" w:lineRule="auto"/>
-            </w:pPr>
-            <w:r>
-              <w:rPr>
-                <w:rFonts w:ascii="Arial Unicode MS" w:hAnsi="Arial Unicode MS" w:eastAsia="Arial Unicode MS" w:cs="Arial Unicode MS"/>
-                <w:color w:val="000000"/>
-                <w:sz w:val="21"/>
-              </w:rPr>
-              <w:t>DP14 DP15 DP16 DP17</w:t>
-            </w:r>
-          </w:p>
-        </w:tc>
-        <w:tc>
-          <w:tcPr>
-            <w:tcW w:type="dxa" w:w="1814"/>
-            <w:vAlign w:val="center"/>
-            <w:shd w:fill="FFFFFF"/>
-            <w:tcMar>
-              <w:top w:w="90" w:type="dxa"/>
-              <w:bottom w:w="90" w:type="dxa"/>
-              <w:left w:w="100" w:type="dxa"/>
-              <w:right w:w="100" w:type="dxa"/>
-            </w:tcMar>
-          </w:tcPr>
-          <w:p>
-            <w:pPr>
-              <w:spacing w:after="0" w:line="269" w:lineRule="auto"/>
-            </w:pPr>
-            <w:r>
-              <w:rPr>
-                <w:rFonts w:ascii="Arial Unicode MS" w:hAnsi="Arial Unicode MS" w:eastAsia="Arial Unicode MS" w:cs="Arial Unicode MS"/>
-                <w:color w:val="000000"/>
-                <w:sz w:val="21"/>
-              </w:rPr>
-              <w:t>BE QA</w:t>
-            </w:r>
-          </w:p>
-        </w:tc>
-        <w:tc>
-          <w:tcPr>
-            <w:tcW w:type="dxa" w:w="1210"/>
-            <w:vAlign w:val="center"/>
-            <w:shd w:fill="FFFFFF"/>
-            <w:tcMar>
-              <w:top w:w="90" w:type="dxa"/>
-              <w:bottom w:w="90" w:type="dxa"/>
-              <w:left w:w="100" w:type="dxa"/>
-              <w:right w:w="100" w:type="dxa"/>
-            </w:tcMar>
-          </w:tcPr>
-          <w:p>
-            <w:pPr>
-              <w:spacing w:after="0" w:line="269" w:lineRule="auto"/>
-              <w:jc w:val="center"/>
-            </w:pPr>
-            <w:r>
-              <w:rPr>
-                <w:rFonts w:ascii="Arial Unicode MS" w:hAnsi="Arial Unicode MS" w:eastAsia="Arial Unicode MS" w:cs="Arial Unicode MS"/>
-                <w:color w:val="000000"/>
-                <w:sz w:val="21"/>
-              </w:rPr>
-              <w:t>3 至 5</w:t>
-            </w:r>
-          </w:p>
-        </w:tc>
-      </w:tr>
-      <w:tr>
-        <w:trPr>
-          <w:cantSplit/>
-        </w:trPr>
-        <w:tc>
-          <w:tcPr>
-            <w:tcW w:type="dxa" w:w="1411"/>
-            <w:vAlign w:val="center"/>
-            <w:shd w:fill="F3F6F9"/>
-            <w:tcMar>
-              <w:top w:w="90" w:type="dxa"/>
-              <w:bottom w:w="90" w:type="dxa"/>
-              <w:left w:w="100" w:type="dxa"/>
-              <w:right w:w="100" w:type="dxa"/>
-            </w:tcMar>
-          </w:tcPr>
-          <w:p>
-            <w:pPr>
-              <w:spacing w:after="0" w:line="269" w:lineRule="auto"/>
-            </w:pPr>
-            <w:r>
-              <w:rPr>
-                <w:rFonts w:ascii="Arial Unicode MS" w:hAnsi="Arial Unicode MS" w:eastAsia="Arial Unicode MS" w:cs="Arial Unicode MS"/>
-                <w:color w:val="000000"/>
-                <w:sz w:val="21"/>
-              </w:rPr>
-              <w:t>DP24 P1</w:t>
-            </w:r>
-          </w:p>
-        </w:tc>
-        <w:tc>
-          <w:tcPr>
-            <w:tcW w:type="dxa" w:w="3830"/>
-            <w:vAlign w:val="center"/>
-            <w:shd w:fill="F3F6F9"/>
-            <w:tcMar>
-              <w:top w:w="90" w:type="dxa"/>
-              <w:bottom w:w="90" w:type="dxa"/>
-              <w:left w:w="100" w:type="dxa"/>
-              <w:right w:w="100" w:type="dxa"/>
-            </w:tcMar>
-          </w:tcPr>
-          <w:p>
-            <w:pPr>
-              <w:spacing w:after="0" w:line="269" w:lineRule="auto"/>
-            </w:pPr>
-            <w:r>
-              <w:rPr>
-                <w:rFonts w:ascii="Arial Unicode MS" w:hAnsi="Arial Unicode MS" w:eastAsia="Arial Unicode MS" w:cs="Arial Unicode MS"/>
-                <w:color w:val="000000"/>
-                <w:sz w:val="21"/>
-              </w:rPr>
-              <w:t>试点反馈与第一轮缺陷修复</w:t>
-            </w:r>
-          </w:p>
-        </w:tc>
-        <w:tc>
-          <w:tcPr>
-            <w:tcW w:type="dxa" w:w="1814"/>
-            <w:vAlign w:val="center"/>
-            <w:shd w:fill="F3F6F9"/>
-            <w:tcMar>
-              <w:top w:w="90" w:type="dxa"/>
-              <w:bottom w:w="90" w:type="dxa"/>
-              <w:left w:w="100" w:type="dxa"/>
-              <w:right w:w="100" w:type="dxa"/>
-            </w:tcMar>
-          </w:tcPr>
-          <w:p>
-            <w:pPr>
-              <w:spacing w:after="0" w:line="269" w:lineRule="auto"/>
-            </w:pPr>
-            <w:r>
-              <w:rPr>
-                <w:rFonts w:ascii="Arial Unicode MS" w:hAnsi="Arial Unicode MS" w:eastAsia="Arial Unicode MS" w:cs="Arial Unicode MS"/>
-                <w:color w:val="000000"/>
-                <w:sz w:val="21"/>
-              </w:rPr>
-              <w:t>DP22</w:t>
-            </w:r>
-          </w:p>
-        </w:tc>
-        <w:tc>
-          <w:tcPr>
-            <w:tcW w:type="dxa" w:w="1814"/>
-            <w:vAlign w:val="center"/>
-            <w:shd w:fill="F3F6F9"/>
-            <w:tcMar>
-              <w:top w:w="90" w:type="dxa"/>
-              <w:bottom w:w="90" w:type="dxa"/>
-              <w:left w:w="100" w:type="dxa"/>
-              <w:right w:w="100" w:type="dxa"/>
-            </w:tcMar>
-          </w:tcPr>
-          <w:p>
-            <w:pPr>
-              <w:spacing w:after="0" w:line="269" w:lineRule="auto"/>
-            </w:pPr>
-            <w:r>
-              <w:rPr>
-                <w:rFonts w:ascii="Arial Unicode MS" w:hAnsi="Arial Unicode MS" w:eastAsia="Arial Unicode MS" w:cs="Arial Unicode MS"/>
-                <w:color w:val="000000"/>
-                <w:sz w:val="21"/>
-              </w:rPr>
-              <w:t>BE IOS WEB</w:t>
-            </w:r>
-          </w:p>
-        </w:tc>
-        <w:tc>
-          <w:tcPr>
-            <w:tcW w:type="dxa" w:w="1210"/>
-            <w:vAlign w:val="center"/>
-            <w:shd w:fill="F3F6F9"/>
-            <w:tcMar>
-              <w:top w:w="90" w:type="dxa"/>
-              <w:bottom w:w="90" w:type="dxa"/>
-              <w:left w:w="100" w:type="dxa"/>
-              <w:right w:w="100" w:type="dxa"/>
-            </w:tcMar>
-          </w:tcPr>
-          <w:p>
-            <w:pPr>
-              <w:spacing w:after="0" w:line="269" w:lineRule="auto"/>
-              <w:jc w:val="center"/>
-            </w:pPr>
-            <w:r>
-              <w:rPr>
-                <w:rFonts w:ascii="Arial Unicode MS" w:hAnsi="Arial Unicode MS" w:eastAsia="Arial Unicode MS" w:cs="Arial Unicode MS"/>
-                <w:color w:val="000000"/>
-                <w:sz w:val="21"/>
-              </w:rPr>
-              <w:t>4 至 6</w:t>
             </w:r>
           </w:p>
         </w:tc>
@@ -8777,7 +8385,16 @@
           <w:rFonts w:ascii="Arial Unicode MS" w:hAnsi="Arial Unicode MS" w:eastAsia="Arial Unicode MS" w:cs="Arial Unicode MS"/>
           <w:color w:val="000000"/>
         </w:rPr>
-        <w:t>以上工作包的合计以第 11 章资源核算为准。DP21 从第一个功能包开始补测试，不留到最后一次补齐；DP18 的设计规格先行，工程落地随功能推进。DP22 的发布配置在首周启动，最终签名和真机验证在发布前完成。</w:t>
+        <w:t>本期有 22 个活动工作包。原 DP13（网页课表）与 DP19（网页分享及响应式）暂停，保留编号供历史追溯，不计入依赖、工时或发布门槛。QA 协助 DP06、DP21、DP22、DP23 的人工验收；工程验证投入已计入各包，兼职验收不视为新增工程容量。</w:t>
+      </w:r>
+    </w:p>
+    <w:p>
+      <w:r>
+        <w:rPr>
+          <w:rFonts w:ascii="Arial Unicode MS" w:hAnsi="Arial Unicode MS" w:eastAsia="Arial Unicode MS" w:cs="Arial Unicode MS"/>
+          <w:color w:val="000000"/>
+        </w:rPr>
+        <w:t>以上工作包的合计以第 11 章资源核算为准。DP21 从第一个功能包开始补测试，不留到最后一次补齐；DP23、DP24 的后续回归随各包验收，不形成 DP22 的循环依赖。DP18 的设计规格先行，工程落地随功能推进。DP22 的发布配置在首周启动，最终签名和真机验证在发布前完成。</w:t>
       </w:r>
     </w:p>
     <w:p>
@@ -8798,7 +8415,7 @@
           <w:rFonts w:ascii="Arial Unicode MS" w:hAnsi="Arial Unicode MS" w:eastAsia="Arial Unicode MS" w:cs="Arial Unicode MS"/>
           <w:color w:val="000000"/>
         </w:rPr>
-        <w:t>成长链路为 DP01 → DP07 → DP08/DP10/DP11 → DP09/DP19/DP20 → DP21 → DP22。治理链路为 DP01 → DP03 → DP04 → DP21。消息链路为 DP01 → DP14 → DP15/DP16 → DP21。外部试点必须同时满足三条链路与 DP02、DP05、DP06、DP17。</w:t>
+        <w:t>成长链路为 DP01 → DP07 → DP08/DP10/DP11 → DP09/DP20 → DP21 → DP22。治理链路为 DP01 → DP03 → DP04 → DP21。消息链路为 DP01 → DP14 → DP15/DP16 → DP21。外部试点必须同时满足三条链路与 DP02、DP05、DP06、DP17；暂停的 DP13、DP19 不进入任何关键路径。</w:t>
       </w:r>
     </w:p>
     <w:p>
@@ -8863,7 +8480,7 @@
           <w:rFonts w:ascii="Arial Unicode MS" w:hAnsi="Arial Unicode MS" w:eastAsia="Arial Unicode MS" w:cs="Arial Unicode MS"/>
           <w:color w:val="000000"/>
         </w:rPr>
-        <w:t>以 2026 年 10 月 26 日作为建议启动日，采用 16 周参考窗口，结束于 2027 年 2 月 14 日；并非确认的人力承诺。按第 11 章容量，Beta 预计最早在第 11 至 13 周具备条件，首轮试点与成熟 cohort 观察安排在第 14 至 16 周。工作日、假期、学校日历和外部接入变化时重新排期。</w:t>
+        <w:t>以 2026 年 10 月 26 日作为建议启动日，采用 20 周参考窗口，结束于 2027 年 3 月 14 日；并非确认的人力承诺。Beta 按门槛放行，S1 先拆解后端和 iOS 的角色负载再确认日期。两人总容量只提供工作量下界，不能消除单一后端的依赖瓶颈；高估算、假期、学校日历或外部接入变化时顺延。</w:t>
       </w:r>
     </w:p>
     <w:tbl>
@@ -9188,7 +8805,7 @@
                 <w:color w:val="000000"/>
                 <w:sz w:val="21"/>
               </w:rPr>
-              <w:t>背景引导、任务 API、举报基本闭环、事务后投递</w:t>
+              <w:t>成长模型、身份失效修复、治理接口规格与 iOS 状态</w:t>
             </w:r>
           </w:p>
         </w:tc>
@@ -9214,7 +8831,7 @@
                 <w:color w:val="000000"/>
                 <w:sz w:val="21"/>
               </w:rPr>
-              <w:t>内部 Alpha 可完成真实任务；治理可实际操作</w:t>
+              <w:t>契约可联调；安全复现与设计证据可回查</w:t>
             </w:r>
           </w:p>
         </w:tc>
@@ -9297,7 +8914,7 @@
                 <w:color w:val="000000"/>
                 <w:sz w:val="21"/>
               </w:rPr>
-              <w:t>动态首页、任务详情、内容导入、一个工具、埋点</w:t>
+              <w:t>背景引导、任务 API、动态首页与内容样本</w:t>
             </w:r>
           </w:p>
         </w:tc>
@@ -9323,7 +8940,7 @@
                 <w:color w:val="000000"/>
                 <w:sz w:val="21"/>
               </w:rPr>
-              <w:t>一条主线与首任务完整，未实现承诺已清理</w:t>
+              <w:t>内部成长切片可完成真实任务</w:t>
             </w:r>
           </w:p>
         </w:tc>
@@ -9406,7 +9023,7 @@
                 <w:color w:val="000000"/>
                 <w:sz w:val="21"/>
               </w:rPr>
-              <w:t>分享落地、消息分页续传、计数并发与组件状态</w:t>
+              <w:t>任务详情、内容受控导入、图片转 PDF、埋点</w:t>
             </w:r>
           </w:p>
         </w:tc>
@@ -9432,7 +9049,7 @@
                 <w:color w:val="000000"/>
                 <w:sz w:val="21"/>
               </w:rPr>
-              <w:t>核心功能候选完成，继续清理未关闭风险</w:t>
+              <w:t>iOS 主线可用，未实现承诺已清理</w:t>
             </w:r>
           </w:p>
         </w:tc>
@@ -9515,7 +9132,7 @@
                 <w:color w:val="000000"/>
                 <w:sz w:val="21"/>
               </w:rPr>
-              <w:t>自动化、Redis 集成、真机、恢复、指标核对和缺陷修复</w:t>
+              <w:t>治理受控操作、Outbox、计数并发与组件状态</w:t>
             </w:r>
           </w:p>
         </w:tc>
@@ -9541,7 +9158,7 @@
                 <w:color w:val="000000"/>
                 <w:sz w:val="21"/>
               </w:rPr>
-              <w:t>逐项复验试点门槛，未通过不开放</w:t>
+              <w:t>治理可按手册操作；消息先提交后通知</w:t>
             </w:r>
           </w:p>
         </w:tc>
@@ -9624,7 +9241,7 @@
                 <w:color w:val="000000"/>
                 <w:sz w:val="21"/>
               </w:rPr>
-              <w:t>Beta 候选、发布与治理演练；达标后首批 30 至 50 人</w:t>
+              <w:t>消息分页与续传、后端集成、指标导出、真机</w:t>
             </w:r>
           </w:p>
         </w:tc>
@@ -9650,7 +9267,7 @@
                 <w:color w:val="000000"/>
                 <w:sz w:val="21"/>
               </w:rPr>
-              <w:t>全部放行条件通过；高估算情景顺延到第 13 周</w:t>
+              <w:t>核心功能候选可回归，继续关闭阻断项</w:t>
             </w:r>
           </w:p>
         </w:tc>
@@ -9733,7 +9350,7 @@
                 <w:color w:val="000000"/>
                 <w:sz w:val="21"/>
               </w:rPr>
-              <w:t>封闭试点、激活观察、成熟 D7 与首轮修复</w:t>
+              <w:t>自动化、Redis 集成、恢复与发布演练、缺陷修复</w:t>
             </w:r>
           </w:p>
         </w:tc>
@@ -9759,7 +9376,7 @@
                 <w:color w:val="000000"/>
                 <w:sz w:val="21"/>
               </w:rPr>
-              <w:t>分子分母可核对，阻断问题关闭</w:t>
+              <w:t>逐项复验试点门槛，不因日期到期放行</w:t>
             </w:r>
           </w:p>
         </w:tc>
@@ -9842,7 +9459,225 @@
                 <w:color w:val="000000"/>
                 <w:sz w:val="21"/>
               </w:rPr>
-              <w:t>后续 cohort、容量评估、运营与产品复盘</w:t>
+              <w:t>Beta 候选；达标后邀请首批 30 至 50 人</w:t>
+            </w:r>
+          </w:p>
+        </w:tc>
+        <w:tc>
+          <w:tcPr>
+            <w:tcW w:type="dxa" w:w="2016"/>
+            <w:vAlign w:val="center"/>
+            <w:shd w:fill="F3F6F9"/>
+            <w:tcMar>
+              <w:top w:w="90" w:type="dxa"/>
+              <w:bottom w:w="90" w:type="dxa"/>
+              <w:left w:w="100" w:type="dxa"/>
+              <w:right w:w="100" w:type="dxa"/>
+            </w:tcMar>
+          </w:tcPr>
+          <w:p>
+            <w:pPr>
+              <w:spacing w:after="0" w:line="269" w:lineRule="auto"/>
+            </w:pPr>
+            <w:r>
+              <w:rPr>
+                <w:rFonts w:ascii="Arial Unicode MS" w:hAnsi="Arial Unicode MS" w:eastAsia="Arial Unicode MS" w:cs="Arial Unicode MS"/>
+                <w:color w:val="000000"/>
+                <w:sz w:val="21"/>
+              </w:rPr>
+              <w:t>未达标继续修复；实际招募按学校日历安排</w:t>
+            </w:r>
+          </w:p>
+        </w:tc>
+      </w:tr>
+      <w:tr>
+        <w:trPr>
+          <w:cantSplit/>
+        </w:trPr>
+        <w:tc>
+          <w:tcPr>
+            <w:tcW w:type="dxa" w:w="1613"/>
+            <w:vAlign w:val="center"/>
+            <w:shd w:fill="FFFFFF"/>
+            <w:tcMar>
+              <w:top w:w="90" w:type="dxa"/>
+              <w:bottom w:w="90" w:type="dxa"/>
+              <w:left w:w="100" w:type="dxa"/>
+              <w:right w:w="100" w:type="dxa"/>
+            </w:tcMar>
+          </w:tcPr>
+          <w:p>
+            <w:pPr>
+              <w:spacing w:after="0" w:line="269" w:lineRule="auto"/>
+            </w:pPr>
+            <w:r>
+              <w:rPr>
+                <w:rFonts w:ascii="Arial Unicode MS" w:hAnsi="Arial Unicode MS" w:eastAsia="Arial Unicode MS" w:cs="Arial Unicode MS"/>
+                <w:color w:val="000000"/>
+                <w:sz w:val="21"/>
+              </w:rPr>
+              <w:t>S9</w:t>
+            </w:r>
+          </w:p>
+        </w:tc>
+        <w:tc>
+          <w:tcPr>
+            <w:tcW w:type="dxa" w:w="2822"/>
+            <w:vAlign w:val="center"/>
+            <w:shd w:fill="FFFFFF"/>
+            <w:tcMar>
+              <w:top w:w="90" w:type="dxa"/>
+              <w:bottom w:w="90" w:type="dxa"/>
+              <w:left w:w="100" w:type="dxa"/>
+              <w:right w:w="100" w:type="dxa"/>
+            </w:tcMar>
+          </w:tcPr>
+          <w:p>
+            <w:pPr>
+              <w:spacing w:after="0" w:line="269" w:lineRule="auto"/>
+            </w:pPr>
+            <w:r>
+              <w:rPr>
+                <w:rFonts w:ascii="Arial Unicode MS" w:hAnsi="Arial Unicode MS" w:eastAsia="Arial Unicode MS" w:cs="Arial Unicode MS"/>
+                <w:color w:val="000000"/>
+                <w:sz w:val="21"/>
+              </w:rPr>
+              <w:t>2027 年 2 月 15 日至 2 月 28 日</w:t>
+            </w:r>
+          </w:p>
+        </w:tc>
+        <w:tc>
+          <w:tcPr>
+            <w:tcW w:type="dxa" w:w="3629"/>
+            <w:vAlign w:val="center"/>
+            <w:shd w:fill="FFFFFF"/>
+            <w:tcMar>
+              <w:top w:w="90" w:type="dxa"/>
+              <w:bottom w:w="90" w:type="dxa"/>
+              <w:left w:w="100" w:type="dxa"/>
+              <w:right w:w="100" w:type="dxa"/>
+            </w:tcMar>
+          </w:tcPr>
+          <w:p>
+            <w:pPr>
+              <w:spacing w:after="0" w:line="269" w:lineRule="auto"/>
+            </w:pPr>
+            <w:r>
+              <w:rPr>
+                <w:rFonts w:ascii="Arial Unicode MS" w:hAnsi="Arial Unicode MS" w:eastAsia="Arial Unicode MS" w:cs="Arial Unicode MS"/>
+                <w:color w:val="000000"/>
+                <w:sz w:val="21"/>
+              </w:rPr>
+              <w:t>封闭试点、激活与成熟 D7、首轮修复</w:t>
+            </w:r>
+          </w:p>
+        </w:tc>
+        <w:tc>
+          <w:tcPr>
+            <w:tcW w:type="dxa" w:w="2016"/>
+            <w:vAlign w:val="center"/>
+            <w:shd w:fill="FFFFFF"/>
+            <w:tcMar>
+              <w:top w:w="90" w:type="dxa"/>
+              <w:bottom w:w="90" w:type="dxa"/>
+              <w:left w:w="100" w:type="dxa"/>
+              <w:right w:w="100" w:type="dxa"/>
+            </w:tcMar>
+          </w:tcPr>
+          <w:p>
+            <w:pPr>
+              <w:spacing w:after="0" w:line="269" w:lineRule="auto"/>
+            </w:pPr>
+            <w:r>
+              <w:rPr>
+                <w:rFonts w:ascii="Arial Unicode MS" w:hAnsi="Arial Unicode MS" w:eastAsia="Arial Unicode MS" w:cs="Arial Unicode MS"/>
+                <w:color w:val="000000"/>
+                <w:sz w:val="21"/>
+              </w:rPr>
+              <w:t>分子分母可核对，阻断问题关闭</w:t>
+            </w:r>
+          </w:p>
+        </w:tc>
+      </w:tr>
+      <w:tr>
+        <w:trPr>
+          <w:cantSplit/>
+        </w:trPr>
+        <w:tc>
+          <w:tcPr>
+            <w:tcW w:type="dxa" w:w="1613"/>
+            <w:vAlign w:val="center"/>
+            <w:shd w:fill="F3F6F9"/>
+            <w:tcMar>
+              <w:top w:w="90" w:type="dxa"/>
+              <w:bottom w:w="90" w:type="dxa"/>
+              <w:left w:w="100" w:type="dxa"/>
+              <w:right w:w="100" w:type="dxa"/>
+            </w:tcMar>
+          </w:tcPr>
+          <w:p>
+            <w:pPr>
+              <w:spacing w:after="0" w:line="269" w:lineRule="auto"/>
+            </w:pPr>
+            <w:r>
+              <w:rPr>
+                <w:rFonts w:ascii="Arial Unicode MS" w:hAnsi="Arial Unicode MS" w:eastAsia="Arial Unicode MS" w:cs="Arial Unicode MS"/>
+                <w:color w:val="000000"/>
+                <w:sz w:val="21"/>
+              </w:rPr>
+              <w:t>S10</w:t>
+            </w:r>
+          </w:p>
+        </w:tc>
+        <w:tc>
+          <w:tcPr>
+            <w:tcW w:type="dxa" w:w="2822"/>
+            <w:vAlign w:val="center"/>
+            <w:shd w:fill="F3F6F9"/>
+            <w:tcMar>
+              <w:top w:w="90" w:type="dxa"/>
+              <w:bottom w:w="90" w:type="dxa"/>
+              <w:left w:w="100" w:type="dxa"/>
+              <w:right w:w="100" w:type="dxa"/>
+            </w:tcMar>
+          </w:tcPr>
+          <w:p>
+            <w:pPr>
+              <w:spacing w:after="0" w:line="269" w:lineRule="auto"/>
+            </w:pPr>
+            <w:r>
+              <w:rPr>
+                <w:rFonts w:ascii="Arial Unicode MS" w:hAnsi="Arial Unicode MS" w:eastAsia="Arial Unicode MS" w:cs="Arial Unicode MS"/>
+                <w:color w:val="000000"/>
+                <w:sz w:val="21"/>
+              </w:rPr>
+              <w:t>2027 年 3 月 1 日至 3 月 14 日</w:t>
+            </w:r>
+          </w:p>
+        </w:tc>
+        <w:tc>
+          <w:tcPr>
+            <w:tcW w:type="dxa" w:w="3629"/>
+            <w:vAlign w:val="center"/>
+            <w:shd w:fill="F3F6F9"/>
+            <w:tcMar>
+              <w:top w:w="90" w:type="dxa"/>
+              <w:bottom w:w="90" w:type="dxa"/>
+              <w:left w:w="100" w:type="dxa"/>
+              <w:right w:w="100" w:type="dxa"/>
+            </w:tcMar>
+          </w:tcPr>
+          <w:p>
+            <w:pPr>
+              <w:spacing w:after="0" w:line="269" w:lineRule="auto"/>
+            </w:pPr>
+            <w:r>
+              <w:rPr>
+                <w:rFonts w:ascii="Arial Unicode MS" w:hAnsi="Arial Unicode MS" w:eastAsia="Arial Unicode MS" w:cs="Arial Unicode MS"/>
+                <w:color w:val="000000"/>
+                <w:sz w:val="21"/>
+              </w:rPr>
+              <w:t>后续 cohort、容量与运营复盘</w:t>
             </w:r>
           </w:p>
         </w:tc>
@@ -9997,7 +9832,7 @@
           <w:rFonts w:ascii="Arial Unicode MS" w:hAnsi="Arial Unicode MS" w:eastAsia="Arial Unicode MS" w:cs="Arial Unicode MS"/>
           <w:color w:val="000000"/>
         </w:rPr>
-        <w:t>参考团队配置为后端 1 人、iOS 1 人、Web 与测试工程 1 人，产品/设计和校园运营可兼职，但必须有人负责。角色名表示责任，不表示现有团队已具备这些人员。AI 可协助实现、分析和测试，需求取舍、验收、权限、内容与发布仍要明确负责的人。</w:t>
+        <w:t>参考团队配置为后端 1 人、iOS 1 人两个核心工程角色，产品、设计、测试验收和校园运营可兼职，但必须有人负责并安排可用时段。角色名表示责任，不表示现有团队已具备这些人员。AI 可协助实现、分析和测试，需求取舍、验收、权限、内容与发布仍要明确负责的人。</w:t>
       </w:r>
     </w:p>
     <w:p>
@@ -10006,7 +9841,7 @@
           <w:rFonts w:ascii="Arial Unicode MS" w:hAnsi="Arial Unicode MS" w:eastAsia="Arial Unicode MS" w:cs="Arial Unicode MS"/>
           <w:color w:val="000000"/>
         </w:rPr>
-        <w:t>每名工程师按每周 5 个工作日、70% 可投入计划工作的比例估算，三人每周总有效容量约 10.5 人日；其余用于沟通、评审、临时缺陷与外部等待。12 周容量约 126 人日，16 周约 168 人日。单一后端负责多个关键路径，不能只凭总人日判断排期可行。</w:t>
+        <w:t>每名工程师按每周 5 个工作日、70% 可投入计划工作的比例估算，两人每周总有效容量约 7 人日；其余用于沟通、评审、临时缺陷与外部等待。12 周容量约 84 人日，16 周约 112 人日，20 周约 140 人日。兼职 QA、设计与运营不再算作第三名完整工程师。</w:t>
       </w:r>
     </w:p>
     <w:p>
@@ -10015,7 +9850,7 @@
           <w:rFonts w:ascii="Arial Unicode MS" w:hAnsi="Arial Unicode MS" w:eastAsia="Arial Unicode MS" w:cs="Arial Unicode MS"/>
           <w:color w:val="000000"/>
         </w:rPr>
-        <w:t>24 个工作包的工程估算合计为 96 至 141 人日，中点约 119 人日。Beta 前 DP01 至 DP22 合计 89 至 130 人日，中点约 110 人日；按每周 10.5 人日，单看总量就约需 8.5 至 12.4 周。因此不能使用第 9 周之后的容量，证明第 8 周已完成全部试点准备。基线安排第 11 至 13 周进入 Beta，并留出后续观察和修复窗口。</w:t>
+        <w:t>22 个活动工作包的工程估算合计为 80 至 120 人日，中点 100 人日。Beta 前 DP01 至 DP22 排除暂停项后合计 74 至 110 人日，中点 92 人日；按每周 7 人日，单看总量约需 10.6 至 15.7 周。全量工作总容量下界约为 11.4 至 17.1 周，还需为角色瓶颈、外部等待和试点观察留时间。</w:t>
       </w:r>
     </w:p>
     <w:p>
@@ -10024,7 +9859,7 @@
           <w:rFonts w:ascii="Arial Unicode MS" w:hAnsi="Arial Unicode MS" w:eastAsia="Arial Unicode MS" w:cs="Arial Unicode MS"/>
           <w:color w:val="000000"/>
         </w:rPr>
-        <w:t>单后端工作量偏高，S1 需按 BE、IOS、WEB 拆分重新平衡；可由具备能力的 Web/测试工程协助后端集成与报表，或增加后端资源。16 周参考窗口不消除专业分工和外部等待带来的瓶颈，超出时应顺延或裁剪范围。</w:t>
+        <w:t>安全、成长模型、治理、消息和数据多条路径依赖同一后端。S1 需把每包人日拆到 BE 与 IOS，分别校验周负载；如后端超载，增加具备相应能力的资源、裁剪范围或顺延。20 周仅为参考观察窗口，不保证在上界情景按期完成，不能以两人总容量掩盖后端等待。</w:t>
       </w:r>
     </w:p>
     <w:p>
@@ -10033,7 +9868,7 @@
           <w:rFonts w:ascii="Arial Unicode MS" w:hAnsi="Arial Unicode MS" w:eastAsia="Arial Unicode MS" w:cs="Arial Unicode MS"/>
           <w:color w:val="000000"/>
         </w:rPr>
-        <w:t>若只有创始人一人兼全部工程角色，按每周 3.5 个有效工程日计算，仅工程工作就约需 28 至 41 周，内容、研究和外部等待另计。可先拆出 2 至 3 周的内部 Alpha 切片，但不能把完整试点范围压成同样工期。</w:t>
+        <w:t>若只有创始人一人兼全部工程角色，按每周 3.5 个有效工程日计算，仅工程工作就约需 23 至 35 周，内容、研究和外部等待另计。可先拆出 2 至 3 周的内部 Alpha 切片，但不能把完整试点范围压成同样工期。</w:t>
       </w:r>
     </w:p>
     <w:p>
@@ -10373,7 +10208,7 @@
                 <w:color w:val="000000"/>
                 <w:sz w:val="21"/>
               </w:rPr>
-              <w:t>契约、模型、权限、并发、消息与状态</w:t>
+              <w:t>契约、模型、权限、并发、消息、治理工具与数据导出</w:t>
             </w:r>
           </w:p>
         </w:tc>
@@ -10399,7 +10234,7 @@
                 <w:color w:val="000000"/>
                 <w:sz w:val="21"/>
               </w:rPr>
-              <w:t>数据一致、故障恢复、跨实例与性能</w:t>
+              <w:t>数据一致、故障恢复、跨实例、受控运营与性能</w:t>
             </w:r>
           </w:p>
         </w:tc>
@@ -10513,7 +10348,7 @@
                 <w:color w:val="000000"/>
                 <w:sz w:val="21"/>
               </w:rPr>
-              <w:t>WEB 工程</w:t>
+              <w:t>QA 测试责任人</w:t>
             </w:r>
           </w:p>
         </w:tc>
@@ -10539,7 +10374,7 @@
                 <w:color w:val="000000"/>
                 <w:sz w:val="21"/>
               </w:rPr>
-              <w:t>分享、响应式、后台与契约消费</w:t>
+              <w:t>用例、自动化、回归和证据</w:t>
             </w:r>
           </w:p>
         </w:tc>
@@ -10565,7 +10400,7 @@
                 <w:color w:val="000000"/>
                 <w:sz w:val="21"/>
               </w:rPr>
-              <w:t>链接可访问、窄屏、Cookie 与后台效率</w:t>
+              <w:t>严重缺陷、端到端旅程与回归覆盖</w:t>
             </w:r>
           </w:p>
         </w:tc>
@@ -10596,7 +10431,7 @@
                 <w:color w:val="000000"/>
                 <w:sz w:val="21"/>
               </w:rPr>
-              <w:t>QA 测试责任人</w:t>
+              <w:t>OPS 运营责任人</w:t>
             </w:r>
           </w:p>
         </w:tc>
@@ -10622,7 +10457,7 @@
                 <w:color w:val="000000"/>
                 <w:sz w:val="21"/>
               </w:rPr>
-              <w:t>用例、自动化、回归和证据</w:t>
+              <w:t>内容核验、招募、治理与交接</w:t>
             </w:r>
           </w:p>
         </w:tc>
@@ -10631,89 +10466,6 @@
             <w:tcW w:type="dxa" w:w="3226"/>
             <w:vAlign w:val="center"/>
             <w:shd w:fill="F3F6F9"/>
-            <w:tcMar>
-              <w:top w:w="90" w:type="dxa"/>
-              <w:bottom w:w="90" w:type="dxa"/>
-              <w:left w:w="100" w:type="dxa"/>
-              <w:right w:w="100" w:type="dxa"/>
-            </w:tcMar>
-          </w:tcPr>
-          <w:p>
-            <w:pPr>
-              <w:spacing w:after="0" w:line="269" w:lineRule="auto"/>
-            </w:pPr>
-            <w:r>
-              <w:rPr>
-                <w:rFonts w:ascii="Arial Unicode MS" w:hAnsi="Arial Unicode MS" w:eastAsia="Arial Unicode MS" w:cs="Arial Unicode MS"/>
-                <w:color w:val="000000"/>
-                <w:sz w:val="21"/>
-              </w:rPr>
-              <w:t>严重缺陷、端到端旅程与回归覆盖</w:t>
-            </w:r>
-          </w:p>
-        </w:tc>
-      </w:tr>
-      <w:tr>
-        <w:trPr>
-          <w:cantSplit/>
-        </w:trPr>
-        <w:tc>
-          <w:tcPr>
-            <w:tcW w:type="dxa" w:w="1915"/>
-            <w:vAlign w:val="center"/>
-            <w:shd w:fill="FFFFFF"/>
-            <w:tcMar>
-              <w:top w:w="90" w:type="dxa"/>
-              <w:bottom w:w="90" w:type="dxa"/>
-              <w:left w:w="100" w:type="dxa"/>
-              <w:right w:w="100" w:type="dxa"/>
-            </w:tcMar>
-          </w:tcPr>
-          <w:p>
-            <w:pPr>
-              <w:spacing w:after="0" w:line="269" w:lineRule="auto"/>
-            </w:pPr>
-            <w:r>
-              <w:rPr>
-                <w:rFonts w:ascii="Arial Unicode MS" w:hAnsi="Arial Unicode MS" w:eastAsia="Arial Unicode MS" w:cs="Arial Unicode MS"/>
-                <w:color w:val="000000"/>
-                <w:sz w:val="21"/>
-              </w:rPr>
-              <w:t>OPS 运营责任人</w:t>
-            </w:r>
-          </w:p>
-        </w:tc>
-        <w:tc>
-          <w:tcPr>
-            <w:tcW w:type="dxa" w:w="4939"/>
-            <w:vAlign w:val="center"/>
-            <w:shd w:fill="FFFFFF"/>
-            <w:tcMar>
-              <w:top w:w="90" w:type="dxa"/>
-              <w:bottom w:w="90" w:type="dxa"/>
-              <w:left w:w="100" w:type="dxa"/>
-              <w:right w:w="100" w:type="dxa"/>
-            </w:tcMar>
-          </w:tcPr>
-          <w:p>
-            <w:pPr>
-              <w:spacing w:after="0" w:line="269" w:lineRule="auto"/>
-            </w:pPr>
-            <w:r>
-              <w:rPr>
-                <w:rFonts w:ascii="Arial Unicode MS" w:hAnsi="Arial Unicode MS" w:eastAsia="Arial Unicode MS" w:cs="Arial Unicode MS"/>
-                <w:color w:val="000000"/>
-                <w:sz w:val="21"/>
-              </w:rPr>
-              <w:t>内容核验、招募、治理与交接</w:t>
-            </w:r>
-          </w:p>
-        </w:tc>
-        <w:tc>
-          <w:tcPr>
-            <w:tcW w:type="dxa" w:w="3226"/>
-            <w:vAlign w:val="center"/>
-            <w:shd w:fill="FFFFFF"/>
             <w:tcMar>
               <w:top w:w="90" w:type="dxa"/>
               <w:bottom w:w="90" w:type="dxa"/>
@@ -10818,7 +10570,7 @@
           <w:rFonts w:ascii="Arial Unicode MS" w:hAnsi="Arial Unicode MS" w:eastAsia="Arial Unicode MS" w:cs="Arial Unicode MS"/>
           <w:color w:val="000000"/>
         </w:rPr>
-        <w:t>后端覆盖规则、边界与幂等单测，以及真实 MySQL/Redis 的会话、事务、分页、并发和迁移集成测试。Web 使用构建、lint、类型契约与核心旅程自动化；iOS 使用编译、模型/状态测试、UI 冒烟、真机和最低系统验证。目前没有 iOS XCTest target 和 CI 构建 job，应在 DP21 补齐，不把现有 CI 绿解释为 iOS 已验证。上传和文件本地处理单独验证。</w:t>
+        <w:t>后端覆盖规则、边界与幂等单测，以及真实 MySQL/Redis 的会话、事务、分页、并发、治理工具与迁移集成测试。iOS 使用编译、模型/状态测试、UI 冒烟、真机和最低系统验证。目前没有 iOS XCTest target 和 CI 构建 job，应在 DP21 补齐，不把现有 CI 绿解释为 iOS 已验证。上传和文件本地处理单独验证；本期不新增网页 E2E 或响应式测试。</w:t>
       </w:r>
     </w:p>
     <w:p>
@@ -10827,7 +10579,7 @@
           <w:rFonts w:ascii="Arial Unicode MS" w:hAnsi="Arial Unicode MS" w:eastAsia="Arial Unicode MS" w:cs="Arial Unicode MS"/>
           <w:color w:val="000000"/>
         </w:rPr>
-        <w:t>复用仓库已有检查：前端 lint/build、后端测试、shell 语法、Compose 配置、smoke.sh 和生成类型差异检查。只改文档时检查内容、链接与排版即可；功能提交按影响执行完整检查。测试数量随代码变化，不把旧文档的固定数量当质量证明。</w:t>
+        <w:t>复用后端测试、shell 语法、Compose 配置与 smoke.sh；现有前端 lint/build 和生成类型差异检查继续按仓库要求运行，暂停页面开发不意味着删除已有 CI。只改文档时检查内容、链接与排版即可；功能提交按影响执行完整检查。测试数量随代码变化，不把旧文档的固定数量当质量证明。</w:t>
       </w:r>
     </w:p>
     <w:tbl>
@@ -10989,7 +10741,7 @@
                 <w:color w:val="000000"/>
                 <w:sz w:val="21"/>
               </w:rPr>
-              <w:t>旧 token、Cookie、改密、封禁、注销、双实例</w:t>
+              <w:t>旧 token、改密、封禁、注销、双实例；既有 Cookie 兼容回归</w:t>
             </w:r>
           </w:p>
         </w:tc>
@@ -11487,7 +11239,7 @@
                 <w:color w:val="000000"/>
                 <w:sz w:val="21"/>
               </w:rPr>
-              <w:t>窄屏、大字体、键盘、VoiceOver、系统深色</w:t>
+              <w:t>iPhone 小屏、大字体、键盘、VoiceOver、系统深色</w:t>
             </w:r>
           </w:p>
         </w:tc>
@@ -11547,7 +11299,7 @@
           <w:rFonts w:ascii="Arial Unicode MS" w:hAnsi="Arial Unicode MS" w:eastAsia="Arial Unicode MS" w:cs="Arial Unicode MS"/>
           <w:color w:val="000000"/>
         </w:rPr>
-        <w:t>按开发、集成/预发布、封闭试点区分数据与配置。CI 产物记录 commit、迁移版本和客户端版本。Release 使用 HTTPS API 地址、正确签名和通知配置；不能沿用 localhost、开发 entitlement 或全局禁止签名设置。</w:t>
+        <w:t>按开发、集成/预发布、封闭试点区分数据与配置。CI 产物记录 commit、迁移版本和客户端版本。当前 iOS 地址已指向服务器 IP，但纯 HTTP 连接不等于正式发布就绪；Release 仍须使用经验证的 HTTPS API、正确签名和通知配置，不沿用开发 entitlement 或全局禁止签名设置。</w:t>
       </w:r>
     </w:p>
     <w:p>
@@ -11690,7 +11442,7 @@
           <w:rFonts w:ascii="Arial Unicode MS" w:hAnsi="Arial Unicode MS" w:eastAsia="Arial Unicode MS" w:cs="Arial Unicode MS"/>
           <w:color w:val="000000"/>
         </w:rPr>
-        <w:t>运营每天看举报积压与临近过期内容，工程值班负责 Outbox 与服务告警的技术响应，运营协调用户沟通；每周共同复盘主线缺口、帮助反馈、渠道质量与申诉。账号、作者授权、合作联系人、权限和未完事项归平台受控记录，换届时逐项交接。</w:t>
+        <w:t>运营每天通过受控查询或导出看举报积压与临近过期内容，工程值班负责 Outbox 与服务告警的技术响应，运营协调用户沟通；每周共同复盘主线缺口、帮助反馈、渠道质量与申诉。受控工具需有可执行手册和替补人员，不以新建网页工作台作为前提。账号、作者授权、合作联系人、权限和未完事项归平台受控记录，换届时逐项交接。</w:t>
       </w:r>
     </w:p>
     <w:p>
@@ -11711,7 +11463,7 @@
           <w:rFonts w:ascii="Arial Unicode MS" w:hAnsi="Arial Unicode MS" w:eastAsia="Arial Unicode MS" w:cs="Arial Unicode MS"/>
           <w:color w:val="000000"/>
         </w:rPr>
-        <w:t>先邀请 30 至 50 名学生观察真实任务，访谈中允许明确说不适用或没帮助。渠道码记录来源，不记录敏感身份材料。推广文案只描述已开放功能，用户可以先读攻略，不强制下载。</w:t>
+        <w:t>先邀请 30 至 50 名具备兼容 iOS 设备且同意安装测试版的学生观察真实任务，访谈中允许明确说不适用或没帮助。渠道码记录来源，不记录敏感身份材料。推广文案只描述已开放功能与实际分发方式；未安装者可以参与访谈，不计为激活用户，也不承诺浏览器直接阅读。反馈与留存结论限定于本次 iOS 试点人群。</w:t>
       </w:r>
     </w:p>
     <w:p>
@@ -11720,7 +11472,7 @@
           <w:rFonts w:ascii="Arial Unicode MS" w:hAnsi="Arial Unicode MS" w:eastAsia="Arial Unicode MS" w:cs="Arial Unicode MS"/>
           <w:color w:val="000000"/>
         </w:rPr>
-        <w:t>每周复盘激活、首任务、成熟 D7、WAP、内容覆盖、工具成功、举报时效和访谈。选择两到三个具体问题进入下一迭代，例如学校选择无结果、任务步骤不清、分享后找不到原文。避免把低留存直接归因于奖励不足。</w:t>
+        <w:t>每周用受控报表导出与访谈复盘激活、首任务、成熟 D7、WAP、内容覆盖、工具成功和举报时效。选择两到三个具体问题进入下一迭代，例如学校选择无结果、任务步骤不清、通知进入后无法返回原任务。避免把低留存直接归因于奖励不足。</w:t>
       </w:r>
     </w:p>
     <w:p>
@@ -12490,7 +12242,7 @@
                 <w:color w:val="000000"/>
                 <w:sz w:val="21"/>
               </w:rPr>
-              <w:t>真机仍连 localhost 或签名失败</w:t>
+              <w:t>真机 API 地址不可达、仍用未验收 HTTP 或签名失败</w:t>
             </w:r>
           </w:p>
         </w:tc>
@@ -12968,7 +12720,7 @@
           <w:rFonts w:ascii="Arial Unicode MS" w:hAnsi="Arial Unicode MS" w:eastAsia="Arial Unicode MS" w:cs="Arial Unicode MS"/>
           <w:color w:val="000000"/>
         </w:rPr>
-        <w:t>落地首个后端成长契约与引导选择器，接通测试数据到真实接口；开始举报后台与 Outbox。建立客户端状态组件和首条自动化旅程。制定备份与恢复脚本的隔离演练方案，避免使用真实用户数据进行破坏测试。</w:t>
+        <w:t>落地首个后端成长契约与 iOS 引导选择器，接通测试数据到真实接口；开始治理 API、受控操作工具与 Outbox。建立客户端状态组件和首条自动化旅程。制定备份与恢复脚本的隔离演练方案，避免使用真实用户数据进行破坏测试。</w:t>
       </w:r>
     </w:p>
     <w:p>
@@ -12989,7 +12741,7 @@
           <w:rFonts w:ascii="Arial Unicode MS" w:hAnsi="Arial Unicode MS" w:eastAsia="Arial Unicode MS" w:cs="Arial Unicode MS"/>
           <w:color w:val="000000"/>
         </w:rPr>
-        <w:t>走通内部 Alpha 的最小切片并记录阻断点；完成安全和权限回归；以测试结果更新人日和依赖。评审 S2 是否进入，不把尚未接通的页面标为完成。公布下一迭代交付物、负责人和所需内容。</w:t>
+        <w:t>走通契约原型或最小接口联调切片并记录阻断点，不宣称已达到第 10.2 节内部 Alpha 门槛；复验已实施的安全与权限修复，以结果更新人日和依赖。评审 S2 是否进入，不把尚未接通的页面标为完成。公布下一迭代交付物、负责人和所需内容。</w:t>
       </w:r>
     </w:p>
     <w:p>
@@ -13246,7 +12998,7 @@
                 <w:color w:val="000000"/>
                 <w:sz w:val="21"/>
               </w:rPr>
-              <w:t>先按三名工程角色估算，不假定已具备</w:t>
+              <w:t>按 BE 与 IOS 两名工程角色估算，另排兼职验收时段</w:t>
             </w:r>
           </w:p>
         </w:tc>
@@ -13469,7 +13221,7 @@
                 <w:color w:val="000000"/>
                 <w:sz w:val="21"/>
               </w:rPr>
-              <w:t>课表范围</w:t>
+              <w:t>客户端范围</w:t>
             </w:r>
           </w:p>
         </w:tc>
@@ -13495,7 +13247,7 @@
                 <w:color w:val="000000"/>
                 <w:sz w:val="21"/>
               </w:rPr>
-              <w:t>Web 本机保存，先清理假导入动作</w:t>
+              <w:t>仅 iOS；网页、课表和新增管理网页暂缓，现有代码保留</w:t>
             </w:r>
           </w:p>
         </w:tc>
@@ -13521,7 +13273,7 @@
                 <w:color w:val="000000"/>
                 <w:sz w:val="21"/>
               </w:rPr>
-              <w:t>S1 范围确认</w:t>
+              <w:t>已按本次范围调整</w:t>
             </w:r>
           </w:p>
         </w:tc>
@@ -14482,7 +14234,7 @@
                 <w:color w:val="000000"/>
                 <w:sz w:val="21"/>
               </w:rPr>
-              <w:t>CORE-03 CORE-04</w:t>
+              <w:t>CORE-03</w:t>
             </w:r>
           </w:p>
         </w:tc>
@@ -14508,7 +14260,7 @@
                 <w:color w:val="000000"/>
                 <w:sz w:val="21"/>
               </w:rPr>
-              <w:t>DP12 DP13</w:t>
+              <w:t>DP12</w:t>
             </w:r>
           </w:p>
         </w:tc>
@@ -14534,7 +14286,7 @@
                 <w:color w:val="000000"/>
                 <w:sz w:val="21"/>
               </w:rPr>
-              <w:t>一个工具，课表明确本地边界</w:t>
+              <w:t>iOS 一个本地工具</w:t>
             </w:r>
           </w:p>
         </w:tc>
@@ -14565,7 +14317,7 @@
                 <w:color w:val="000000"/>
                 <w:sz w:val="21"/>
               </w:rPr>
-              <w:t>ENG-01 至 ENG-05</w:t>
+              <w:t>CORE-04</w:t>
             </w:r>
           </w:p>
         </w:tc>
@@ -14591,7 +14343,7 @@
                 <w:color w:val="000000"/>
                 <w:sz w:val="21"/>
               </w:rPr>
-              <w:t>DP09 DP14 至 DP17</w:t>
+              <w:t>DP13 暂停</w:t>
             </w:r>
           </w:p>
         </w:tc>
@@ -14617,7 +14369,7 @@
                 <w:color w:val="000000"/>
                 <w:sz w:val="21"/>
               </w:rPr>
-              <w:t>可靠性与错误恢复</w:t>
+              <w:t>课程表整体暂缓，不计本期交付</w:t>
             </w:r>
           </w:p>
         </w:tc>
@@ -14648,7 +14400,7 @@
                 <w:color w:val="000000"/>
                 <w:sz w:val="21"/>
               </w:rPr>
-              <w:t>ENG-06 OBS-01 PERF-01</w:t>
+              <w:t>ENG-01 至 ENG-05</w:t>
             </w:r>
           </w:p>
         </w:tc>
@@ -14674,7 +14426,7 @@
                 <w:color w:val="000000"/>
                 <w:sz w:val="21"/>
               </w:rPr>
-              <w:t>DP01 DP06 DP23</w:t>
+              <w:t>DP09 DP14 至 DP17</w:t>
             </w:r>
           </w:p>
         </w:tc>
@@ -14700,7 +14452,7 @@
                 <w:color w:val="000000"/>
                 <w:sz w:val="21"/>
               </w:rPr>
-              <w:t>增量边界、告警和容量</w:t>
+              <w:t>可靠性与错误恢复</w:t>
             </w:r>
           </w:p>
         </w:tc>
@@ -14731,7 +14483,7 @@
                 <w:color w:val="000000"/>
                 <w:sz w:val="21"/>
               </w:rPr>
-              <w:t>DES-01 至 DES-03 A11Y-01</w:t>
+              <w:t>ENG-06 OBS-01 PERF-01</w:t>
             </w:r>
           </w:p>
         </w:tc>
@@ -14757,7 +14509,7 @@
                 <w:color w:val="000000"/>
                 <w:sz w:val="21"/>
               </w:rPr>
-              <w:t>DP18 DP19 DP21</w:t>
+              <w:t>DP01 DP06 DP23</w:t>
             </w:r>
           </w:p>
         </w:tc>
@@ -14783,7 +14535,7 @@
                 <w:color w:val="000000"/>
                 <w:sz w:val="21"/>
               </w:rPr>
-              <w:t>设计前置，逐包验收</w:t>
+              <w:t>增量边界、告警和容量</w:t>
             </w:r>
           </w:p>
         </w:tc>
@@ -14814,7 +14566,7 @@
                 <w:color w:val="000000"/>
                 <w:sz w:val="21"/>
               </w:rPr>
-              <w:t>TEST-01 至 TEST-03</w:t>
+              <w:t>DES-01 DES-03 A11Y-01</w:t>
             </w:r>
           </w:p>
         </w:tc>
@@ -14840,7 +14592,7 @@
                 <w:color w:val="000000"/>
                 <w:sz w:val="21"/>
               </w:rPr>
-              <w:t>DP21 DP22</w:t>
+              <w:t>DP18 DP21</w:t>
             </w:r>
           </w:p>
         </w:tc>
@@ -14866,7 +14618,7 @@
                 <w:color w:val="000000"/>
                 <w:sz w:val="21"/>
               </w:rPr>
-              <w:t>自动化、最低系统与真机</w:t>
+              <w:t>iOS 设计前置，逐包验收；网页部分暂停</w:t>
             </w:r>
           </w:p>
         </w:tc>
@@ -14897,6 +14649,255 @@
                 <w:color w:val="000000"/>
                 <w:sz w:val="21"/>
               </w:rPr>
+              <w:t>DES-02</w:t>
+            </w:r>
+          </w:p>
+        </w:tc>
+        <w:tc>
+          <w:tcPr>
+            <w:tcW w:type="dxa" w:w="4939"/>
+            <w:vAlign w:val="center"/>
+            <w:shd w:fill="FFFFFF"/>
+            <w:tcMar>
+              <w:top w:w="90" w:type="dxa"/>
+              <w:bottom w:w="90" w:type="dxa"/>
+              <w:left w:w="100" w:type="dxa"/>
+              <w:right w:w="100" w:type="dxa"/>
+            </w:tcMar>
+          </w:tcPr>
+          <w:p>
+            <w:pPr>
+              <w:spacing w:after="0" w:line="269" w:lineRule="auto"/>
+            </w:pPr>
+            <w:r>
+              <w:rPr>
+                <w:rFonts w:ascii="Arial Unicode MS" w:hAnsi="Arial Unicode MS" w:eastAsia="Arial Unicode MS" w:cs="Arial Unicode MS"/>
+                <w:color w:val="000000"/>
+                <w:sz w:val="21"/>
+              </w:rPr>
+              <w:t>DP19 暂停</w:t>
+            </w:r>
+          </w:p>
+        </w:tc>
+        <w:tc>
+          <w:tcPr>
+            <w:tcW w:type="dxa" w:w="3226"/>
+            <w:vAlign w:val="center"/>
+            <w:shd w:fill="FFFFFF"/>
+            <w:tcMar>
+              <w:top w:w="90" w:type="dxa"/>
+              <w:bottom w:w="90" w:type="dxa"/>
+              <w:left w:w="100" w:type="dxa"/>
+              <w:right w:w="100" w:type="dxa"/>
+            </w:tcMar>
+          </w:tcPr>
+          <w:p>
+            <w:pPr>
+              <w:spacing w:after="0" w:line="269" w:lineRule="auto"/>
+            </w:pPr>
+            <w:r>
+              <w:rPr>
+                <w:rFonts w:ascii="Arial Unicode MS" w:hAnsi="Arial Unicode MS" w:eastAsia="Arial Unicode MS" w:cs="Arial Unicode MS"/>
+                <w:color w:val="000000"/>
+                <w:sz w:val="21"/>
+              </w:rPr>
+              <w:t>网页分享与响应式不计本期交付</w:t>
+            </w:r>
+          </w:p>
+        </w:tc>
+      </w:tr>
+      <w:tr>
+        <w:trPr>
+          <w:cantSplit/>
+        </w:trPr>
+        <w:tc>
+          <w:tcPr>
+            <w:tcW w:type="dxa" w:w="1915"/>
+            <w:vAlign w:val="center"/>
+            <w:shd w:fill="F3F6F9"/>
+            <w:tcMar>
+              <w:top w:w="90" w:type="dxa"/>
+              <w:bottom w:w="90" w:type="dxa"/>
+              <w:left w:w="100" w:type="dxa"/>
+              <w:right w:w="100" w:type="dxa"/>
+            </w:tcMar>
+          </w:tcPr>
+          <w:p>
+            <w:pPr>
+              <w:spacing w:after="0" w:line="269" w:lineRule="auto"/>
+            </w:pPr>
+            <w:r>
+              <w:rPr>
+                <w:rFonts w:ascii="Arial Unicode MS" w:hAnsi="Arial Unicode MS" w:eastAsia="Arial Unicode MS" w:cs="Arial Unicode MS"/>
+                <w:color w:val="000000"/>
+                <w:sz w:val="21"/>
+              </w:rPr>
+              <w:t>TEST-02 TEST-03</w:t>
+            </w:r>
+          </w:p>
+        </w:tc>
+        <w:tc>
+          <w:tcPr>
+            <w:tcW w:type="dxa" w:w="4939"/>
+            <w:vAlign w:val="center"/>
+            <w:shd w:fill="F3F6F9"/>
+            <w:tcMar>
+              <w:top w:w="90" w:type="dxa"/>
+              <w:bottom w:w="90" w:type="dxa"/>
+              <w:left w:w="100" w:type="dxa"/>
+              <w:right w:w="100" w:type="dxa"/>
+            </w:tcMar>
+          </w:tcPr>
+          <w:p>
+            <w:pPr>
+              <w:spacing w:after="0" w:line="269" w:lineRule="auto"/>
+            </w:pPr>
+            <w:r>
+              <w:rPr>
+                <w:rFonts w:ascii="Arial Unicode MS" w:hAnsi="Arial Unicode MS" w:eastAsia="Arial Unicode MS" w:cs="Arial Unicode MS"/>
+                <w:color w:val="000000"/>
+                <w:sz w:val="21"/>
+              </w:rPr>
+              <w:t>DP21 DP22</w:t>
+            </w:r>
+          </w:p>
+        </w:tc>
+        <w:tc>
+          <w:tcPr>
+            <w:tcW w:type="dxa" w:w="3226"/>
+            <w:vAlign w:val="center"/>
+            <w:shd w:fill="F3F6F9"/>
+            <w:tcMar>
+              <w:top w:w="90" w:type="dxa"/>
+              <w:bottom w:w="90" w:type="dxa"/>
+              <w:left w:w="100" w:type="dxa"/>
+              <w:right w:w="100" w:type="dxa"/>
+            </w:tcMar>
+          </w:tcPr>
+          <w:p>
+            <w:pPr>
+              <w:spacing w:after="0" w:line="269" w:lineRule="auto"/>
+            </w:pPr>
+            <w:r>
+              <w:rPr>
+                <w:rFonts w:ascii="Arial Unicode MS" w:hAnsi="Arial Unicode MS" w:eastAsia="Arial Unicode MS" w:cs="Arial Unicode MS"/>
+                <w:color w:val="000000"/>
+                <w:sz w:val="21"/>
+              </w:rPr>
+              <w:t>后端与 iOS 自动化、最低系统与真机</w:t>
+            </w:r>
+          </w:p>
+        </w:tc>
+      </w:tr>
+      <w:tr>
+        <w:trPr>
+          <w:cantSplit/>
+        </w:trPr>
+        <w:tc>
+          <w:tcPr>
+            <w:tcW w:type="dxa" w:w="1915"/>
+            <w:vAlign w:val="center"/>
+            <w:shd w:fill="FFFFFF"/>
+            <w:tcMar>
+              <w:top w:w="90" w:type="dxa"/>
+              <w:bottom w:w="90" w:type="dxa"/>
+              <w:left w:w="100" w:type="dxa"/>
+              <w:right w:w="100" w:type="dxa"/>
+            </w:tcMar>
+          </w:tcPr>
+          <w:p>
+            <w:pPr>
+              <w:spacing w:after="0" w:line="269" w:lineRule="auto"/>
+            </w:pPr>
+            <w:r>
+              <w:rPr>
+                <w:rFonts w:ascii="Arial Unicode MS" w:hAnsi="Arial Unicode MS" w:eastAsia="Arial Unicode MS" w:cs="Arial Unicode MS"/>
+                <w:color w:val="000000"/>
+                <w:sz w:val="21"/>
+              </w:rPr>
+              <w:t>TEST-01</w:t>
+            </w:r>
+          </w:p>
+        </w:tc>
+        <w:tc>
+          <w:tcPr>
+            <w:tcW w:type="dxa" w:w="4939"/>
+            <w:vAlign w:val="center"/>
+            <w:shd w:fill="FFFFFF"/>
+            <w:tcMar>
+              <w:top w:w="90" w:type="dxa"/>
+              <w:bottom w:w="90" w:type="dxa"/>
+              <w:left w:w="100" w:type="dxa"/>
+              <w:right w:w="100" w:type="dxa"/>
+            </w:tcMar>
+          </w:tcPr>
+          <w:p>
+            <w:pPr>
+              <w:spacing w:after="0" w:line="269" w:lineRule="auto"/>
+            </w:pPr>
+            <w:r>
+              <w:rPr>
+                <w:rFonts w:ascii="Arial Unicode MS" w:hAnsi="Arial Unicode MS" w:eastAsia="Arial Unicode MS" w:cs="Arial Unicode MS"/>
+                <w:color w:val="000000"/>
+                <w:sz w:val="21"/>
+              </w:rPr>
+              <w:t>暂停</w:t>
+            </w:r>
+          </w:p>
+        </w:tc>
+        <w:tc>
+          <w:tcPr>
+            <w:tcW w:type="dxa" w:w="3226"/>
+            <w:vAlign w:val="center"/>
+            <w:shd w:fill="FFFFFF"/>
+            <w:tcMar>
+              <w:top w:w="90" w:type="dxa"/>
+              <w:bottom w:w="90" w:type="dxa"/>
+              <w:left w:w="100" w:type="dxa"/>
+              <w:right w:w="100" w:type="dxa"/>
+            </w:tcMar>
+          </w:tcPr>
+          <w:p>
+            <w:pPr>
+              <w:spacing w:after="0" w:line="269" w:lineRule="auto"/>
+            </w:pPr>
+            <w:r>
+              <w:rPr>
+                <w:rFonts w:ascii="Arial Unicode MS" w:hAnsi="Arial Unicode MS" w:eastAsia="Arial Unicode MS" w:cs="Arial Unicode MS"/>
+                <w:color w:val="000000"/>
+                <w:sz w:val="21"/>
+              </w:rPr>
+              <w:t>不新增 Web 核心旅程自动化</w:t>
+            </w:r>
+          </w:p>
+        </w:tc>
+      </w:tr>
+      <w:tr>
+        <w:trPr>
+          <w:cantSplit/>
+        </w:trPr>
+        <w:tc>
+          <w:tcPr>
+            <w:tcW w:type="dxa" w:w="1915"/>
+            <w:vAlign w:val="center"/>
+            <w:shd w:fill="F3F6F9"/>
+            <w:tcMar>
+              <w:top w:w="90" w:type="dxa"/>
+              <w:bottom w:w="90" w:type="dxa"/>
+              <w:left w:w="100" w:type="dxa"/>
+              <w:right w:w="100" w:type="dxa"/>
+            </w:tcMar>
+          </w:tcPr>
+          <w:p>
+            <w:pPr>
+              <w:spacing w:after="0" w:line="269" w:lineRule="auto"/>
+            </w:pPr>
+            <w:r>
+              <w:rPr>
+                <w:rFonts w:ascii="Arial Unicode MS" w:hAnsi="Arial Unicode MS" w:eastAsia="Arial Unicode MS" w:cs="Arial Unicode MS"/>
+                <w:color w:val="000000"/>
+                <w:sz w:val="21"/>
+              </w:rPr>
               <w:t>PILOT-01 至 PILOT-05</w:t>
             </w:r>
           </w:p>
@@ -14905,7 +14906,7 @@
           <w:tcPr>
             <w:tcW w:type="dxa" w:w="4939"/>
             <w:vAlign w:val="center"/>
-            <w:shd w:fill="FFFFFF"/>
+            <w:shd w:fill="F3F6F9"/>
             <w:tcMar>
               <w:top w:w="90" w:type="dxa"/>
               <w:bottom w:w="90" w:type="dxa"/>
@@ -14931,7 +14932,7 @@
           <w:tcPr>
             <w:tcW w:type="dxa" w:w="3226"/>
             <w:vAlign w:val="center"/>
-            <w:shd w:fill="FFFFFF"/>
+            <w:shd w:fill="F3F6F9"/>
             <w:tcMar>
               <w:top w:w="90" w:type="dxa"/>
               <w:bottom w:w="90" w:type="dxa"/>
@@ -15147,7 +15148,7 @@
           <w:rFonts w:ascii="Arial Unicode MS" w:hAnsi="Arial Unicode MS" w:eastAsia="Arial Unicode MS" w:cs="Arial Unicode MS"/>
           <w:color w:val="000000"/>
         </w:rPr>
-        <w:t>iOS 的 HomeView、OnboardingView、ToolsView、Theme、project.yml；Web 的 router、schedule、feed；后端的 AchievementDtos、AuthService、RedisSessionStore、RedisRealtimeStore 与 MessageService：本次范围细化依据。</w:t>
+        <w:t>iOS 的 HomeView、OnboardingView、ToolsView、Theme、project.yml；后端的 AchievementDtos、AuthService、RedisSessionStore、RedisRealtimeStore 与 MessageService：本次范围细化依据。原网页审查保留在分析基线，不进入本期工作包。</w:t>
       </w:r>
     </w:p>
     <w:p>
@@ -15402,6 +15403,115 @@
                 <w:sz w:val="21"/>
               </w:rPr>
               <w:t>规划已形成，功能按工作包逐项验收</w:t>
+            </w:r>
+          </w:p>
+        </w:tc>
+      </w:tr>
+      <w:tr>
+        <w:trPr>
+          <w:cantSplit/>
+        </w:trPr>
+        <w:tc>
+          <w:tcPr>
+            <w:tcW w:type="dxa" w:w="1613"/>
+            <w:vAlign w:val="center"/>
+            <w:shd w:fill="F3F6F9"/>
+            <w:tcMar>
+              <w:top w:w="90" w:type="dxa"/>
+              <w:bottom w:w="90" w:type="dxa"/>
+              <w:left w:w="100" w:type="dxa"/>
+              <w:right w:w="100" w:type="dxa"/>
+            </w:tcMar>
+          </w:tcPr>
+          <w:p>
+            <w:pPr>
+              <w:spacing w:after="0" w:line="269" w:lineRule="auto"/>
+            </w:pPr>
+            <w:r>
+              <w:rPr>
+                <w:rFonts w:ascii="Arial Unicode MS" w:hAnsi="Arial Unicode MS" w:eastAsia="Arial Unicode MS" w:cs="Arial Unicode MS"/>
+                <w:color w:val="000000"/>
+                <w:sz w:val="21"/>
+              </w:rPr>
+              <w:t>1.1</w:t>
+            </w:r>
+          </w:p>
+        </w:tc>
+        <w:tc>
+          <w:tcPr>
+            <w:tcW w:type="dxa" w:w="2822"/>
+            <w:vAlign w:val="center"/>
+            <w:shd w:fill="F3F6F9"/>
+            <w:tcMar>
+              <w:top w:w="90" w:type="dxa"/>
+              <w:bottom w:w="90" w:type="dxa"/>
+              <w:left w:w="100" w:type="dxa"/>
+              <w:right w:w="100" w:type="dxa"/>
+            </w:tcMar>
+          </w:tcPr>
+          <w:p>
+            <w:pPr>
+              <w:spacing w:after="0" w:line="269" w:lineRule="auto"/>
+            </w:pPr>
+            <w:r>
+              <w:rPr>
+                <w:rFonts w:ascii="Arial Unicode MS" w:hAnsi="Arial Unicode MS" w:eastAsia="Arial Unicode MS" w:cs="Arial Unicode MS"/>
+                <w:color w:val="000000"/>
+                <w:sz w:val="21"/>
+              </w:rPr>
+              <w:t>2026 年 10 月 21 日</w:t>
+            </w:r>
+          </w:p>
+        </w:tc>
+        <w:tc>
+          <w:tcPr>
+            <w:tcW w:type="dxa" w:w="3629"/>
+            <w:vAlign w:val="center"/>
+            <w:shd w:fill="F3F6F9"/>
+            <w:tcMar>
+              <w:top w:w="90" w:type="dxa"/>
+              <w:bottom w:w="90" w:type="dxa"/>
+              <w:left w:w="100" w:type="dxa"/>
+              <w:right w:w="100" w:type="dxa"/>
+            </w:tcMar>
+          </w:tcPr>
+          <w:p>
+            <w:pPr>
+              <w:spacing w:after="0" w:line="269" w:lineRule="auto"/>
+            </w:pPr>
+            <w:r>
+              <w:rPr>
+                <w:rFonts w:ascii="Arial Unicode MS" w:hAnsi="Arial Unicode MS" w:eastAsia="Arial Unicode MS" w:cs="Arial Unicode MS"/>
+                <w:color w:val="000000"/>
+                <w:sz w:val="21"/>
+              </w:rPr>
+              <w:t>暂停网页、课表与新增管理网页；调整为 22 个活动工作包、两名工程角色和门槛驱动排期</w:t>
+            </w:r>
+          </w:p>
+        </w:tc>
+        <w:tc>
+          <w:tcPr>
+            <w:tcW w:type="dxa" w:w="2016"/>
+            <w:vAlign w:val="center"/>
+            <w:shd w:fill="F3F6F9"/>
+            <w:tcMar>
+              <w:top w:w="90" w:type="dxa"/>
+              <w:bottom w:w="90" w:type="dxa"/>
+              <w:left w:w="100" w:type="dxa"/>
+              <w:right w:w="100" w:type="dxa"/>
+            </w:tcMar>
+          </w:tcPr>
+          <w:p>
+            <w:pPr>
+              <w:spacing w:after="0" w:line="269" w:lineRule="auto"/>
+            </w:pPr>
+            <w:r>
+              <w:rPr>
+                <w:rFonts w:ascii="Arial Unicode MS" w:hAnsi="Arial Unicode MS" w:eastAsia="Arial Unicode MS" w:cs="Arial Unicode MS"/>
+                <w:color w:val="000000"/>
+                <w:sz w:val="21"/>
+              </w:rPr>
+              <w:t>仅开发 iOS、后端与基础设施；治理由受控接口和工具承接</w:t>
             </w:r>
           </w:p>
         </w:tc>

</xml_diff>

<commit_message>
Complete DP03 block enforcement and verification
</commit_message>
<xml_diff>
--- a/docs/UniPO-开发规划书-v1.0.docx
+++ b/docs/UniPO-开发规划书-v1.0.docx
@@ -4189,7 +4189,7 @@
           <w:rFonts w:ascii="Arial Unicode MS" w:hAnsi="Arial Unicode MS" w:eastAsia="Arial Unicode MS" w:cs="Arial Unicode MS"/>
           <w:color w:val="000000"/>
         </w:rPr>
-        <w:t>以上是数据设计输入，字段名与拆表方式需实施时评审。先检查已有结构，避免新建平行模型。Flyway 已有 V18，新增迁移按当时最高版本递增，不修改已发布迁移。</w:t>
+        <w:t>以上是数据设计输入，字段名与拆表方式需实施时评审。先检查已有结构，避免新建平行模型。Flyway 当前已有 V21，下一迁移从 V22 起；不修改已发布迁移。</w:t>
       </w:r>
     </w:p>
     <w:p>
@@ -8446,6 +8446,293 @@
           <w:color w:val="000000"/>
         </w:rPr>
         <w:t>每个工作包记录目标、负责人、范围、依赖、当前状态、实施链接、测试证据、设计截图、运营说明、剩余风险与完成日期。验收失败回到进行中，不只根据代码合入标为完成。状态可用待开始、规格中、实现中、验证中、阻塞、完成。</w:t>
+      </w:r>
+    </w:p>
+    <w:tbl>
+      <w:tblPr>
+        <w:tblW w:type="auto" w:w="0"/>
+        <w:jc w:val="center"/>
+        <w:tblLayout w:type="fixed"/>
+        <w:tblLook w:firstColumn="1" w:firstRow="1" w:lastColumn="0" w:lastRow="0" w:noHBand="0" w:noVBand="1" w:val="04A0"/>
+        <w:tblBorders>
+          <w:top w:val="single" w:sz="4" w:color="D9D9D9"/>
+          <w:left w:val="single" w:sz="4" w:color="D9D9D9"/>
+          <w:bottom w:val="single" w:sz="4" w:color="D9D9D9"/>
+          <w:right w:val="single" w:sz="4" w:color="D9D9D9"/>
+          <w:insideH w:val="single" w:sz="4" w:color="D9D9D9"/>
+          <w:insideV w:val="single" w:sz="4" w:color="D9D9D9"/>
+        </w:tblBorders>
+      </w:tblPr>
+      <w:tblGrid>
+        <w:gridCol w:w="1613"/>
+        <w:gridCol w:w="2822"/>
+        <w:gridCol w:w="3629"/>
+        <w:gridCol w:w="2016"/>
+      </w:tblGrid>
+      <w:tr>
+        <w:trPr>
+          <w:cantSplit/>
+          <w:tblHeader/>
+        </w:trPr>
+        <w:tc>
+          <w:tcPr>
+            <w:tcW w:type="dxa" w:w="1613"/>
+            <w:vAlign w:val="center"/>
+            <w:shd w:fill="173650"/>
+            <w:tcMar>
+              <w:top w:w="90" w:type="dxa"/>
+              <w:bottom w:w="90" w:type="dxa"/>
+              <w:left w:w="100" w:type="dxa"/>
+              <w:right w:w="100" w:type="dxa"/>
+            </w:tcMar>
+          </w:tcPr>
+          <w:p>
+            <w:pPr>
+              <w:spacing w:after="0" w:line="269" w:lineRule="auto"/>
+            </w:pPr>
+            <w:r>
+              <w:rPr>
+                <w:rFonts w:ascii="Arial Unicode MS" w:hAnsi="Arial Unicode MS" w:eastAsia="Arial Unicode MS" w:cs="Arial Unicode MS"/>
+                <w:b/>
+                <w:color w:val="FFFFFF"/>
+                <w:sz w:val="21"/>
+              </w:rPr>
+              <w:t>工作包</w:t>
+            </w:r>
+          </w:p>
+        </w:tc>
+        <w:tc>
+          <w:tcPr>
+            <w:tcW w:type="dxa" w:w="2822"/>
+            <w:vAlign w:val="center"/>
+            <w:shd w:fill="173650"/>
+            <w:tcMar>
+              <w:top w:w="90" w:type="dxa"/>
+              <w:bottom w:w="90" w:type="dxa"/>
+              <w:left w:w="100" w:type="dxa"/>
+              <w:right w:w="100" w:type="dxa"/>
+            </w:tcMar>
+          </w:tcPr>
+          <w:p>
+            <w:pPr>
+              <w:spacing w:after="0" w:line="269" w:lineRule="auto"/>
+            </w:pPr>
+            <w:r>
+              <w:rPr>
+                <w:rFonts w:ascii="Arial Unicode MS" w:hAnsi="Arial Unicode MS" w:eastAsia="Arial Unicode MS" w:cs="Arial Unicode MS"/>
+                <w:b/>
+                <w:color w:val="FFFFFF"/>
+                <w:sz w:val="21"/>
+              </w:rPr>
+              <w:t>状态</w:t>
+            </w:r>
+          </w:p>
+        </w:tc>
+        <w:tc>
+          <w:tcPr>
+            <w:tcW w:type="dxa" w:w="3629"/>
+            <w:vAlign w:val="center"/>
+            <w:shd w:fill="173650"/>
+            <w:tcMar>
+              <w:top w:w="90" w:type="dxa"/>
+              <w:bottom w:w="90" w:type="dxa"/>
+              <w:left w:w="100" w:type="dxa"/>
+              <w:right w:w="100" w:type="dxa"/>
+            </w:tcMar>
+          </w:tcPr>
+          <w:p>
+            <w:pPr>
+              <w:spacing w:after="0" w:line="269" w:lineRule="auto"/>
+            </w:pPr>
+            <w:r>
+              <w:rPr>
+                <w:rFonts w:ascii="Arial Unicode MS" w:hAnsi="Arial Unicode MS" w:eastAsia="Arial Unicode MS" w:cs="Arial Unicode MS"/>
+                <w:b/>
+                <w:color w:val="FFFFFF"/>
+                <w:sz w:val="21"/>
+              </w:rPr>
+              <w:t>当前证据</w:t>
+            </w:r>
+          </w:p>
+        </w:tc>
+        <w:tc>
+          <w:tcPr>
+            <w:tcW w:type="dxa" w:w="2016"/>
+            <w:vAlign w:val="center"/>
+            <w:shd w:fill="173650"/>
+            <w:tcMar>
+              <w:top w:w="90" w:type="dxa"/>
+              <w:bottom w:w="90" w:type="dxa"/>
+              <w:left w:w="100" w:type="dxa"/>
+              <w:right w:w="100" w:type="dxa"/>
+            </w:tcMar>
+          </w:tcPr>
+          <w:p>
+            <w:pPr>
+              <w:spacing w:after="0" w:line="269" w:lineRule="auto"/>
+            </w:pPr>
+            <w:r>
+              <w:rPr>
+                <w:rFonts w:ascii="Arial Unicode MS" w:hAnsi="Arial Unicode MS" w:eastAsia="Arial Unicode MS" w:cs="Arial Unicode MS"/>
+                <w:b/>
+                <w:color w:val="FFFFFF"/>
+                <w:sz w:val="21"/>
+              </w:rPr>
+              <w:t>剩余验收</w:t>
+            </w:r>
+          </w:p>
+        </w:tc>
+      </w:tr>
+      <w:tr>
+        <w:trPr>
+          <w:cantSplit/>
+        </w:trPr>
+        <w:tc>
+          <w:tcPr>
+            <w:tcW w:type="dxa" w:w="1613"/>
+            <w:vAlign w:val="center"/>
+            <w:shd w:fill="FFFFFF"/>
+            <w:tcMar>
+              <w:top w:w="90" w:type="dxa"/>
+              <w:bottom w:w="90" w:type="dxa"/>
+              <w:left w:w="100" w:type="dxa"/>
+              <w:right w:w="100" w:type="dxa"/>
+            </w:tcMar>
+          </w:tcPr>
+          <w:p>
+            <w:pPr>
+              <w:spacing w:after="0" w:line="269" w:lineRule="auto"/>
+            </w:pPr>
+            <w:r>
+              <w:rPr>
+                <w:rFonts w:ascii="Arial Unicode MS" w:hAnsi="Arial Unicode MS" w:eastAsia="Arial Unicode MS" w:cs="Arial Unicode MS"/>
+                <w:color w:val="000000"/>
+                <w:sz w:val="21"/>
+              </w:rPr>
+              <w:t>DP17 互动计数幂等与并发一致性</w:t>
+            </w:r>
+          </w:p>
+        </w:tc>
+        <w:tc>
+          <w:tcPr>
+            <w:tcW w:type="dxa" w:w="2822"/>
+            <w:vAlign w:val="center"/>
+            <w:shd w:fill="FFFFFF"/>
+            <w:tcMar>
+              <w:top w:w="90" w:type="dxa"/>
+              <w:bottom w:w="90" w:type="dxa"/>
+              <w:left w:w="100" w:type="dxa"/>
+              <w:right w:w="100" w:type="dxa"/>
+            </w:tcMar>
+          </w:tcPr>
+          <w:p>
+            <w:pPr>
+              <w:spacing w:after="0" w:line="269" w:lineRule="auto"/>
+            </w:pPr>
+            <w:r>
+              <w:rPr>
+                <w:rFonts w:ascii="Arial Unicode MS" w:hAnsi="Arial Unicode MS" w:eastAsia="Arial Unicode MS" w:cs="Arial Unicode MS"/>
+                <w:color w:val="000000"/>
+                <w:sz w:val="21"/>
+              </w:rPr>
+              <w:t>验证中</w:t>
+            </w:r>
+          </w:p>
+        </w:tc>
+        <w:tc>
+          <w:tcPr>
+            <w:tcW w:type="dxa" w:w="3629"/>
+            <w:vAlign w:val="center"/>
+            <w:shd w:fill="FFFFFF"/>
+            <w:tcMar>
+              <w:top w:w="90" w:type="dxa"/>
+              <w:bottom w:w="90" w:type="dxa"/>
+              <w:left w:w="100" w:type="dxa"/>
+              <w:right w:w="100" w:type="dxa"/>
+            </w:tcMar>
+          </w:tcPr>
+          <w:p>
+            <w:pPr>
+              <w:spacing w:after="0" w:line="269" w:lineRule="auto"/>
+            </w:pPr>
+            <w:r>
+              <w:rPr>
+                <w:rFonts w:ascii="Arial Unicode MS" w:hAnsi="Arial Unicode MS" w:eastAsia="Arial Unicode MS" w:cs="Arial Unicode MS"/>
+                <w:color w:val="000000"/>
+                <w:sz w:val="21"/>
+              </w:rPr>
+              <w:t xml:space="preserve">2026-10-22 最终 V21 独立 MySQL fixture </w:t>
+            </w:r>
+            <w:r>
+              <w:rPr>
+                <w:rFonts w:ascii="Arial Unicode MS" w:hAnsi="Arial Unicode MS" w:eastAsia="Arial Unicode MS" w:cs="Arial Unicode MS"/>
+                <w:color w:val="000000"/>
+                <w:sz w:val="21"/>
+              </w:rPr>
+              <w:t>9aa2f8bb82891860</w:t>
+            </w:r>
+            <w:r>
+              <w:rPr>
+                <w:rFonts w:ascii="Arial Unicode MS" w:hAnsi="Arial Unicode MS" w:eastAsia="Arial Unicode MS" w:cs="Arial Unicode MS"/>
+                <w:color w:val="000000"/>
+                <w:sz w:val="21"/>
+              </w:rPr>
+              <w:t xml:space="preserve"> 的 25 项集成测试通过；</w:t>
+            </w:r>
+            <w:r>
+              <w:rPr>
+                <w:rFonts w:ascii="Arial Unicode MS" w:hAnsi="Arial Unicode MS" w:eastAsia="Arial Unicode MS" w:cs="Arial Unicode MS"/>
+                <w:color w:val="000000"/>
+                <w:sz w:val="21"/>
+              </w:rPr>
+              <w:t>PostControllerTest</w:t>
+            </w:r>
+            <w:r>
+              <w:rPr>
+                <w:rFonts w:ascii="Arial Unicode MS" w:hAnsi="Arial Unicode MS" w:eastAsia="Arial Unicode MS" w:cs="Arial Unicode MS"/>
+                <w:color w:val="000000"/>
+                <w:sz w:val="21"/>
+              </w:rPr>
+              <w:t xml:space="preserve"> 覆盖评论与分享的 HTTP header 绑定；Core 93 项通过</w:t>
+            </w:r>
+          </w:p>
+        </w:tc>
+        <w:tc>
+          <w:tcPr>
+            <w:tcW w:type="dxa" w:w="2016"/>
+            <w:vAlign w:val="center"/>
+            <w:shd w:fill="FFFFFF"/>
+            <w:tcMar>
+              <w:top w:w="90" w:type="dxa"/>
+              <w:bottom w:w="90" w:type="dxa"/>
+              <w:left w:w="100" w:type="dxa"/>
+              <w:right w:w="100" w:type="dxa"/>
+            </w:tcMar>
+          </w:tcPr>
+          <w:p>
+            <w:pPr>
+              <w:spacing w:after="0" w:line="269" w:lineRule="auto"/>
+            </w:pPr>
+            <w:r>
+              <w:rPr>
+                <w:rFonts w:ascii="Arial Unicode MS" w:hAnsi="Arial Unicode MS" w:eastAsia="Arial Unicode MS" w:cs="Arial Unicode MS"/>
+                <w:color w:val="000000"/>
+                <w:sz w:val="21"/>
+              </w:rPr>
+              <w:t>热帖行锁的等待与吞吐列入 DP23；帖子下架后的幂等重放边界已记入 API，不把正确性测试当作容量证明</w:t>
+            </w:r>
+          </w:p>
+        </w:tc>
+      </w:tr>
+    </w:tbl>
+    <w:p>
+      <w:pPr>
+        <w:spacing w:after="40" w:line="84" w:lineRule="auto"/>
+      </w:pPr>
+      <w:r>
+        <w:rPr>
+          <w:sz w:val="6"/>
+        </w:rPr>
       </w:r>
     </w:p>
     <w:p>

</xml_diff>

<commit_message>
fix(social): serialize relationships and verify message visibility
</commit_message>
<xml_diff>
--- a/docs/UniPO-开发规划书-v1.0.docx
+++ b/docs/UniPO-开发规划书-v1.0.docx
@@ -4189,7 +4189,7 @@
           <w:rFonts w:ascii="Arial Unicode MS" w:hAnsi="Arial Unicode MS" w:eastAsia="Arial Unicode MS" w:cs="Arial Unicode MS"/>
           <w:color w:val="000000"/>
         </w:rPr>
-        <w:t>以上是数据设计输入，字段名与拆表方式需实施时评审。先检查已有结构，避免新建平行模型。Flyway 当前已有 V21，下一迁移从 V22 起；不修改已发布迁移。</w:t>
+        <w:t>以上是数据设计输入，字段名与拆表方式需实施时评审。先检查已有结构，避免新建平行模型。Flyway 当前已有 V22，下一迁移从 V23 起；不修改已发布迁移。V22 增加用户对关系锁，不代表 Outbox 已落地。</w:t>
       </w:r>
     </w:p>
     <w:p>
@@ -8661,39 +8661,7 @@
                 <w:color w:val="000000"/>
                 <w:sz w:val="21"/>
               </w:rPr>
-              <w:t xml:space="preserve">2026-10-22 最终 V21 独立 MySQL fixture </w:t>
-            </w:r>
-            <w:r>
-              <w:rPr>
-                <w:rFonts w:ascii="Arial Unicode MS" w:hAnsi="Arial Unicode MS" w:eastAsia="Arial Unicode MS" w:cs="Arial Unicode MS"/>
-                <w:color w:val="000000"/>
-                <w:sz w:val="21"/>
-              </w:rPr>
-              <w:t>9aa2f8bb82891860</w:t>
-            </w:r>
-            <w:r>
-              <w:rPr>
-                <w:rFonts w:ascii="Arial Unicode MS" w:hAnsi="Arial Unicode MS" w:eastAsia="Arial Unicode MS" w:cs="Arial Unicode MS"/>
-                <w:color w:val="000000"/>
-                <w:sz w:val="21"/>
-              </w:rPr>
-              <w:t xml:space="preserve"> 的 25 项集成测试通过；</w:t>
-            </w:r>
-            <w:r>
-              <w:rPr>
-                <w:rFonts w:ascii="Arial Unicode MS" w:hAnsi="Arial Unicode MS" w:eastAsia="Arial Unicode MS" w:cs="Arial Unicode MS"/>
-                <w:color w:val="000000"/>
-                <w:sz w:val="21"/>
-              </w:rPr>
-              <w:t>PostControllerTest</w:t>
-            </w:r>
-            <w:r>
-              <w:rPr>
-                <w:rFonts w:ascii="Arial Unicode MS" w:hAnsi="Arial Unicode MS" w:eastAsia="Arial Unicode MS" w:cs="Arial Unicode MS"/>
-                <w:color w:val="000000"/>
-                <w:sz w:val="21"/>
-              </w:rPr>
-              <w:t xml:space="preserve"> 覆盖评论与分享的 HTTP header 绑定；Core 93 项通过</w:t>
+              <w:t>隔离 MySQL V1 至 V22 的互动与社交专项已实跑；计数、经验和幂等结果见 DP02 与 DP03 验收记录</w:t>
             </w:r>
           </w:p>
         </w:tc>
@@ -8719,7 +8687,225 @@
                 <w:color w:val="000000"/>
                 <w:sz w:val="21"/>
               </w:rPr>
-              <w:t>热帖行锁的等待与吞吐列入 DP23；帖子下架后的幂等重放边界已记入 API，不把正确性测试当作容量证明</w:t>
+              <w:t>热帖锁等待与吞吐由 DP23 验证；正确性结果不代表容量</w:t>
+            </w:r>
+          </w:p>
+        </w:tc>
+      </w:tr>
+      <w:tr>
+        <w:trPr>
+          <w:cantSplit/>
+        </w:trPr>
+        <w:tc>
+          <w:tcPr>
+            <w:tcW w:type="dxa" w:w="1613"/>
+            <w:vAlign w:val="center"/>
+            <w:shd w:fill="F3F6F9"/>
+            <w:tcMar>
+              <w:top w:w="90" w:type="dxa"/>
+              <w:bottom w:w="90" w:type="dxa"/>
+              <w:left w:w="100" w:type="dxa"/>
+              <w:right w:w="100" w:type="dxa"/>
+            </w:tcMar>
+          </w:tcPr>
+          <w:p>
+            <w:pPr>
+              <w:spacing w:after="0" w:line="269" w:lineRule="auto"/>
+            </w:pPr>
+            <w:r>
+              <w:rPr>
+                <w:rFonts w:ascii="Arial Unicode MS" w:hAnsi="Arial Unicode MS" w:eastAsia="Arial Unicode MS" w:cs="Arial Unicode MS"/>
+                <w:color w:val="000000"/>
+                <w:sz w:val="21"/>
+              </w:rPr>
+              <w:t>DP03 拉黑在服务端生效与 iOS 呈现</w:t>
+            </w:r>
+          </w:p>
+        </w:tc>
+        <w:tc>
+          <w:tcPr>
+            <w:tcW w:type="dxa" w:w="2822"/>
+            <w:vAlign w:val="center"/>
+            <w:shd w:fill="F3F6F9"/>
+            <w:tcMar>
+              <w:top w:w="90" w:type="dxa"/>
+              <w:bottom w:w="90" w:type="dxa"/>
+              <w:left w:w="100" w:type="dxa"/>
+              <w:right w:w="100" w:type="dxa"/>
+            </w:tcMar>
+          </w:tcPr>
+          <w:p>
+            <w:pPr>
+              <w:spacing w:after="0" w:line="269" w:lineRule="auto"/>
+            </w:pPr>
+            <w:r>
+              <w:rPr>
+                <w:rFonts w:ascii="Arial Unicode MS" w:hAnsi="Arial Unicode MS" w:eastAsia="Arial Unicode MS" w:cs="Arial Unicode MS"/>
+                <w:color w:val="000000"/>
+                <w:sz w:val="21"/>
+              </w:rPr>
+              <w:t>验证中</w:t>
+            </w:r>
+          </w:p>
+        </w:tc>
+        <w:tc>
+          <w:tcPr>
+            <w:tcW w:type="dxa" w:w="3629"/>
+            <w:vAlign w:val="center"/>
+            <w:shd w:fill="F3F6F9"/>
+            <w:tcMar>
+              <w:top w:w="90" w:type="dxa"/>
+              <w:bottom w:w="90" w:type="dxa"/>
+              <w:left w:w="100" w:type="dxa"/>
+              <w:right w:w="100" w:type="dxa"/>
+            </w:tcMar>
+          </w:tcPr>
+          <w:p>
+            <w:pPr>
+              <w:spacing w:after="0" w:line="269" w:lineRule="auto"/>
+            </w:pPr>
+            <w:r>
+              <w:rPr>
+                <w:rFonts w:ascii="Arial Unicode MS" w:hAnsi="Arial Unicode MS" w:eastAsia="Arial Unicode MS" w:cs="Arial Unicode MS"/>
+                <w:color w:val="000000"/>
+                <w:sz w:val="21"/>
+              </w:rPr>
+              <w:t>已接服务端双向过滤、iOS 拉黑入口与 V22 用户对锁；真实 MySQL 社交链路及 Redis replay 已有通过记录，继续补并发复验</w:t>
+            </w:r>
+          </w:p>
+        </w:tc>
+        <w:tc>
+          <w:tcPr>
+            <w:tcW w:type="dxa" w:w="2016"/>
+            <w:vAlign w:val="center"/>
+            <w:shd w:fill="F3F6F9"/>
+            <w:tcMar>
+              <w:top w:w="90" w:type="dxa"/>
+              <w:bottom w:w="90" w:type="dxa"/>
+              <w:left w:w="100" w:type="dxa"/>
+              <w:right w:w="100" w:type="dxa"/>
+            </w:tcMar>
+          </w:tcPr>
+          <w:p>
+            <w:pPr>
+              <w:spacing w:after="0" w:line="269" w:lineRule="auto"/>
+            </w:pPr>
+            <w:r>
+              <w:rPr>
+                <w:rFonts w:ascii="Arial Unicode MS" w:hAnsi="Arial Unicode MS" w:eastAsia="Arial Unicode MS" w:cs="Arial Unicode MS"/>
+                <w:color w:val="000000"/>
+                <w:sz w:val="21"/>
+              </w:rPr>
+              <w:t>最新代码专项结果和登录后 UI 验收按 DP03 记录逐项关闭</w:t>
+            </w:r>
+          </w:p>
+        </w:tc>
+      </w:tr>
+      <w:tr>
+        <w:trPr>
+          <w:cantSplit/>
+        </w:trPr>
+        <w:tc>
+          <w:tcPr>
+            <w:tcW w:type="dxa" w:w="1613"/>
+            <w:vAlign w:val="center"/>
+            <w:shd w:fill="FFFFFF"/>
+            <w:tcMar>
+              <w:top w:w="90" w:type="dxa"/>
+              <w:bottom w:w="90" w:type="dxa"/>
+              <w:left w:w="100" w:type="dxa"/>
+              <w:right w:w="100" w:type="dxa"/>
+            </w:tcMar>
+          </w:tcPr>
+          <w:p>
+            <w:pPr>
+              <w:spacing w:after="0" w:line="269" w:lineRule="auto"/>
+            </w:pPr>
+            <w:r>
+              <w:rPr>
+                <w:rFonts w:ascii="Arial Unicode MS" w:hAnsi="Arial Unicode MS" w:eastAsia="Arial Unicode MS" w:cs="Arial Unicode MS"/>
+                <w:color w:val="000000"/>
+                <w:sz w:val="21"/>
+              </w:rPr>
+              <w:t>DP14 Outbox 与事务后通知</w:t>
+            </w:r>
+          </w:p>
+        </w:tc>
+        <w:tc>
+          <w:tcPr>
+            <w:tcW w:type="dxa" w:w="2822"/>
+            <w:vAlign w:val="center"/>
+            <w:shd w:fill="FFFFFF"/>
+            <w:tcMar>
+              <w:top w:w="90" w:type="dxa"/>
+              <w:bottom w:w="90" w:type="dxa"/>
+              <w:left w:w="100" w:type="dxa"/>
+              <w:right w:w="100" w:type="dxa"/>
+            </w:tcMar>
+          </w:tcPr>
+          <w:p>
+            <w:pPr>
+              <w:spacing w:after="0" w:line="269" w:lineRule="auto"/>
+            </w:pPr>
+            <w:r>
+              <w:rPr>
+                <w:rFonts w:ascii="Arial Unicode MS" w:hAnsi="Arial Unicode MS" w:eastAsia="Arial Unicode MS" w:cs="Arial Unicode MS"/>
+                <w:color w:val="000000"/>
+                <w:sz w:val="21"/>
+              </w:rPr>
+              <w:t>实现中</w:t>
+            </w:r>
+          </w:p>
+        </w:tc>
+        <w:tc>
+          <w:tcPr>
+            <w:tcW w:type="dxa" w:w="3629"/>
+            <w:vAlign w:val="center"/>
+            <w:shd w:fill="FFFFFF"/>
+            <w:tcMar>
+              <w:top w:w="90" w:type="dxa"/>
+              <w:bottom w:w="90" w:type="dxa"/>
+              <w:left w:w="100" w:type="dxa"/>
+              <w:right w:w="100" w:type="dxa"/>
+            </w:tcMar>
+          </w:tcPr>
+          <w:p>
+            <w:pPr>
+              <w:spacing w:after="0" w:line="269" w:lineRule="auto"/>
+            </w:pPr>
+            <w:r>
+              <w:rPr>
+                <w:rFonts w:ascii="Arial Unicode MS" w:hAnsi="Arial Unicode MS" w:eastAsia="Arial Unicode MS" w:cs="Arial Unicode MS"/>
+                <w:color w:val="000000"/>
+                <w:sz w:val="21"/>
+              </w:rPr>
+              <w:t>私信 WebSocket 与 APNs 已改到数据库提交后，回滚不通知有测试</w:t>
+            </w:r>
+          </w:p>
+        </w:tc>
+        <w:tc>
+          <w:tcPr>
+            <w:tcW w:type="dxa" w:w="2016"/>
+            <w:vAlign w:val="center"/>
+            <w:shd w:fill="FFFFFF"/>
+            <w:tcMar>
+              <w:top w:w="90" w:type="dxa"/>
+              <w:bottom w:w="90" w:type="dxa"/>
+              <w:left w:w="100" w:type="dxa"/>
+              <w:right w:w="100" w:type="dxa"/>
+            </w:tcMar>
+          </w:tcPr>
+          <w:p>
+            <w:pPr>
+              <w:spacing w:after="0" w:line="269" w:lineRule="auto"/>
+            </w:pPr>
+            <w:r>
+              <w:rPr>
+                <w:rFonts w:ascii="Arial Unicode MS" w:hAnsi="Arial Unicode MS" w:eastAsia="Arial Unicode MS" w:cs="Arial Unicode MS"/>
+                <w:color w:val="000000"/>
+                <w:sz w:val="21"/>
+              </w:rPr>
+              <w:t>仍需持久 Outbox、失败重试、多实例去重与提交后进程退出恢复</w:t>
             </w:r>
           </w:p>
         </w:tc>
@@ -8733,6 +8919,60 @@
         <w:rPr>
           <w:sz w:val="6"/>
         </w:rPr>
+      </w:r>
+    </w:p>
+    <w:p>
+      <w:r>
+        <w:rPr>
+          <w:rFonts w:ascii="Arial Unicode MS" w:hAnsi="Arial Unicode MS" w:eastAsia="Arial Unicode MS" w:cs="Arial Unicode MS"/>
+          <w:color w:val="000000"/>
+        </w:rPr>
+        <w:t xml:space="preserve">2026 年 10 月 22 日，DP03 的详细证据、并发边界和未验项目集中维护在 </w:t>
+      </w:r>
+      <w:r>
+        <w:rPr>
+          <w:rFonts w:ascii="Arial Unicode MS" w:hAnsi="Arial Unicode MS" w:eastAsia="Arial Unicode MS" w:cs="Arial Unicode MS"/>
+          <w:color w:val="000000"/>
+        </w:rPr>
+        <w:t>DP03 验收记录</w:t>
+      </w:r>
+      <w:r>
+        <w:t>（DP03-VERIFICATION.md）</w:t>
+      </w:r>
+      <w:r>
+        <w:rPr>
+          <w:rFonts w:ascii="Arial Unicode MS" w:hAnsi="Arial Unicode MS" w:eastAsia="Arial Unicode MS" w:cs="Arial Unicode MS"/>
+          <w:color w:val="000000"/>
+        </w:rPr>
+        <w:t xml:space="preserve">。已通过的 MySQL run </w:t>
+      </w:r>
+      <w:r>
+        <w:rPr>
+          <w:rFonts w:ascii="Arial Unicode MS" w:hAnsi="Arial Unicode MS" w:eastAsia="Arial Unicode MS" w:cs="Arial Unicode MS"/>
+          <w:color w:val="000000"/>
+        </w:rPr>
+        <w:t>5288fa910c5c1e7f</w:t>
+      </w:r>
+      <w:r>
+        <w:rPr>
+          <w:rFonts w:ascii="Arial Unicode MS" w:hAnsi="Arial Unicode MS" w:eastAsia="Arial Unicode MS" w:cs="Arial Unicode MS"/>
+          <w:color w:val="000000"/>
+        </w:rPr>
+        <w:t xml:space="preserve"> 为 29 项，Redis run </w:t>
+      </w:r>
+      <w:r>
+        <w:rPr>
+          <w:rFonts w:ascii="Arial Unicode MS" w:hAnsi="Arial Unicode MS" w:eastAsia="Arial Unicode MS" w:cs="Arial Unicode MS"/>
+          <w:color w:val="000000"/>
+        </w:rPr>
+        <w:t>c555026108bf06b0</w:t>
+      </w:r>
+      <w:r>
+        <w:rPr>
+          <w:rFonts w:ascii="Arial Unicode MS" w:hAnsi="Arial Unicode MS" w:eastAsia="Arial Unicode MS" w:cs="Arial Unicode MS"/>
+          <w:color w:val="000000"/>
+        </w:rPr>
+        <w:t xml:space="preserve"> 为会话 2 项与 replay 1 项，均零跳过。后续修改必须以记录中的最终复验为准。此前模拟器访客页不构成登录后验收，既有服务器 test 和生产实例也尚未包含本轮改动。</w:t>
       </w:r>
     </w:p>
     <w:p>
@@ -10857,7 +11097,7 @@
           <w:rFonts w:ascii="Arial Unicode MS" w:hAnsi="Arial Unicode MS" w:eastAsia="Arial Unicode MS" w:cs="Arial Unicode MS"/>
           <w:color w:val="000000"/>
         </w:rPr>
-        <w:t>后端覆盖规则、边界与幂等单测，以及真实 MySQL/Redis 的会话、事务、分页、并发、治理工具与迁移集成测试。iOS 使用编译、模型/状态测试、UI 冒烟、真机和最低系统验证。目前没有 iOS XCTest target 和 CI 构建 job，应在 DP21 补齐，不把现有 CI 绿解释为 iOS 已验证。上传和文件本地处理单独验证；本期不新增网页 E2E 或响应式测试。</w:t>
+        <w:t>后端覆盖规则、边界与幂等单测，以及真实 MySQL/Redis 的会话、事务、分页、并发、治理工具与迁移集成测试。iOS 使用编译、模型/状态测试、UI 冒烟、真机和最低系统验证。现已补 hosted XCTest 验证模拟器 Keychain；iOS CI、核心 UI 自动化与最低系统覆盖仍由 DP21 补齐。上传和文件本地处理单独验证；本期不新增网页 E2E 或响应式测试。</w:t>
       </w:r>
     </w:p>
     <w:p>

</xml_diff>

<commit_message>
feat(message): persist delivery intents and resume per-device push progress
</commit_message>
<xml_diff>
--- a/docs/UniPO-开发规划书-v1.0.docx
+++ b/docs/UniPO-开发规划书-v1.0.docx
@@ -4189,7 +4189,7 @@
           <w:rFonts w:ascii="Arial Unicode MS" w:hAnsi="Arial Unicode MS" w:eastAsia="Arial Unicode MS" w:cs="Arial Unicode MS"/>
           <w:color w:val="000000"/>
         </w:rPr>
-        <w:t>以上是数据设计输入，字段名与拆表方式需实施时评审。先检查已有结构，避免新建平行模型。Flyway 当前已有 V22，下一迁移从 V23 起；不修改已发布迁移。V22 增加用户对关系锁，不代表 Outbox 已落地。</w:t>
+        <w:t>以上是数据设计输入，字段名与拆表方式需实施时评审。先检查已有结构，避免新建平行模型。Flyway 当前已有 V24，下一迁移从 V25 起；不修改已发布迁移。V22 为用户对锁，V23 为消息 Outbox，V24 为分设备推送进度，部署情况与验收分别记录。</w:t>
       </w:r>
     </w:p>
     <w:p>
@@ -8853,7 +8853,7 @@
                 <w:color w:val="000000"/>
                 <w:sz w:val="21"/>
               </w:rPr>
-              <w:t>实现中</w:t>
+              <w:t>验证中</w:t>
             </w:r>
           </w:p>
         </w:tc>
@@ -8879,7 +8879,7 @@
                 <w:color w:val="000000"/>
                 <w:sz w:val="21"/>
               </w:rPr>
-              <w:t>私信 WebSocket 与 APNs 已改到数据库提交后，回滚不通知有测试</w:t>
+              <w:t>已实现持久任务、独立 worker、租约重领与分设备推送进度；最终 V24 的 Outbox 18 项、设备进度 11 项通过，详见 DP14 验收记录</w:t>
             </w:r>
           </w:p>
         </w:tc>
@@ -8905,7 +8905,7 @@
                 <w:color w:val="000000"/>
                 <w:sz w:val="21"/>
               </w:rPr>
-              <w:t>仍需持久 Outbox、失败重试、多实例去重与提交后进程退出恢复</w:t>
+              <w:t>受控失败重试工具、真实 APNs 与跨实例网络、部署后端到端验收</w:t>
             </w:r>
           </w:p>
         </w:tc>
@@ -8973,6 +8973,32 @@
           <w:color w:val="000000"/>
         </w:rPr>
         <w:t xml:space="preserve"> 为会话 2 项与 replay 1 项，均零跳过。后续修改必须以记录中的最终复验为准。此前模拟器访客页不构成登录后验收，既有服务器 test 和生产实例也尚未包含本轮改动。</w:t>
+      </w:r>
+    </w:p>
+    <w:p>
+      <w:r>
+        <w:rPr>
+          <w:rFonts w:ascii="Arial Unicode MS" w:hAnsi="Arial Unicode MS" w:eastAsia="Arial Unicode MS" w:cs="Arial Unicode MS"/>
+          <w:color w:val="000000"/>
+        </w:rPr>
+        <w:t xml:space="preserve">持久通知及分设备进度的实现、崩溃恢复和验证边界另见 </w:t>
+      </w:r>
+      <w:r>
+        <w:rPr>
+          <w:rFonts w:ascii="Arial Unicode MS" w:hAnsi="Arial Unicode MS" w:eastAsia="Arial Unicode MS" w:cs="Arial Unicode MS"/>
+          <w:color w:val="000000"/>
+        </w:rPr>
+        <w:t>DP14 验收记录</w:t>
+      </w:r>
+      <w:r>
+        <w:t>（DP14-VERIFICATION.md）</w:t>
+      </w:r>
+      <w:r>
+        <w:rPr>
+          <w:rFonts w:ascii="Arial Unicode MS" w:hAnsi="Arial Unicode MS" w:eastAsia="Arial Unicode MS" w:cs="Arial Unicode MS"/>
+          <w:color w:val="000000"/>
+        </w:rPr>
+        <w:t>。Outbox 的完成状态只说明对应通道的处理结束；它不构成用户设备已收到或已读回执。真实客户端仍通过消息 API 同步事实。</w:t>
       </w:r>
     </w:p>
     <w:p>

</xml_diff>

<commit_message>
feat(message): paginate conversations and make message sends retryable
- V25: sender-scoped client intent key, conversation activity and paging indexes
- Cursor endpoints for conversations, exact conversation read, history and afterId catch-up
- clientMessageId idempotent send; reuse with other content or conversation returns 409 STATE_CONFLICT
- ADMIN-only Outbox failure listing and audited retry, plus API-only ops CLI
- iOS paged MessagesStore with separate load/error states and explicit retry or discard
- Regenerate frontend OpenAPI types (also picks up the missed Idempotency-Key header)
- Development plan v1.2 with full work-package ledger; DP15 verification and small-task roadmap

Co-Authored-By: Claude Opus 5.5 <noreply@anthropic.com>
</commit_message>
<xml_diff>
--- a/docs/UniPO-开发规划书-v1.0.docx
+++ b/docs/UniPO-开发规划书-v1.0.docx
@@ -20,7 +20,7 @@
           <w:rFonts w:ascii="Arial Unicode MS" w:hAnsi="Arial Unicode MS" w:eastAsia="Arial Unicode MS" w:cs="Arial Unicode MS"/>
           <w:color w:val="000000"/>
         </w:rPr>
-        <w:t>版本：1.1　基线日期：2026 年 10 月 21 日　适用范围：iOS 单校试点版本至可复制版本</w:t>
+        <w:t>版本：1.2　基线日期：2026 年 10 月 21 日　更新日期：2026 年 10 月 23 日　适用范围：iOS 单校试点版本至可复制版本</w:t>
       </w:r>
     </w:p>
     <w:p>
@@ -472,6 +472,32 @@
       </w:r>
     </w:p>
     <w:p>
+      <w:r>
+        <w:rPr>
+          <w:rFonts w:ascii="Arial Unicode MS" w:hAnsi="Arial Unicode MS" w:eastAsia="Arial Unicode MS" w:cs="Arial Unicode MS"/>
+          <w:color w:val="000000"/>
+        </w:rPr>
+        <w:t xml:space="preserve">日常执行按 </w:t>
+      </w:r>
+      <w:r>
+        <w:rPr>
+          <w:rFonts w:ascii="Arial Unicode MS" w:hAnsi="Arial Unicode MS" w:eastAsia="Arial Unicode MS" w:cs="Arial Unicode MS"/>
+          <w:color w:val="000000"/>
+        </w:rPr>
+        <w:t>小任务路线图</w:t>
+      </w:r>
+      <w:r>
+        <w:t>（ROADMAP-SMALL-TASKS.md）</w:t>
+      </w:r>
+      <w:r>
+        <w:rPr>
+          <w:rFonts w:ascii="Arial Unicode MS" w:hAnsi="Arial Unicode MS" w:eastAsia="Arial Unicode MS" w:cs="Arial Unicode MS"/>
+          <w:color w:val="000000"/>
+        </w:rPr>
+        <w:t xml:space="preserve"> 一次领取一个编号，完成后留下证据再领取下一项。工作包状态仍以本文第 9.3 节为准，小任务编号与工作包的对应关系也记在该节；小任务完成不自动等于所属工作包完成。</w:t>
+      </w:r>
+    </w:p>
+    <w:p>
       <w:bookmarkStart w:id="2" w:name="chapter_2"/>
       <w:pPr>
         <w:pStyle w:val="Heading1"/>
@@ -544,6 +570,15 @@
       </w:r>
     </w:p>
     <w:p>
+      <w:r>
+        <w:rPr>
+          <w:rFonts w:ascii="Arial Unicode MS" w:hAnsi="Arial Unicode MS" w:eastAsia="Arial Unicode MS" w:cs="Arial Unicode MS"/>
+          <w:color w:val="000000"/>
+        </w:rPr>
+        <w:t>2026 年 10 月 22 日至 23 日，可靠性链路的源码与本机隔离验证先行推进：身份版本与设备会话撤销（DP02）、拉黑与用户对锁（DP03）、互动计数幂等（DP17）、消息 Outbox 与分设备推送进度（DP14）、消息游标分页、断线增量补齐、发送幂等与 iOS 显式重试（DP15）。这五个包均处于验证中：服务器 test 实例尚未部署 V25，登录后人工 UI、iOS 17、真机、真实 APNs 与容量均未验收。成长、治理、工具、发布和数据链路仍基本处于待开始。</w:t>
+      </w:r>
+    </w:p>
+    <w:p>
       <w:pPr>
         <w:pStyle w:val="Heading2"/>
       </w:pPr>
@@ -714,7 +749,7 @@
                 <w:color w:val="000000"/>
                 <w:sz w:val="21"/>
               </w:rPr>
-              <w:t>iOS 引导尚无学校与专业选择</w:t>
+              <w:t>iOS 三步引导收集昵称、性别、出生年、年级、星座、MBTI 与头像，仍无学校、专业与入学年份</w:t>
             </w:r>
           </w:p>
         </w:tc>
@@ -797,7 +832,7 @@
                 <w:color w:val="000000"/>
                 <w:sz w:val="21"/>
               </w:rPr>
-              <w:t>当前阶段依赖首个未完成阶段；首页有固定第 3 周与 42%</w:t>
+              <w:t>首页固定的第 3 周与 42% 已移除，改读成就接口并注明尚未按学校与专业定制；当前阶段仍取首个未完成阶段</w:t>
             </w:r>
           </w:p>
         </w:tc>
@@ -963,7 +998,7 @@
                 <w:color w:val="000000"/>
                 <w:sz w:val="21"/>
               </w:rPr>
-              <w:t>有入口，实际处理能力未接入</w:t>
+              <w:t>工具 Tab 列出 5 个工具，全部标注尚未开放，没有可用处理能力</w:t>
             </w:r>
           </w:p>
         </w:tc>
@@ -1046,7 +1081,7 @@
                 <w:color w:val="000000"/>
                 <w:sz w:val="21"/>
               </w:rPr>
-              <w:t>可提交举报，缺完整处置与申诉</w:t>
+              <w:t>后端可提交用户举报；iOS 尚无举报入口，缺处置、申诉与回执</w:t>
             </w:r>
           </w:p>
         </w:tc>
@@ -1129,7 +1164,7 @@
                 <w:color w:val="000000"/>
                 <w:sz w:val="21"/>
               </w:rPr>
-              <w:t>会话吊销、Redis 索引、事务投递和计数有风险待验证</w:t>
+              <w:t>身份撤销、拉黑串行、计数幂等、Outbox 与消息分页已有代码和本机隔离证据</w:t>
             </w:r>
           </w:p>
         </w:tc>
@@ -1155,7 +1190,7 @@
                 <w:color w:val="000000"/>
                 <w:sz w:val="21"/>
               </w:rPr>
-              <w:t>针对性复现、修复与真实依赖集成测试</w:t>
+              <w:t>部署 test 后复验，补跨网络、真实 APNs 与容量证据</w:t>
             </w:r>
           </w:p>
         </w:tc>
@@ -4189,7 +4224,7 @@
           <w:rFonts w:ascii="Arial Unicode MS" w:hAnsi="Arial Unicode MS" w:eastAsia="Arial Unicode MS" w:cs="Arial Unicode MS"/>
           <w:color w:val="000000"/>
         </w:rPr>
-        <w:t>以上是数据设计输入，字段名与拆表方式需实施时评审。先检查已有结构，避免新建平行模型。Flyway 当前已有 V24，下一迁移从 V25 起；不修改已发布迁移。V22 为用户对锁，V23 为消息 Outbox，V24 为分设备推送进度，部署情况与验收分别记录。</w:t>
+        <w:t>以上是数据设计输入，字段名与拆表方式需实施时评审。先检查已有结构，避免新建平行模型。Flyway 当前已有 V25，下一迁移从 V26 起；不修改已发布迁移。V22 为用户对锁，V23 为消息 Outbox，V24 为分设备推送进度，V25 为消息分页索引与发送意图唯一键，部署情况与验收分别记录。</w:t>
       </w:r>
     </w:p>
     <w:p>
@@ -4210,7 +4245,7 @@
           <w:rFonts w:ascii="Arial Unicode MS" w:hAnsi="Arial Unicode MS" w:eastAsia="Arial Unicode MS" w:cs="Arial Unicode MS"/>
           <w:color w:val="000000"/>
         </w:rPr>
-        <w:t>优先扩展现有用户资料与 Achievement API，提供当前阶段摘要、任务详情、完成及撤回、关联攻略、内容管理与举报处理接口。会话和消息提供游标端点。治理与数据接口供受控工具使用，不隐含网页工作台。新端点路径在契约评审时确定，本文不把候选设计描述为已上线接口。</w:t>
+        <w:t>优先扩展现有用户资料与 Achievement API，提供当前阶段摘要、任务详情、完成及撤回、关联攻略、内容管理与举报处理接口。会话和消息的游标端点、发送意图标识及 Outbox 失败查询与重试已在源码实现，接口见 API 第 5 节与 OUTBOX-OPERATIONS；部署到 test 前仍按未上线处理。治理与数据接口供受控工具使用，不隐含网页工作台。新端点路径在契约评审时确定，本文不把候选设计描述为已上线接口。</w:t>
       </w:r>
     </w:p>
     <w:p>
@@ -8448,6 +8483,32 @@
         <w:t>每个工作包记录目标、负责人、范围、依赖、当前状态、实施链接、测试证据、设计截图、运营说明、剩余风险与完成日期。验收失败回到进行中，不只根据代码合入标为完成。状态可用待开始、规格中、实现中、验证中、阻塞、完成。</w:t>
       </w:r>
     </w:p>
+    <w:p>
+      <w:r>
+        <w:rPr>
+          <w:rFonts w:ascii="Arial Unicode MS" w:hAnsi="Arial Unicode MS" w:eastAsia="Arial Unicode MS" w:cs="Arial Unicode MS"/>
+          <w:color w:val="000000"/>
+        </w:rPr>
+        <w:t xml:space="preserve">下表为 2026 年 10 月 23 日全部 22 个活动工作包的状态。“下一小任务”对应 </w:t>
+      </w:r>
+      <w:r>
+        <w:rPr>
+          <w:rFonts w:ascii="Arial Unicode MS" w:hAnsi="Arial Unicode MS" w:eastAsia="Arial Unicode MS" w:cs="Arial Unicode MS"/>
+          <w:color w:val="000000"/>
+        </w:rPr>
+        <w:t>小任务路线图</w:t>
+      </w:r>
+      <w:r>
+        <w:t>（ROADMAP-SMALL-TASKS.md）</w:t>
+      </w:r>
+      <w:r>
+        <w:rPr>
+          <w:rFonts w:ascii="Arial Unicode MS" w:hAnsi="Arial Unicode MS" w:eastAsia="Arial Unicode MS" w:cs="Arial Unicode MS"/>
+          <w:color w:val="000000"/>
+        </w:rPr>
+        <w:t xml:space="preserve"> 的编号；没有对应编号的项目在领取前先补进路线图。</w:t>
+      </w:r>
+    </w:p>
     <w:tbl>
       <w:tblPr>
         <w:tblW w:type="auto" w:w="0"/>
@@ -8551,7 +8612,7 @@
                 <w:color w:val="FFFFFF"/>
                 <w:sz w:val="21"/>
               </w:rPr>
-              <w:t>当前证据</w:t>
+              <w:t>当前证据或基线事实</w:t>
             </w:r>
           </w:p>
         </w:tc>
@@ -8578,7 +8639,7 @@
                 <w:color w:val="FFFFFF"/>
                 <w:sz w:val="21"/>
               </w:rPr>
-              <w:t>剩余验收</w:t>
+              <w:t>剩余验收与下一小任务</w:t>
             </w:r>
           </w:p>
         </w:tc>
@@ -8609,7 +8670,7 @@
                 <w:color w:val="000000"/>
                 <w:sz w:val="21"/>
               </w:rPr>
-              <w:t>DP17 互动计数幂等与并发一致性</w:t>
+              <w:t>DP01 基线复现与契约确认</w:t>
             </w:r>
           </w:p>
         </w:tc>
@@ -8635,7 +8696,7 @@
                 <w:color w:val="000000"/>
                 <w:sz w:val="21"/>
               </w:rPr>
-              <w:t>验证中</w:t>
+              <w:t>进行中</w:t>
             </w:r>
           </w:p>
         </w:tc>
@@ -8661,7 +8722,7 @@
                 <w:color w:val="000000"/>
                 <w:sz w:val="21"/>
               </w:rPr>
-              <w:t>隔离 MySQL V1 至 V22 的互动与社交专项已实跑；计数、经验和幂等结果见 DP02 与 DP03 验收记录</w:t>
+              <w:t>会话撤销、事务投递、计数并发等风险已由 DP02、DP03、DP14、DP17 复现并修复</w:t>
             </w:r>
           </w:p>
         </w:tc>
@@ -8687,7 +8748,7 @@
                 <w:color w:val="000000"/>
                 <w:sz w:val="21"/>
               </w:rPr>
-              <w:t>热帖锁等待与吞吐由 DP23 验证；正确性结果不代表容量</w:t>
+              <w:t>试点学校、成长契约、人力与预算未确认；G01</w:t>
             </w:r>
           </w:p>
         </w:tc>
@@ -8718,7 +8779,7 @@
                 <w:color w:val="000000"/>
                 <w:sz w:val="21"/>
               </w:rPr>
-              <w:t>DP03 拉黑在服务端生效与 iOS 呈现</w:t>
+              <w:t>DP02 身份失效与会话索引</w:t>
             </w:r>
           </w:p>
         </w:tc>
@@ -8770,7 +8831,7 @@
                 <w:color w:val="000000"/>
                 <w:sz w:val="21"/>
               </w:rPr>
-              <w:t>已接服务端双向过滤、iOS 拉黑入口与 V22 用户对锁；真实 MySQL 社交链路及 Redis replay 已有通过记录，继续补并发复验</w:t>
+              <w:t>HTTP/WS 主套 19 个场景、故障 3 个场景、冒烟 42 项、短信登录 20 项通过，见 DP02 记录</w:t>
             </w:r>
           </w:p>
         </w:tc>
@@ -8796,7 +8857,7 @@
                 <w:color w:val="000000"/>
                 <w:sz w:val="21"/>
               </w:rPr>
-              <w:t>最新代码专项结果和登录后 UI 验收按 DP03 记录逐项关闭</w:t>
+              <w:t>真实 UI 吊销、iOS 17、真机、部署与容量；M04</w:t>
             </w:r>
           </w:p>
         </w:tc>
@@ -8827,6 +8888,1096 @@
                 <w:color w:val="000000"/>
                 <w:sz w:val="21"/>
               </w:rPr>
+              <w:t>DP03 拉黑服务端生效与 iOS 呈现</w:t>
+            </w:r>
+          </w:p>
+        </w:tc>
+        <w:tc>
+          <w:tcPr>
+            <w:tcW w:type="dxa" w:w="2822"/>
+            <w:vAlign w:val="center"/>
+            <w:shd w:fill="FFFFFF"/>
+            <w:tcMar>
+              <w:top w:w="90" w:type="dxa"/>
+              <w:bottom w:w="90" w:type="dxa"/>
+              <w:left w:w="100" w:type="dxa"/>
+              <w:right w:w="100" w:type="dxa"/>
+            </w:tcMar>
+          </w:tcPr>
+          <w:p>
+            <w:pPr>
+              <w:spacing w:after="0" w:line="269" w:lineRule="auto"/>
+            </w:pPr>
+            <w:r>
+              <w:rPr>
+                <w:rFonts w:ascii="Arial Unicode MS" w:hAnsi="Arial Unicode MS" w:eastAsia="Arial Unicode MS" w:cs="Arial Unicode MS"/>
+                <w:color w:val="000000"/>
+                <w:sz w:val="21"/>
+              </w:rPr>
+              <w:t>验证中</w:t>
+            </w:r>
+          </w:p>
+        </w:tc>
+        <w:tc>
+          <w:tcPr>
+            <w:tcW w:type="dxa" w:w="3629"/>
+            <w:vAlign w:val="center"/>
+            <w:shd w:fill="FFFFFF"/>
+            <w:tcMar>
+              <w:top w:w="90" w:type="dxa"/>
+              <w:bottom w:w="90" w:type="dxa"/>
+              <w:left w:w="100" w:type="dxa"/>
+              <w:right w:w="100" w:type="dxa"/>
+            </w:tcMar>
+          </w:tcPr>
+          <w:p>
+            <w:pPr>
+              <w:spacing w:after="0" w:line="269" w:lineRule="auto"/>
+            </w:pPr>
+            <w:r>
+              <w:rPr>
+                <w:rFonts w:ascii="Arial Unicode MS" w:hAnsi="Arial Unicode MS" w:eastAsia="Arial Unicode MS" w:cs="Arial Unicode MS"/>
+                <w:color w:val="000000"/>
+                <w:sz w:val="21"/>
+              </w:rPr>
+              <w:t>服务端双向过滤、iOS 拉黑入口与 V22 用户对锁；MySQL 29 项、Redis 3 项零跳过</w:t>
+            </w:r>
+          </w:p>
+        </w:tc>
+        <w:tc>
+          <w:tcPr>
+            <w:tcW w:type="dxa" w:w="2016"/>
+            <w:vAlign w:val="center"/>
+            <w:shd w:fill="FFFFFF"/>
+            <w:tcMar>
+              <w:top w:w="90" w:type="dxa"/>
+              <w:bottom w:w="90" w:type="dxa"/>
+              <w:left w:w="100" w:type="dxa"/>
+              <w:right w:w="100" w:type="dxa"/>
+            </w:tcMar>
+          </w:tcPr>
+          <w:p>
+            <w:pPr>
+              <w:spacing w:after="0" w:line="269" w:lineRule="auto"/>
+            </w:pPr>
+            <w:r>
+              <w:rPr>
+                <w:rFonts w:ascii="Arial Unicode MS" w:hAnsi="Arial Unicode MS" w:eastAsia="Arial Unicode MS" w:cs="Arial Unicode MS"/>
+                <w:color w:val="000000"/>
+                <w:sz w:val="21"/>
+              </w:rPr>
+              <w:t>登录后 UI 与部署复验；M03</w:t>
+            </w:r>
+          </w:p>
+        </w:tc>
+      </w:tr>
+      <w:tr>
+        <w:trPr>
+          <w:cantSplit/>
+        </w:trPr>
+        <w:tc>
+          <w:tcPr>
+            <w:tcW w:type="dxa" w:w="1613"/>
+            <w:vAlign w:val="center"/>
+            <w:shd w:fill="F3F6F9"/>
+            <w:tcMar>
+              <w:top w:w="90" w:type="dxa"/>
+              <w:bottom w:w="90" w:type="dxa"/>
+              <w:left w:w="100" w:type="dxa"/>
+              <w:right w:w="100" w:type="dxa"/>
+            </w:tcMar>
+          </w:tcPr>
+          <w:p>
+            <w:pPr>
+              <w:spacing w:after="0" w:line="269" w:lineRule="auto"/>
+            </w:pPr>
+            <w:r>
+              <w:rPr>
+                <w:rFonts w:ascii="Arial Unicode MS" w:hAnsi="Arial Unicode MS" w:eastAsia="Arial Unicode MS" w:cs="Arial Unicode MS"/>
+                <w:color w:val="000000"/>
+                <w:sz w:val="21"/>
+              </w:rPr>
+              <w:t>DP04 治理、受控工具与申诉</w:t>
+            </w:r>
+          </w:p>
+        </w:tc>
+        <w:tc>
+          <w:tcPr>
+            <w:tcW w:type="dxa" w:w="2822"/>
+            <w:vAlign w:val="center"/>
+            <w:shd w:fill="F3F6F9"/>
+            <w:tcMar>
+              <w:top w:w="90" w:type="dxa"/>
+              <w:bottom w:w="90" w:type="dxa"/>
+              <w:left w:w="100" w:type="dxa"/>
+              <w:right w:w="100" w:type="dxa"/>
+            </w:tcMar>
+          </w:tcPr>
+          <w:p>
+            <w:pPr>
+              <w:spacing w:after="0" w:line="269" w:lineRule="auto"/>
+            </w:pPr>
+            <w:r>
+              <w:rPr>
+                <w:rFonts w:ascii="Arial Unicode MS" w:hAnsi="Arial Unicode MS" w:eastAsia="Arial Unicode MS" w:cs="Arial Unicode MS"/>
+                <w:color w:val="000000"/>
+                <w:sz w:val="21"/>
+              </w:rPr>
+              <w:t>待开始</w:t>
+            </w:r>
+          </w:p>
+        </w:tc>
+        <w:tc>
+          <w:tcPr>
+            <w:tcW w:type="dxa" w:w="3629"/>
+            <w:vAlign w:val="center"/>
+            <w:shd w:fill="F3F6F9"/>
+            <w:tcMar>
+              <w:top w:w="90" w:type="dxa"/>
+              <w:bottom w:w="90" w:type="dxa"/>
+              <w:left w:w="100" w:type="dxa"/>
+              <w:right w:w="100" w:type="dxa"/>
+            </w:tcMar>
+          </w:tcPr>
+          <w:p>
+            <w:pPr>
+              <w:spacing w:after="0" w:line="269" w:lineRule="auto"/>
+            </w:pPr>
+            <w:r>
+              <w:rPr>
+                <w:rFonts w:ascii="Arial Unicode MS" w:hAnsi="Arial Unicode MS" w:eastAsia="Arial Unicode MS" w:cs="Arial Unicode MS"/>
+                <w:color w:val="000000"/>
+                <w:sz w:val="21"/>
+              </w:rPr>
+              <w:t>后端只有用户举报提交；iOS 无举报入口，无处置、回执与申诉</w:t>
+            </w:r>
+          </w:p>
+        </w:tc>
+        <w:tc>
+          <w:tcPr>
+            <w:tcW w:type="dxa" w:w="2016"/>
+            <w:vAlign w:val="center"/>
+            <w:shd w:fill="F3F6F9"/>
+            <w:tcMar>
+              <w:top w:w="90" w:type="dxa"/>
+              <w:bottom w:w="90" w:type="dxa"/>
+              <w:left w:w="100" w:type="dxa"/>
+              <w:right w:w="100" w:type="dxa"/>
+            </w:tcMar>
+          </w:tcPr>
+          <w:p>
+            <w:pPr>
+              <w:spacing w:after="0" w:line="269" w:lineRule="auto"/>
+            </w:pPr>
+            <w:r>
+              <w:rPr>
+                <w:rFonts w:ascii="Arial Unicode MS" w:hAnsi="Arial Unicode MS" w:eastAsia="Arial Unicode MS" w:cs="Arial Unicode MS"/>
+                <w:color w:val="000000"/>
+                <w:sz w:val="21"/>
+              </w:rPr>
+              <w:t>O01、O02、O03</w:t>
+            </w:r>
+          </w:p>
+        </w:tc>
+      </w:tr>
+      <w:tr>
+        <w:trPr>
+          <w:cantSplit/>
+        </w:trPr>
+        <w:tc>
+          <w:tcPr>
+            <w:tcW w:type="dxa" w:w="1613"/>
+            <w:vAlign w:val="center"/>
+            <w:shd w:fill="FFFFFF"/>
+            <w:tcMar>
+              <w:top w:w="90" w:type="dxa"/>
+              <w:bottom w:w="90" w:type="dxa"/>
+              <w:left w:w="100" w:type="dxa"/>
+              <w:right w:w="100" w:type="dxa"/>
+            </w:tcMar>
+          </w:tcPr>
+          <w:p>
+            <w:pPr>
+              <w:spacing w:after="0" w:line="269" w:lineRule="auto"/>
+            </w:pPr>
+            <w:r>
+              <w:rPr>
+                <w:rFonts w:ascii="Arial Unicode MS" w:hAnsi="Arial Unicode MS" w:eastAsia="Arial Unicode MS" w:cs="Arial Unicode MS"/>
+                <w:color w:val="000000"/>
+                <w:sz w:val="21"/>
+              </w:rPr>
+              <w:t>DP05 协议、真实登录与 Release</w:t>
+            </w:r>
+          </w:p>
+        </w:tc>
+        <w:tc>
+          <w:tcPr>
+            <w:tcW w:type="dxa" w:w="2822"/>
+            <w:vAlign w:val="center"/>
+            <w:shd w:fill="FFFFFF"/>
+            <w:tcMar>
+              <w:top w:w="90" w:type="dxa"/>
+              <w:bottom w:w="90" w:type="dxa"/>
+              <w:left w:w="100" w:type="dxa"/>
+              <w:right w:w="100" w:type="dxa"/>
+            </w:tcMar>
+          </w:tcPr>
+          <w:p>
+            <w:pPr>
+              <w:spacing w:after="0" w:line="269" w:lineRule="auto"/>
+            </w:pPr>
+            <w:r>
+              <w:rPr>
+                <w:rFonts w:ascii="Arial Unicode MS" w:hAnsi="Arial Unicode MS" w:eastAsia="Arial Unicode MS" w:cs="Arial Unicode MS"/>
+                <w:color w:val="000000"/>
+                <w:sz w:val="21"/>
+              </w:rPr>
+              <w:t>进行中</w:t>
+            </w:r>
+          </w:p>
+        </w:tc>
+        <w:tc>
+          <w:tcPr>
+            <w:tcW w:type="dxa" w:w="3629"/>
+            <w:vAlign w:val="center"/>
+            <w:shd w:fill="FFFFFF"/>
+            <w:tcMar>
+              <w:top w:w="90" w:type="dxa"/>
+              <w:bottom w:w="90" w:type="dxa"/>
+              <w:left w:w="100" w:type="dxa"/>
+              <w:right w:w="100" w:type="dxa"/>
+            </w:tcMar>
+          </w:tcPr>
+          <w:p>
+            <w:pPr>
+              <w:spacing w:after="0" w:line="269" w:lineRule="auto"/>
+            </w:pPr>
+            <w:r>
+              <w:rPr>
+                <w:rFonts w:ascii="Arial Unicode MS" w:hAnsi="Arial Unicode MS" w:eastAsia="Arial Unicode MS" w:cs="Arial Unicode MS"/>
+                <w:color w:val="000000"/>
+                <w:sz w:val="21"/>
+              </w:rPr>
+              <w:t>协议默认未勾选，但用户协议与隐私政策正文仍显示暂不可用；Debug 经隧道连接独立 test 实例，任意验证码仅限测试实例</w:t>
+            </w:r>
+          </w:p>
+        </w:tc>
+        <w:tc>
+          <w:tcPr>
+            <w:tcW w:type="dxa" w:w="2016"/>
+            <w:vAlign w:val="center"/>
+            <w:shd w:fill="FFFFFF"/>
+            <w:tcMar>
+              <w:top w:w="90" w:type="dxa"/>
+              <w:bottom w:w="90" w:type="dxa"/>
+              <w:left w:w="100" w:type="dxa"/>
+              <w:right w:w="100" w:type="dxa"/>
+            </w:tcMar>
+          </w:tcPr>
+          <w:p>
+            <w:pPr>
+              <w:spacing w:after="0" w:line="269" w:lineRule="auto"/>
+            </w:pPr>
+            <w:r>
+              <w:rPr>
+                <w:rFonts w:ascii="Arial Unicode MS" w:hAnsi="Arial Unicode MS" w:eastAsia="Arial Unicode MS" w:cs="Arial Unicode MS"/>
+                <w:color w:val="000000"/>
+                <w:sz w:val="21"/>
+              </w:rPr>
+              <w:t>正式短信或替代通道、条款定稿、HTTPS；R01、R02</w:t>
+            </w:r>
+          </w:p>
+        </w:tc>
+      </w:tr>
+      <w:tr>
+        <w:trPr>
+          <w:cantSplit/>
+        </w:trPr>
+        <w:tc>
+          <w:tcPr>
+            <w:tcW w:type="dxa" w:w="1613"/>
+            <w:vAlign w:val="center"/>
+            <w:shd w:fill="F3F6F9"/>
+            <w:tcMar>
+              <w:top w:w="90" w:type="dxa"/>
+              <w:bottom w:w="90" w:type="dxa"/>
+              <w:left w:w="100" w:type="dxa"/>
+              <w:right w:w="100" w:type="dxa"/>
+            </w:tcMar>
+          </w:tcPr>
+          <w:p>
+            <w:pPr>
+              <w:spacing w:after="0" w:line="269" w:lineRule="auto"/>
+            </w:pPr>
+            <w:r>
+              <w:rPr>
+                <w:rFonts w:ascii="Arial Unicode MS" w:hAnsi="Arial Unicode MS" w:eastAsia="Arial Unicode MS" w:cs="Arial Unicode MS"/>
+                <w:color w:val="000000"/>
+                <w:sz w:val="21"/>
+              </w:rPr>
+              <w:t>DP06 备份恢复与最小告警</w:t>
+            </w:r>
+          </w:p>
+        </w:tc>
+        <w:tc>
+          <w:tcPr>
+            <w:tcW w:type="dxa" w:w="2822"/>
+            <w:vAlign w:val="center"/>
+            <w:shd w:fill="F3F6F9"/>
+            <w:tcMar>
+              <w:top w:w="90" w:type="dxa"/>
+              <w:bottom w:w="90" w:type="dxa"/>
+              <w:left w:w="100" w:type="dxa"/>
+              <w:right w:w="100" w:type="dxa"/>
+            </w:tcMar>
+          </w:tcPr>
+          <w:p>
+            <w:pPr>
+              <w:spacing w:after="0" w:line="269" w:lineRule="auto"/>
+            </w:pPr>
+            <w:r>
+              <w:rPr>
+                <w:rFonts w:ascii="Arial Unicode MS" w:hAnsi="Arial Unicode MS" w:eastAsia="Arial Unicode MS" w:cs="Arial Unicode MS"/>
+                <w:color w:val="000000"/>
+                <w:sz w:val="21"/>
+              </w:rPr>
+              <w:t>待开始</w:t>
+            </w:r>
+          </w:p>
+        </w:tc>
+        <w:tc>
+          <w:tcPr>
+            <w:tcW w:type="dxa" w:w="3629"/>
+            <w:vAlign w:val="center"/>
+            <w:shd w:fill="F3F6F9"/>
+            <w:tcMar>
+              <w:top w:w="90" w:type="dxa"/>
+              <w:bottom w:w="90" w:type="dxa"/>
+              <w:left w:w="100" w:type="dxa"/>
+              <w:right w:w="100" w:type="dxa"/>
+            </w:tcMar>
+          </w:tcPr>
+          <w:p>
+            <w:pPr>
+              <w:spacing w:after="0" w:line="269" w:lineRule="auto"/>
+            </w:pPr>
+            <w:r>
+              <w:rPr>
+                <w:rFonts w:ascii="Arial Unicode MS" w:hAnsi="Arial Unicode MS" w:eastAsia="Arial Unicode MS" w:cs="Arial Unicode MS"/>
+                <w:color w:val="000000"/>
+                <w:sz w:val="21"/>
+              </w:rPr>
+              <w:t>仅有一次部署前手工备份，无定时备份、恢复演练与告警</w:t>
+            </w:r>
+          </w:p>
+        </w:tc>
+        <w:tc>
+          <w:tcPr>
+            <w:tcW w:type="dxa" w:w="2016"/>
+            <w:vAlign w:val="center"/>
+            <w:shd w:fill="F3F6F9"/>
+            <w:tcMar>
+              <w:top w:w="90" w:type="dxa"/>
+              <w:bottom w:w="90" w:type="dxa"/>
+              <w:left w:w="100" w:type="dxa"/>
+              <w:right w:w="100" w:type="dxa"/>
+            </w:tcMar>
+          </w:tcPr>
+          <w:p>
+            <w:pPr>
+              <w:spacing w:after="0" w:line="269" w:lineRule="auto"/>
+            </w:pPr>
+            <w:r>
+              <w:rPr>
+                <w:rFonts w:ascii="Arial Unicode MS" w:hAnsi="Arial Unicode MS" w:eastAsia="Arial Unicode MS" w:cs="Arial Unicode MS"/>
+                <w:color w:val="000000"/>
+                <w:sz w:val="21"/>
+              </w:rPr>
+              <w:t>R03、R04、R05</w:t>
+            </w:r>
+          </w:p>
+        </w:tc>
+      </w:tr>
+      <w:tr>
+        <w:trPr>
+          <w:cantSplit/>
+        </w:trPr>
+        <w:tc>
+          <w:tcPr>
+            <w:tcW w:type="dxa" w:w="1613"/>
+            <w:vAlign w:val="center"/>
+            <w:shd w:fill="FFFFFF"/>
+            <w:tcMar>
+              <w:top w:w="90" w:type="dxa"/>
+              <w:bottom w:w="90" w:type="dxa"/>
+              <w:left w:w="100" w:type="dxa"/>
+              <w:right w:w="100" w:type="dxa"/>
+            </w:tcMar>
+          </w:tcPr>
+          <w:p>
+            <w:pPr>
+              <w:spacing w:after="0" w:line="269" w:lineRule="auto"/>
+            </w:pPr>
+            <w:r>
+              <w:rPr>
+                <w:rFonts w:ascii="Arial Unicode MS" w:hAnsi="Arial Unicode MS" w:eastAsia="Arial Unicode MS" w:cs="Arial Unicode MS"/>
+                <w:color w:val="000000"/>
+                <w:sz w:val="21"/>
+              </w:rPr>
+              <w:t>DP07 成长背景、校历与任务契约</w:t>
+            </w:r>
+          </w:p>
+        </w:tc>
+        <w:tc>
+          <w:tcPr>
+            <w:tcW w:type="dxa" w:w="2822"/>
+            <w:vAlign w:val="center"/>
+            <w:shd w:fill="FFFFFF"/>
+            <w:tcMar>
+              <w:top w:w="90" w:type="dxa"/>
+              <w:bottom w:w="90" w:type="dxa"/>
+              <w:left w:w="100" w:type="dxa"/>
+              <w:right w:w="100" w:type="dxa"/>
+            </w:tcMar>
+          </w:tcPr>
+          <w:p>
+            <w:pPr>
+              <w:spacing w:after="0" w:line="269" w:lineRule="auto"/>
+            </w:pPr>
+            <w:r>
+              <w:rPr>
+                <w:rFonts w:ascii="Arial Unicode MS" w:hAnsi="Arial Unicode MS" w:eastAsia="Arial Unicode MS" w:cs="Arial Unicode MS"/>
+                <w:color w:val="000000"/>
+                <w:sz w:val="21"/>
+              </w:rPr>
+              <w:t>待开始</w:t>
+            </w:r>
+          </w:p>
+        </w:tc>
+        <w:tc>
+          <w:tcPr>
+            <w:tcW w:type="dxa" w:w="3629"/>
+            <w:vAlign w:val="center"/>
+            <w:shd w:fill="FFFFFF"/>
+            <w:tcMar>
+              <w:top w:w="90" w:type="dxa"/>
+              <w:bottom w:w="90" w:type="dxa"/>
+              <w:left w:w="100" w:type="dxa"/>
+              <w:right w:w="100" w:type="dxa"/>
+            </w:tcMar>
+          </w:tcPr>
+          <w:p>
+            <w:pPr>
+              <w:spacing w:after="0" w:line="269" w:lineRule="auto"/>
+            </w:pPr>
+            <w:r>
+              <w:rPr>
+                <w:rFonts w:ascii="Arial Unicode MS" w:hAnsi="Arial Unicode MS" w:eastAsia="Arial Unicode MS" w:cs="Arial Unicode MS"/>
+                <w:color w:val="000000"/>
+                <w:sz w:val="21"/>
+              </w:rPr>
+              <w:t>成就接口只有一条通用主线，无校历、适用范围和来源字段</w:t>
+            </w:r>
+          </w:p>
+        </w:tc>
+        <w:tc>
+          <w:tcPr>
+            <w:tcW w:type="dxa" w:w="2016"/>
+            <w:vAlign w:val="center"/>
+            <w:shd w:fill="FFFFFF"/>
+            <w:tcMar>
+              <w:top w:w="90" w:type="dxa"/>
+              <w:bottom w:w="90" w:type="dxa"/>
+              <w:left w:w="100" w:type="dxa"/>
+              <w:right w:w="100" w:type="dxa"/>
+            </w:tcMar>
+          </w:tcPr>
+          <w:p>
+            <w:pPr>
+              <w:spacing w:after="0" w:line="269" w:lineRule="auto"/>
+            </w:pPr>
+            <w:r>
+              <w:rPr>
+                <w:rFonts w:ascii="Arial Unicode MS" w:hAnsi="Arial Unicode MS" w:eastAsia="Arial Unicode MS" w:cs="Arial Unicode MS"/>
+                <w:color w:val="000000"/>
+                <w:sz w:val="21"/>
+              </w:rPr>
+              <w:t>G01、G02</w:t>
+            </w:r>
+          </w:p>
+        </w:tc>
+      </w:tr>
+      <w:tr>
+        <w:trPr>
+          <w:cantSplit/>
+        </w:trPr>
+        <w:tc>
+          <w:tcPr>
+            <w:tcW w:type="dxa" w:w="1613"/>
+            <w:vAlign w:val="center"/>
+            <w:shd w:fill="F3F6F9"/>
+            <w:tcMar>
+              <w:top w:w="90" w:type="dxa"/>
+              <w:bottom w:w="90" w:type="dxa"/>
+              <w:left w:w="100" w:type="dxa"/>
+              <w:right w:w="100" w:type="dxa"/>
+            </w:tcMar>
+          </w:tcPr>
+          <w:p>
+            <w:pPr>
+              <w:spacing w:after="0" w:line="269" w:lineRule="auto"/>
+            </w:pPr>
+            <w:r>
+              <w:rPr>
+                <w:rFonts w:ascii="Arial Unicode MS" w:hAnsi="Arial Unicode MS" w:eastAsia="Arial Unicode MS" w:cs="Arial Unicode MS"/>
+                <w:color w:val="000000"/>
+                <w:sz w:val="21"/>
+              </w:rPr>
+              <w:t>DP08 iOS 成长引导与背景修正</w:t>
+            </w:r>
+          </w:p>
+        </w:tc>
+        <w:tc>
+          <w:tcPr>
+            <w:tcW w:type="dxa" w:w="2822"/>
+            <w:vAlign w:val="center"/>
+            <w:shd w:fill="F3F6F9"/>
+            <w:tcMar>
+              <w:top w:w="90" w:type="dxa"/>
+              <w:bottom w:w="90" w:type="dxa"/>
+              <w:left w:w="100" w:type="dxa"/>
+              <w:right w:w="100" w:type="dxa"/>
+            </w:tcMar>
+          </w:tcPr>
+          <w:p>
+            <w:pPr>
+              <w:spacing w:after="0" w:line="269" w:lineRule="auto"/>
+            </w:pPr>
+            <w:r>
+              <w:rPr>
+                <w:rFonts w:ascii="Arial Unicode MS" w:hAnsi="Arial Unicode MS" w:eastAsia="Arial Unicode MS" w:cs="Arial Unicode MS"/>
+                <w:color w:val="000000"/>
+                <w:sz w:val="21"/>
+              </w:rPr>
+              <w:t>待开始</w:t>
+            </w:r>
+          </w:p>
+        </w:tc>
+        <w:tc>
+          <w:tcPr>
+            <w:tcW w:type="dxa" w:w="3629"/>
+            <w:vAlign w:val="center"/>
+            <w:shd w:fill="F3F6F9"/>
+            <w:tcMar>
+              <w:top w:w="90" w:type="dxa"/>
+              <w:bottom w:w="90" w:type="dxa"/>
+              <w:left w:w="100" w:type="dxa"/>
+              <w:right w:w="100" w:type="dxa"/>
+            </w:tcMar>
+          </w:tcPr>
+          <w:p>
+            <w:pPr>
+              <w:spacing w:after="0" w:line="269" w:lineRule="auto"/>
+            </w:pPr>
+            <w:r>
+              <w:rPr>
+                <w:rFonts w:ascii="Arial Unicode MS" w:hAnsi="Arial Unicode MS" w:eastAsia="Arial Unicode MS" w:cs="Arial Unicode MS"/>
+                <w:color w:val="000000"/>
+                <w:sz w:val="21"/>
+              </w:rPr>
+              <w:t>引导无学校、专业与入学年份</w:t>
+            </w:r>
+          </w:p>
+        </w:tc>
+        <w:tc>
+          <w:tcPr>
+            <w:tcW w:type="dxa" w:w="2016"/>
+            <w:vAlign w:val="center"/>
+            <w:shd w:fill="F3F6F9"/>
+            <w:tcMar>
+              <w:top w:w="90" w:type="dxa"/>
+              <w:bottom w:w="90" w:type="dxa"/>
+              <w:left w:w="100" w:type="dxa"/>
+              <w:right w:w="100" w:type="dxa"/>
+            </w:tcMar>
+          </w:tcPr>
+          <w:p>
+            <w:pPr>
+              <w:spacing w:after="0" w:line="269" w:lineRule="auto"/>
+            </w:pPr>
+            <w:r>
+              <w:rPr>
+                <w:rFonts w:ascii="Arial Unicode MS" w:hAnsi="Arial Unicode MS" w:eastAsia="Arial Unicode MS" w:cs="Arial Unicode MS"/>
+                <w:color w:val="000000"/>
+                <w:sz w:val="21"/>
+              </w:rPr>
+              <w:t>G03</w:t>
+            </w:r>
+          </w:p>
+        </w:tc>
+      </w:tr>
+      <w:tr>
+        <w:trPr>
+          <w:cantSplit/>
+        </w:trPr>
+        <w:tc>
+          <w:tcPr>
+            <w:tcW w:type="dxa" w:w="1613"/>
+            <w:vAlign w:val="center"/>
+            <w:shd w:fill="FFFFFF"/>
+            <w:tcMar>
+              <w:top w:w="90" w:type="dxa"/>
+              <w:bottom w:w="90" w:type="dxa"/>
+              <w:left w:w="100" w:type="dxa"/>
+              <w:right w:w="100" w:type="dxa"/>
+            </w:tcMar>
+          </w:tcPr>
+          <w:p>
+            <w:pPr>
+              <w:spacing w:after="0" w:line="269" w:lineRule="auto"/>
+            </w:pPr>
+            <w:r>
+              <w:rPr>
+                <w:rFonts w:ascii="Arial Unicode MS" w:hAnsi="Arial Unicode MS" w:eastAsia="Arial Unicode MS" w:cs="Arial Unicode MS"/>
+                <w:color w:val="000000"/>
+                <w:sz w:val="21"/>
+              </w:rPr>
+              <w:t>DP09 动态阶段卡与请求状态</w:t>
+            </w:r>
+          </w:p>
+        </w:tc>
+        <w:tc>
+          <w:tcPr>
+            <w:tcW w:type="dxa" w:w="2822"/>
+            <w:vAlign w:val="center"/>
+            <w:shd w:fill="FFFFFF"/>
+            <w:tcMar>
+              <w:top w:w="90" w:type="dxa"/>
+              <w:bottom w:w="90" w:type="dxa"/>
+              <w:left w:w="100" w:type="dxa"/>
+              <w:right w:w="100" w:type="dxa"/>
+            </w:tcMar>
+          </w:tcPr>
+          <w:p>
+            <w:pPr>
+              <w:spacing w:after="0" w:line="269" w:lineRule="auto"/>
+            </w:pPr>
+            <w:r>
+              <w:rPr>
+                <w:rFonts w:ascii="Arial Unicode MS" w:hAnsi="Arial Unicode MS" w:eastAsia="Arial Unicode MS" w:cs="Arial Unicode MS"/>
+                <w:color w:val="000000"/>
+                <w:sz w:val="21"/>
+              </w:rPr>
+              <w:t>进行中</w:t>
+            </w:r>
+          </w:p>
+        </w:tc>
+        <w:tc>
+          <w:tcPr>
+            <w:tcW w:type="dxa" w:w="3629"/>
+            <w:vAlign w:val="center"/>
+            <w:shd w:fill="FFFFFF"/>
+            <w:tcMar>
+              <w:top w:w="90" w:type="dxa"/>
+              <w:bottom w:w="90" w:type="dxa"/>
+              <w:left w:w="100" w:type="dxa"/>
+              <w:right w:w="100" w:type="dxa"/>
+            </w:tcMar>
+          </w:tcPr>
+          <w:p>
+            <w:pPr>
+              <w:spacing w:after="0" w:line="269" w:lineRule="auto"/>
+            </w:pPr>
+            <w:r>
+              <w:rPr>
+                <w:rFonts w:ascii="Arial Unicode MS" w:hAnsi="Arial Unicode MS" w:eastAsia="Arial Unicode MS" w:cs="Arial Unicode MS"/>
+                <w:color w:val="000000"/>
+                <w:sz w:val="21"/>
+              </w:rPr>
+              <w:t>固定假进度已移除，首页显示真实累计完成数与加载、失败状态</w:t>
+            </w:r>
+          </w:p>
+        </w:tc>
+        <w:tc>
+          <w:tcPr>
+            <w:tcW w:type="dxa" w:w="2016"/>
+            <w:vAlign w:val="center"/>
+            <w:shd w:fill="FFFFFF"/>
+            <w:tcMar>
+              <w:top w:w="90" w:type="dxa"/>
+              <w:bottom w:w="90" w:type="dxa"/>
+              <w:left w:w="100" w:type="dxa"/>
+              <w:right w:w="100" w:type="dxa"/>
+            </w:tcMar>
+          </w:tcPr>
+          <w:p>
+            <w:pPr>
+              <w:spacing w:after="0" w:line="269" w:lineRule="auto"/>
+            </w:pPr>
+            <w:r>
+              <w:rPr>
+                <w:rFonts w:ascii="Arial Unicode MS" w:hAnsi="Arial Unicode MS" w:eastAsia="Arial Unicode MS" w:cs="Arial Unicode MS"/>
+                <w:color w:val="000000"/>
+                <w:sz w:val="21"/>
+              </w:rPr>
+              <w:t>按背景匹配与无匹配状态依赖 DP07；G04</w:t>
+            </w:r>
+          </w:p>
+        </w:tc>
+      </w:tr>
+      <w:tr>
+        <w:trPr>
+          <w:cantSplit/>
+        </w:trPr>
+        <w:tc>
+          <w:tcPr>
+            <w:tcW w:type="dxa" w:w="1613"/>
+            <w:vAlign w:val="center"/>
+            <w:shd w:fill="F3F6F9"/>
+            <w:tcMar>
+              <w:top w:w="90" w:type="dxa"/>
+              <w:bottom w:w="90" w:type="dxa"/>
+              <w:left w:w="100" w:type="dxa"/>
+              <w:right w:w="100" w:type="dxa"/>
+            </w:tcMar>
+          </w:tcPr>
+          <w:p>
+            <w:pPr>
+              <w:spacing w:after="0" w:line="269" w:lineRule="auto"/>
+            </w:pPr>
+            <w:r>
+              <w:rPr>
+                <w:rFonts w:ascii="Arial Unicode MS" w:hAnsi="Arial Unicode MS" w:eastAsia="Arial Unicode MS" w:cs="Arial Unicode MS"/>
+                <w:color w:val="000000"/>
+                <w:sz w:val="21"/>
+              </w:rPr>
+              <w:t>DP10 任务详情、完成撤回与版本</w:t>
+            </w:r>
+          </w:p>
+        </w:tc>
+        <w:tc>
+          <w:tcPr>
+            <w:tcW w:type="dxa" w:w="2822"/>
+            <w:vAlign w:val="center"/>
+            <w:shd w:fill="F3F6F9"/>
+            <w:tcMar>
+              <w:top w:w="90" w:type="dxa"/>
+              <w:bottom w:w="90" w:type="dxa"/>
+              <w:left w:w="100" w:type="dxa"/>
+              <w:right w:w="100" w:type="dxa"/>
+            </w:tcMar>
+          </w:tcPr>
+          <w:p>
+            <w:pPr>
+              <w:spacing w:after="0" w:line="269" w:lineRule="auto"/>
+            </w:pPr>
+            <w:r>
+              <w:rPr>
+                <w:rFonts w:ascii="Arial Unicode MS" w:hAnsi="Arial Unicode MS" w:eastAsia="Arial Unicode MS" w:cs="Arial Unicode MS"/>
+                <w:color w:val="000000"/>
+                <w:sz w:val="21"/>
+              </w:rPr>
+              <w:t>待开始</w:t>
+            </w:r>
+          </w:p>
+        </w:tc>
+        <w:tc>
+          <w:tcPr>
+            <w:tcW w:type="dxa" w:w="3629"/>
+            <w:vAlign w:val="center"/>
+            <w:shd w:fill="F3F6F9"/>
+            <w:tcMar>
+              <w:top w:w="90" w:type="dxa"/>
+              <w:bottom w:w="90" w:type="dxa"/>
+              <w:left w:w="100" w:type="dxa"/>
+              <w:right w:w="100" w:type="dxa"/>
+            </w:tcMar>
+          </w:tcPr>
+          <w:p>
+            <w:pPr>
+              <w:spacing w:after="0" w:line="269" w:lineRule="auto"/>
+            </w:pPr>
+            <w:r>
+              <w:rPr>
+                <w:rFonts w:ascii="Arial Unicode MS" w:hAnsi="Arial Unicode MS" w:eastAsia="Arial Unicode MS" w:cs="Arial Unicode MS"/>
+                <w:color w:val="000000"/>
+                <w:sz w:val="21"/>
+              </w:rPr>
+              <w:t>任务只有标题、描述、经验值与完成时间，无步骤、期限、来源与撤回</w:t>
+            </w:r>
+          </w:p>
+        </w:tc>
+        <w:tc>
+          <w:tcPr>
+            <w:tcW w:type="dxa" w:w="2016"/>
+            <w:vAlign w:val="center"/>
+            <w:shd w:fill="F3F6F9"/>
+            <w:tcMar>
+              <w:top w:w="90" w:type="dxa"/>
+              <w:bottom w:w="90" w:type="dxa"/>
+              <w:left w:w="100" w:type="dxa"/>
+              <w:right w:w="100" w:type="dxa"/>
+            </w:tcMar>
+          </w:tcPr>
+          <w:p>
+            <w:pPr>
+              <w:spacing w:after="0" w:line="269" w:lineRule="auto"/>
+            </w:pPr>
+            <w:r>
+              <w:rPr>
+                <w:rFonts w:ascii="Arial Unicode MS" w:hAnsi="Arial Unicode MS" w:eastAsia="Arial Unicode MS" w:cs="Arial Unicode MS"/>
+                <w:color w:val="000000"/>
+                <w:sz w:val="21"/>
+              </w:rPr>
+              <w:t>G05</w:t>
+            </w:r>
+          </w:p>
+        </w:tc>
+      </w:tr>
+      <w:tr>
+        <w:trPr>
+          <w:cantSplit/>
+        </w:trPr>
+        <w:tc>
+          <w:tcPr>
+            <w:tcW w:type="dxa" w:w="1613"/>
+            <w:vAlign w:val="center"/>
+            <w:shd w:fill="FFFFFF"/>
+            <w:tcMar>
+              <w:top w:w="90" w:type="dxa"/>
+              <w:bottom w:w="90" w:type="dxa"/>
+              <w:left w:w="100" w:type="dxa"/>
+              <w:right w:w="100" w:type="dxa"/>
+            </w:tcMar>
+          </w:tcPr>
+          <w:p>
+            <w:pPr>
+              <w:spacing w:after="0" w:line="269" w:lineRule="auto"/>
+            </w:pPr>
+            <w:r>
+              <w:rPr>
+                <w:rFonts w:ascii="Arial Unicode MS" w:hAnsi="Arial Unicode MS" w:eastAsia="Arial Unicode MS" w:cs="Arial Unicode MS"/>
+                <w:color w:val="000000"/>
+                <w:sz w:val="21"/>
+              </w:rPr>
+              <w:t>DP11 内容来源有效期与受控发布</w:t>
+            </w:r>
+          </w:p>
+        </w:tc>
+        <w:tc>
+          <w:tcPr>
+            <w:tcW w:type="dxa" w:w="2822"/>
+            <w:vAlign w:val="center"/>
+            <w:shd w:fill="FFFFFF"/>
+            <w:tcMar>
+              <w:top w:w="90" w:type="dxa"/>
+              <w:bottom w:w="90" w:type="dxa"/>
+              <w:left w:w="100" w:type="dxa"/>
+              <w:right w:w="100" w:type="dxa"/>
+            </w:tcMar>
+          </w:tcPr>
+          <w:p>
+            <w:pPr>
+              <w:spacing w:after="0" w:line="269" w:lineRule="auto"/>
+            </w:pPr>
+            <w:r>
+              <w:rPr>
+                <w:rFonts w:ascii="Arial Unicode MS" w:hAnsi="Arial Unicode MS" w:eastAsia="Arial Unicode MS" w:cs="Arial Unicode MS"/>
+                <w:color w:val="000000"/>
+                <w:sz w:val="21"/>
+              </w:rPr>
+              <w:t>待开始</w:t>
+            </w:r>
+          </w:p>
+        </w:tc>
+        <w:tc>
+          <w:tcPr>
+            <w:tcW w:type="dxa" w:w="3629"/>
+            <w:vAlign w:val="center"/>
+            <w:shd w:fill="FFFFFF"/>
+            <w:tcMar>
+              <w:top w:w="90" w:type="dxa"/>
+              <w:bottom w:w="90" w:type="dxa"/>
+              <w:left w:w="100" w:type="dxa"/>
+              <w:right w:w="100" w:type="dxa"/>
+            </w:tcMar>
+          </w:tcPr>
+          <w:p>
+            <w:pPr>
+              <w:spacing w:after="0" w:line="269" w:lineRule="auto"/>
+            </w:pPr>
+            <w:r>
+              <w:rPr>
+                <w:rFonts w:ascii="Arial Unicode MS" w:hAnsi="Arial Unicode MS" w:eastAsia="Arial Unicode MS" w:cs="Arial Unicode MS"/>
+                <w:color w:val="000000"/>
+                <w:sz w:val="21"/>
+              </w:rPr>
+              <w:t>帖子有来源类型，但无核验日、有效期与任务关联</w:t>
+            </w:r>
+          </w:p>
+        </w:tc>
+        <w:tc>
+          <w:tcPr>
+            <w:tcW w:type="dxa" w:w="2016"/>
+            <w:vAlign w:val="center"/>
+            <w:shd w:fill="FFFFFF"/>
+            <w:tcMar>
+              <w:top w:w="90" w:type="dxa"/>
+              <w:bottom w:w="90" w:type="dxa"/>
+              <w:left w:w="100" w:type="dxa"/>
+              <w:right w:w="100" w:type="dxa"/>
+            </w:tcMar>
+          </w:tcPr>
+          <w:p>
+            <w:pPr>
+              <w:spacing w:after="0" w:line="269" w:lineRule="auto"/>
+            </w:pPr>
+            <w:r>
+              <w:rPr>
+                <w:rFonts w:ascii="Arial Unicode MS" w:hAnsi="Arial Unicode MS" w:eastAsia="Arial Unicode MS" w:cs="Arial Unicode MS"/>
+                <w:color w:val="000000"/>
+                <w:sz w:val="21"/>
+              </w:rPr>
+              <w:t>G06</w:t>
+            </w:r>
+          </w:p>
+        </w:tc>
+      </w:tr>
+      <w:tr>
+        <w:trPr>
+          <w:cantSplit/>
+        </w:trPr>
+        <w:tc>
+          <w:tcPr>
+            <w:tcW w:type="dxa" w:w="1613"/>
+            <w:vAlign w:val="center"/>
+            <w:shd w:fill="F3F6F9"/>
+            <w:tcMar>
+              <w:top w:w="90" w:type="dxa"/>
+              <w:bottom w:w="90" w:type="dxa"/>
+              <w:left w:w="100" w:type="dxa"/>
+              <w:right w:w="100" w:type="dxa"/>
+            </w:tcMar>
+          </w:tcPr>
+          <w:p>
+            <w:pPr>
+              <w:spacing w:after="0" w:line="269" w:lineRule="auto"/>
+            </w:pPr>
+            <w:r>
+              <w:rPr>
+                <w:rFonts w:ascii="Arial Unicode MS" w:hAnsi="Arial Unicode MS" w:eastAsia="Arial Unicode MS" w:cs="Arial Unicode MS"/>
+                <w:color w:val="000000"/>
+                <w:sz w:val="21"/>
+              </w:rPr>
+              <w:t>DP12 iOS 图片转 PDF</w:t>
+            </w:r>
+          </w:p>
+        </w:tc>
+        <w:tc>
+          <w:tcPr>
+            <w:tcW w:type="dxa" w:w="2822"/>
+            <w:vAlign w:val="center"/>
+            <w:shd w:fill="F3F6F9"/>
+            <w:tcMar>
+              <w:top w:w="90" w:type="dxa"/>
+              <w:bottom w:w="90" w:type="dxa"/>
+              <w:left w:w="100" w:type="dxa"/>
+              <w:right w:w="100" w:type="dxa"/>
+            </w:tcMar>
+          </w:tcPr>
+          <w:p>
+            <w:pPr>
+              <w:spacing w:after="0" w:line="269" w:lineRule="auto"/>
+            </w:pPr>
+            <w:r>
+              <w:rPr>
+                <w:rFonts w:ascii="Arial Unicode MS" w:hAnsi="Arial Unicode MS" w:eastAsia="Arial Unicode MS" w:cs="Arial Unicode MS"/>
+                <w:color w:val="000000"/>
+                <w:sz w:val="21"/>
+              </w:rPr>
+              <w:t>待开始</w:t>
+            </w:r>
+          </w:p>
+        </w:tc>
+        <w:tc>
+          <w:tcPr>
+            <w:tcW w:type="dxa" w:w="3629"/>
+            <w:vAlign w:val="center"/>
+            <w:shd w:fill="F3F6F9"/>
+            <w:tcMar>
+              <w:top w:w="90" w:type="dxa"/>
+              <w:bottom w:w="90" w:type="dxa"/>
+              <w:left w:w="100" w:type="dxa"/>
+              <w:right w:w="100" w:type="dxa"/>
+            </w:tcMar>
+          </w:tcPr>
+          <w:p>
+            <w:pPr>
+              <w:spacing w:after="0" w:line="269" w:lineRule="auto"/>
+            </w:pPr>
+            <w:r>
+              <w:rPr>
+                <w:rFonts w:ascii="Arial Unicode MS" w:hAnsi="Arial Unicode MS" w:eastAsia="Arial Unicode MS" w:cs="Arial Unicode MS"/>
+                <w:color w:val="000000"/>
+                <w:sz w:val="21"/>
+              </w:rPr>
+              <w:t>工具 Tab 的 5 个入口均标注尚未开放</w:t>
+            </w:r>
+          </w:p>
+        </w:tc>
+        <w:tc>
+          <w:tcPr>
+            <w:tcW w:type="dxa" w:w="2016"/>
+            <w:vAlign w:val="center"/>
+            <w:shd w:fill="F3F6F9"/>
+            <w:tcMar>
+              <w:top w:w="90" w:type="dxa"/>
+              <w:bottom w:w="90" w:type="dxa"/>
+              <w:left w:w="100" w:type="dxa"/>
+              <w:right w:w="100" w:type="dxa"/>
+            </w:tcMar>
+          </w:tcPr>
+          <w:p>
+            <w:pPr>
+              <w:spacing w:after="0" w:line="269" w:lineRule="auto"/>
+            </w:pPr>
+            <w:r>
+              <w:rPr>
+                <w:rFonts w:ascii="Arial Unicode MS" w:hAnsi="Arial Unicode MS" w:eastAsia="Arial Unicode MS" w:cs="Arial Unicode MS"/>
+                <w:color w:val="000000"/>
+                <w:sz w:val="21"/>
+              </w:rPr>
+              <w:t>G07</w:t>
+            </w:r>
+          </w:p>
+        </w:tc>
+      </w:tr>
+      <w:tr>
+        <w:trPr>
+          <w:cantSplit/>
+        </w:trPr>
+        <w:tc>
+          <w:tcPr>
+            <w:tcW w:type="dxa" w:w="1613"/>
+            <w:vAlign w:val="center"/>
+            <w:shd w:fill="FFFFFF"/>
+            <w:tcMar>
+              <w:top w:w="90" w:type="dxa"/>
+              <w:bottom w:w="90" w:type="dxa"/>
+              <w:left w:w="100" w:type="dxa"/>
+              <w:right w:w="100" w:type="dxa"/>
+            </w:tcMar>
+          </w:tcPr>
+          <w:p>
+            <w:pPr>
+              <w:spacing w:after="0" w:line="269" w:lineRule="auto"/>
+            </w:pPr>
+            <w:r>
+              <w:rPr>
+                <w:rFonts w:ascii="Arial Unicode MS" w:hAnsi="Arial Unicode MS" w:eastAsia="Arial Unicode MS" w:cs="Arial Unicode MS"/>
+                <w:color w:val="000000"/>
+                <w:sz w:val="21"/>
+              </w:rPr>
               <w:t>DP14 Outbox 与事务后通知</w:t>
             </w:r>
           </w:p>
@@ -8879,7 +10030,7 @@
                 <w:color w:val="000000"/>
                 <w:sz w:val="21"/>
               </w:rPr>
-              <w:t>已实现持久任务、独立 worker、租约重领与分设备推送进度；最终 V24 的 Outbox 18 项、设备进度 11 项通过，详见 DP14 验收记录</w:t>
+              <w:t>Outbox 18 项、设备进度 11 项、运维 MySQL 10 项与 CLI 6 项通过，见 DP14 记录</w:t>
             </w:r>
           </w:p>
         </w:tc>
@@ -8905,7 +10056,988 @@
                 <w:color w:val="000000"/>
                 <w:sz w:val="21"/>
               </w:rPr>
-              <w:t>受控失败重试工具、真实 APNs 与跨实例网络、部署后端到端验收</w:t>
+              <w:t>积压告警、保留规则、真实 APNs、部署；M05</w:t>
+            </w:r>
+          </w:p>
+        </w:tc>
+      </w:tr>
+      <w:tr>
+        <w:trPr>
+          <w:cantSplit/>
+        </w:trPr>
+        <w:tc>
+          <w:tcPr>
+            <w:tcW w:type="dxa" w:w="1613"/>
+            <w:vAlign w:val="center"/>
+            <w:shd w:fill="F3F6F9"/>
+            <w:tcMar>
+              <w:top w:w="90" w:type="dxa"/>
+              <w:bottom w:w="90" w:type="dxa"/>
+              <w:left w:w="100" w:type="dxa"/>
+              <w:right w:w="100" w:type="dxa"/>
+            </w:tcMar>
+          </w:tcPr>
+          <w:p>
+            <w:pPr>
+              <w:spacing w:after="0" w:line="269" w:lineRule="auto"/>
+            </w:pPr>
+            <w:r>
+              <w:rPr>
+                <w:rFonts w:ascii="Arial Unicode MS" w:hAnsi="Arial Unicode MS" w:eastAsia="Arial Unicode MS" w:cs="Arial Unicode MS"/>
+                <w:color w:val="000000"/>
+                <w:sz w:val="21"/>
+              </w:rPr>
+              <w:t>DP15 会话消息分页与发送重试</w:t>
+            </w:r>
+          </w:p>
+        </w:tc>
+        <w:tc>
+          <w:tcPr>
+            <w:tcW w:type="dxa" w:w="2822"/>
+            <w:vAlign w:val="center"/>
+            <w:shd w:fill="F3F6F9"/>
+            <w:tcMar>
+              <w:top w:w="90" w:type="dxa"/>
+              <w:bottom w:w="90" w:type="dxa"/>
+              <w:left w:w="100" w:type="dxa"/>
+              <w:right w:w="100" w:type="dxa"/>
+            </w:tcMar>
+          </w:tcPr>
+          <w:p>
+            <w:pPr>
+              <w:spacing w:after="0" w:line="269" w:lineRule="auto"/>
+            </w:pPr>
+            <w:r>
+              <w:rPr>
+                <w:rFonts w:ascii="Arial Unicode MS" w:hAnsi="Arial Unicode MS" w:eastAsia="Arial Unicode MS" w:cs="Arial Unicode MS"/>
+                <w:color w:val="000000"/>
+                <w:sz w:val="21"/>
+              </w:rPr>
+              <w:t>验证中</w:t>
+            </w:r>
+          </w:p>
+        </w:tc>
+        <w:tc>
+          <w:tcPr>
+            <w:tcW w:type="dxa" w:w="3629"/>
+            <w:vAlign w:val="center"/>
+            <w:shd w:fill="F3F6F9"/>
+            <w:tcMar>
+              <w:top w:w="90" w:type="dxa"/>
+              <w:bottom w:w="90" w:type="dxa"/>
+              <w:left w:w="100" w:type="dxa"/>
+              <w:right w:w="100" w:type="dxa"/>
+            </w:tcMar>
+          </w:tcPr>
+          <w:p>
+            <w:pPr>
+              <w:spacing w:after="0" w:line="269" w:lineRule="auto"/>
+            </w:pPr>
+            <w:r>
+              <w:rPr>
+                <w:rFonts w:ascii="Arial Unicode MS" w:hAnsi="Arial Unicode MS" w:eastAsia="Arial Unicode MS" w:cs="Arial Unicode MS"/>
+                <w:color w:val="000000"/>
+                <w:sz w:val="21"/>
+              </w:rPr>
+              <w:t>隔离 MySQL 13 项、双实例 HTTP 492 条检查、iOS Core 112 项、模拟器构建通过，见 DP15 记录</w:t>
+            </w:r>
+          </w:p>
+        </w:tc>
+        <w:tc>
+          <w:tcPr>
+            <w:tcW w:type="dxa" w:w="2016"/>
+            <w:vAlign w:val="center"/>
+            <w:shd w:fill="F3F6F9"/>
+            <w:tcMar>
+              <w:top w:w="90" w:type="dxa"/>
+              <w:bottom w:w="90" w:type="dxa"/>
+              <w:left w:w="100" w:type="dxa"/>
+              <w:right w:w="100" w:type="dxa"/>
+            </w:tcMar>
+          </w:tcPr>
+          <w:p>
+            <w:pPr>
+              <w:spacing w:after="0" w:line="269" w:lineRule="auto"/>
+            </w:pPr>
+            <w:r>
+              <w:rPr>
+                <w:rFonts w:ascii="Arial Unicode MS" w:hAnsi="Arial Unicode MS" w:eastAsia="Arial Unicode MS" w:cs="Arial Unicode MS"/>
+                <w:color w:val="000000"/>
+                <w:sz w:val="21"/>
+              </w:rPr>
+              <w:t>部署 test、人工 UI、最低系统与容量；M02、M03、M04、M06</w:t>
+            </w:r>
+          </w:p>
+        </w:tc>
+      </w:tr>
+      <w:tr>
+        <w:trPr>
+          <w:cantSplit/>
+        </w:trPr>
+        <w:tc>
+          <w:tcPr>
+            <w:tcW w:type="dxa" w:w="1613"/>
+            <w:vAlign w:val="center"/>
+            <w:shd w:fill="FFFFFF"/>
+            <w:tcMar>
+              <w:top w:w="90" w:type="dxa"/>
+              <w:bottom w:w="90" w:type="dxa"/>
+              <w:left w:w="100" w:type="dxa"/>
+              <w:right w:w="100" w:type="dxa"/>
+            </w:tcMar>
+          </w:tcPr>
+          <w:p>
+            <w:pPr>
+              <w:spacing w:after="0" w:line="269" w:lineRule="auto"/>
+            </w:pPr>
+            <w:r>
+              <w:rPr>
+                <w:rFonts w:ascii="Arial Unicode MS" w:hAnsi="Arial Unicode MS" w:eastAsia="Arial Unicode MS" w:cs="Arial Unicode MS"/>
+                <w:color w:val="000000"/>
+                <w:sz w:val="21"/>
+              </w:rPr>
+              <w:t>DP16 Redis 续传与跨实例恢复</w:t>
+            </w:r>
+          </w:p>
+        </w:tc>
+        <w:tc>
+          <w:tcPr>
+            <w:tcW w:type="dxa" w:w="2822"/>
+            <w:vAlign w:val="center"/>
+            <w:shd w:fill="FFFFFF"/>
+            <w:tcMar>
+              <w:top w:w="90" w:type="dxa"/>
+              <w:bottom w:w="90" w:type="dxa"/>
+              <w:left w:w="100" w:type="dxa"/>
+              <w:right w:w="100" w:type="dxa"/>
+            </w:tcMar>
+          </w:tcPr>
+          <w:p>
+            <w:pPr>
+              <w:spacing w:after="0" w:line="269" w:lineRule="auto"/>
+            </w:pPr>
+            <w:r>
+              <w:rPr>
+                <w:rFonts w:ascii="Arial Unicode MS" w:hAnsi="Arial Unicode MS" w:eastAsia="Arial Unicode MS" w:cs="Arial Unicode MS"/>
+                <w:color w:val="000000"/>
+                <w:sz w:val="21"/>
+              </w:rPr>
+              <w:t>待开始</w:t>
+            </w:r>
+          </w:p>
+        </w:tc>
+        <w:tc>
+          <w:tcPr>
+            <w:tcW w:type="dxa" w:w="3629"/>
+            <w:vAlign w:val="center"/>
+            <w:shd w:fill="FFFFFF"/>
+            <w:tcMar>
+              <w:top w:w="90" w:type="dxa"/>
+              <w:bottom w:w="90" w:type="dxa"/>
+              <w:left w:w="100" w:type="dxa"/>
+              <w:right w:w="100" w:type="dxa"/>
+            </w:tcMar>
+          </w:tcPr>
+          <w:p>
+            <w:pPr>
+              <w:spacing w:after="0" w:line="269" w:lineRule="auto"/>
+            </w:pPr>
+            <w:r>
+              <w:rPr>
+                <w:rFonts w:ascii="Arial Unicode MS" w:hAnsi="Arial Unicode MS" w:eastAsia="Arial Unicode MS" w:cs="Arial Unicode MS"/>
+                <w:color w:val="000000"/>
+                <w:sz w:val="21"/>
+              </w:rPr>
+              <w:t>iOS 已按连接代次隔离并按 eventId 去重；Redis replay 有 1 项通过</w:t>
+            </w:r>
+          </w:p>
+        </w:tc>
+        <w:tc>
+          <w:tcPr>
+            <w:tcW w:type="dxa" w:w="2016"/>
+            <w:vAlign w:val="center"/>
+            <w:shd w:fill="FFFFFF"/>
+            <w:tcMar>
+              <w:top w:w="90" w:type="dxa"/>
+              <w:bottom w:w="90" w:type="dxa"/>
+              <w:left w:w="100" w:type="dxa"/>
+              <w:right w:w="100" w:type="dxa"/>
+            </w:tcMar>
+          </w:tcPr>
+          <w:p>
+            <w:pPr>
+              <w:spacing w:after="0" w:line="269" w:lineRule="auto"/>
+            </w:pPr>
+            <w:r>
+              <w:rPr>
+                <w:rFonts w:ascii="Arial Unicode MS" w:hAnsi="Arial Unicode MS" w:eastAsia="Arial Unicode MS" w:cs="Arial Unicode MS"/>
+                <w:color w:val="000000"/>
+                <w:sz w:val="21"/>
+              </w:rPr>
+              <w:t>保留窗外重新同步协议与跨实例验收，待补入路线图</w:t>
+            </w:r>
+          </w:p>
+        </w:tc>
+      </w:tr>
+      <w:tr>
+        <w:trPr>
+          <w:cantSplit/>
+        </w:trPr>
+        <w:tc>
+          <w:tcPr>
+            <w:tcW w:type="dxa" w:w="1613"/>
+            <w:vAlign w:val="center"/>
+            <w:shd w:fill="F3F6F9"/>
+            <w:tcMar>
+              <w:top w:w="90" w:type="dxa"/>
+              <w:bottom w:w="90" w:type="dxa"/>
+              <w:left w:w="100" w:type="dxa"/>
+              <w:right w:w="100" w:type="dxa"/>
+            </w:tcMar>
+          </w:tcPr>
+          <w:p>
+            <w:pPr>
+              <w:spacing w:after="0" w:line="269" w:lineRule="auto"/>
+            </w:pPr>
+            <w:r>
+              <w:rPr>
+                <w:rFonts w:ascii="Arial Unicode MS" w:hAnsi="Arial Unicode MS" w:eastAsia="Arial Unicode MS" w:cs="Arial Unicode MS"/>
+                <w:color w:val="000000"/>
+                <w:sz w:val="21"/>
+              </w:rPr>
+              <w:t>DP17 互动计数幂等与并发</w:t>
+            </w:r>
+          </w:p>
+        </w:tc>
+        <w:tc>
+          <w:tcPr>
+            <w:tcW w:type="dxa" w:w="2822"/>
+            <w:vAlign w:val="center"/>
+            <w:shd w:fill="F3F6F9"/>
+            <w:tcMar>
+              <w:top w:w="90" w:type="dxa"/>
+              <w:bottom w:w="90" w:type="dxa"/>
+              <w:left w:w="100" w:type="dxa"/>
+              <w:right w:w="100" w:type="dxa"/>
+            </w:tcMar>
+          </w:tcPr>
+          <w:p>
+            <w:pPr>
+              <w:spacing w:after="0" w:line="269" w:lineRule="auto"/>
+            </w:pPr>
+            <w:r>
+              <w:rPr>
+                <w:rFonts w:ascii="Arial Unicode MS" w:hAnsi="Arial Unicode MS" w:eastAsia="Arial Unicode MS" w:cs="Arial Unicode MS"/>
+                <w:color w:val="000000"/>
+                <w:sz w:val="21"/>
+              </w:rPr>
+              <w:t>验证中</w:t>
+            </w:r>
+          </w:p>
+        </w:tc>
+        <w:tc>
+          <w:tcPr>
+            <w:tcW w:type="dxa" w:w="3629"/>
+            <w:vAlign w:val="center"/>
+            <w:shd w:fill="F3F6F9"/>
+            <w:tcMar>
+              <w:top w:w="90" w:type="dxa"/>
+              <w:bottom w:w="90" w:type="dxa"/>
+              <w:left w:w="100" w:type="dxa"/>
+              <w:right w:w="100" w:type="dxa"/>
+            </w:tcMar>
+          </w:tcPr>
+          <w:p>
+            <w:pPr>
+              <w:spacing w:after="0" w:line="269" w:lineRule="auto"/>
+            </w:pPr>
+            <w:r>
+              <w:rPr>
+                <w:rFonts w:ascii="Arial Unicode MS" w:hAnsi="Arial Unicode MS" w:eastAsia="Arial Unicode MS" w:cs="Arial Unicode MS"/>
+                <w:color w:val="000000"/>
+                <w:sz w:val="21"/>
+              </w:rPr>
+              <w:t>隔离 MySQL 互动与社交专项已实跑，计数、经验与幂等结果见 DP02、DP03 记录</w:t>
+            </w:r>
+          </w:p>
+        </w:tc>
+        <w:tc>
+          <w:tcPr>
+            <w:tcW w:type="dxa" w:w="2016"/>
+            <w:vAlign w:val="center"/>
+            <w:shd w:fill="F3F6F9"/>
+            <w:tcMar>
+              <w:top w:w="90" w:type="dxa"/>
+              <w:bottom w:w="90" w:type="dxa"/>
+              <w:left w:w="100" w:type="dxa"/>
+              <w:right w:w="100" w:type="dxa"/>
+            </w:tcMar>
+          </w:tcPr>
+          <w:p>
+            <w:pPr>
+              <w:spacing w:after="0" w:line="269" w:lineRule="auto"/>
+            </w:pPr>
+            <w:r>
+              <w:rPr>
+                <w:rFonts w:ascii="Arial Unicode MS" w:hAnsi="Arial Unicode MS" w:eastAsia="Arial Unicode MS" w:cs="Arial Unicode MS"/>
+                <w:color w:val="000000"/>
+                <w:sz w:val="21"/>
+              </w:rPr>
+              <w:t>热帖锁等待与吞吐；M06 之后的 DP23</w:t>
+            </w:r>
+          </w:p>
+        </w:tc>
+      </w:tr>
+      <w:tr>
+        <w:trPr>
+          <w:cantSplit/>
+        </w:trPr>
+        <w:tc>
+          <w:tcPr>
+            <w:tcW w:type="dxa" w:w="1613"/>
+            <w:vAlign w:val="center"/>
+            <w:shd w:fill="FFFFFF"/>
+            <w:tcMar>
+              <w:top w:w="90" w:type="dxa"/>
+              <w:bottom w:w="90" w:type="dxa"/>
+              <w:left w:w="100" w:type="dxa"/>
+              <w:right w:w="100" w:type="dxa"/>
+            </w:tcMar>
+          </w:tcPr>
+          <w:p>
+            <w:pPr>
+              <w:spacing w:after="0" w:line="269" w:lineRule="auto"/>
+            </w:pPr>
+            <w:r>
+              <w:rPr>
+                <w:rFonts w:ascii="Arial Unicode MS" w:hAnsi="Arial Unicode MS" w:eastAsia="Arial Unicode MS" w:cs="Arial Unicode MS"/>
+                <w:color w:val="000000"/>
+                <w:sz w:val="21"/>
+              </w:rPr>
+              <w:t>DP18 iOS 语义 tokens 与组件状态</w:t>
+            </w:r>
+          </w:p>
+        </w:tc>
+        <w:tc>
+          <w:tcPr>
+            <w:tcW w:type="dxa" w:w="2822"/>
+            <w:vAlign w:val="center"/>
+            <w:shd w:fill="FFFFFF"/>
+            <w:tcMar>
+              <w:top w:w="90" w:type="dxa"/>
+              <w:bottom w:w="90" w:type="dxa"/>
+              <w:left w:w="100" w:type="dxa"/>
+              <w:right w:w="100" w:type="dxa"/>
+            </w:tcMar>
+          </w:tcPr>
+          <w:p>
+            <w:pPr>
+              <w:spacing w:after="0" w:line="269" w:lineRule="auto"/>
+            </w:pPr>
+            <w:r>
+              <w:rPr>
+                <w:rFonts w:ascii="Arial Unicode MS" w:hAnsi="Arial Unicode MS" w:eastAsia="Arial Unicode MS" w:cs="Arial Unicode MS"/>
+                <w:color w:val="000000"/>
+                <w:sz w:val="21"/>
+              </w:rPr>
+              <w:t>待开始</w:t>
+            </w:r>
+          </w:p>
+        </w:tc>
+        <w:tc>
+          <w:tcPr>
+            <w:tcW w:type="dxa" w:w="3629"/>
+            <w:vAlign w:val="center"/>
+            <w:shd w:fill="FFFFFF"/>
+            <w:tcMar>
+              <w:top w:w="90" w:type="dxa"/>
+              <w:bottom w:w="90" w:type="dxa"/>
+              <w:left w:w="100" w:type="dxa"/>
+              <w:right w:w="100" w:type="dxa"/>
+            </w:tcMar>
+          </w:tcPr>
+          <w:p>
+            <w:pPr>
+              <w:spacing w:after="0" w:line="269" w:lineRule="auto"/>
+            </w:pPr>
+            <w:r>
+              <w:rPr>
+                <w:rFonts w:ascii="Arial Unicode MS" w:hAnsi="Arial Unicode MS" w:eastAsia="Arial Unicode MS" w:cs="Arial Unicode MS"/>
+                <w:color w:val="000000"/>
+                <w:sz w:val="21"/>
+              </w:rPr>
+              <w:t>Theme 仅有基础色值与 12、22、30 圆角；页面仍散落字面圆角与透明度</w:t>
+            </w:r>
+          </w:p>
+        </w:tc>
+        <w:tc>
+          <w:tcPr>
+            <w:tcW w:type="dxa" w:w="2016"/>
+            <w:vAlign w:val="center"/>
+            <w:shd w:fill="FFFFFF"/>
+            <w:tcMar>
+              <w:top w:w="90" w:type="dxa"/>
+              <w:bottom w:w="90" w:type="dxa"/>
+              <w:left w:w="100" w:type="dxa"/>
+              <w:right w:w="100" w:type="dxa"/>
+            </w:tcMar>
+          </w:tcPr>
+          <w:p>
+            <w:pPr>
+              <w:spacing w:after="0" w:line="269" w:lineRule="auto"/>
+            </w:pPr>
+            <w:r>
+              <w:rPr>
+                <w:rFonts w:ascii="Arial Unicode MS" w:hAnsi="Arial Unicode MS" w:eastAsia="Arial Unicode MS" w:cs="Arial Unicode MS"/>
+                <w:color w:val="000000"/>
+                <w:sz w:val="21"/>
+              </w:rPr>
+              <w:t>语义 token 表与组件状态，待补入路线图</w:t>
+            </w:r>
+          </w:p>
+        </w:tc>
+      </w:tr>
+      <w:tr>
+        <w:trPr>
+          <w:cantSplit/>
+        </w:trPr>
+        <w:tc>
+          <w:tcPr>
+            <w:tcW w:type="dxa" w:w="1613"/>
+            <w:vAlign w:val="center"/>
+            <w:shd w:fill="F3F6F9"/>
+            <w:tcMar>
+              <w:top w:w="90" w:type="dxa"/>
+              <w:bottom w:w="90" w:type="dxa"/>
+              <w:left w:w="100" w:type="dxa"/>
+              <w:right w:w="100" w:type="dxa"/>
+            </w:tcMar>
+          </w:tcPr>
+          <w:p>
+            <w:pPr>
+              <w:spacing w:after="0" w:line="269" w:lineRule="auto"/>
+            </w:pPr>
+            <w:r>
+              <w:rPr>
+                <w:rFonts w:ascii="Arial Unicode MS" w:hAnsi="Arial Unicode MS" w:eastAsia="Arial Unicode MS" w:cs="Arial Unicode MS"/>
+                <w:color w:val="000000"/>
+                <w:sz w:val="21"/>
+              </w:rPr>
+              <w:t>DP20 埋点与受控指标导出</w:t>
+            </w:r>
+          </w:p>
+        </w:tc>
+        <w:tc>
+          <w:tcPr>
+            <w:tcW w:type="dxa" w:w="2822"/>
+            <w:vAlign w:val="center"/>
+            <w:shd w:fill="F3F6F9"/>
+            <w:tcMar>
+              <w:top w:w="90" w:type="dxa"/>
+              <w:bottom w:w="90" w:type="dxa"/>
+              <w:left w:w="100" w:type="dxa"/>
+              <w:right w:w="100" w:type="dxa"/>
+            </w:tcMar>
+          </w:tcPr>
+          <w:p>
+            <w:pPr>
+              <w:spacing w:after="0" w:line="269" w:lineRule="auto"/>
+            </w:pPr>
+            <w:r>
+              <w:rPr>
+                <w:rFonts w:ascii="Arial Unicode MS" w:hAnsi="Arial Unicode MS" w:eastAsia="Arial Unicode MS" w:cs="Arial Unicode MS"/>
+                <w:color w:val="000000"/>
+                <w:sz w:val="21"/>
+              </w:rPr>
+              <w:t>待开始</w:t>
+            </w:r>
+          </w:p>
+        </w:tc>
+        <w:tc>
+          <w:tcPr>
+            <w:tcW w:type="dxa" w:w="3629"/>
+            <w:vAlign w:val="center"/>
+            <w:shd w:fill="F3F6F9"/>
+            <w:tcMar>
+              <w:top w:w="90" w:type="dxa"/>
+              <w:bottom w:w="90" w:type="dxa"/>
+              <w:left w:w="100" w:type="dxa"/>
+              <w:right w:w="100" w:type="dxa"/>
+            </w:tcMar>
+          </w:tcPr>
+          <w:p>
+            <w:pPr>
+              <w:spacing w:after="0" w:line="269" w:lineRule="auto"/>
+            </w:pPr>
+            <w:r>
+              <w:rPr>
+                <w:rFonts w:ascii="Arial Unicode MS" w:hAnsi="Arial Unicode MS" w:eastAsia="Arial Unicode MS" w:cs="Arial Unicode MS"/>
+                <w:color w:val="000000"/>
+                <w:sz w:val="21"/>
+              </w:rPr>
+              <w:t>有分析表，无事件流水与漏斗</w:t>
+            </w:r>
+          </w:p>
+        </w:tc>
+        <w:tc>
+          <w:tcPr>
+            <w:tcW w:type="dxa" w:w="2016"/>
+            <w:vAlign w:val="center"/>
+            <w:shd w:fill="F3F6F9"/>
+            <w:tcMar>
+              <w:top w:w="90" w:type="dxa"/>
+              <w:bottom w:w="90" w:type="dxa"/>
+              <w:left w:w="100" w:type="dxa"/>
+              <w:right w:w="100" w:type="dxa"/>
+            </w:tcMar>
+          </w:tcPr>
+          <w:p>
+            <w:pPr>
+              <w:spacing w:after="0" w:line="269" w:lineRule="auto"/>
+            </w:pPr>
+            <w:r>
+              <w:rPr>
+                <w:rFonts w:ascii="Arial Unicode MS" w:hAnsi="Arial Unicode MS" w:eastAsia="Arial Unicode MS" w:cs="Arial Unicode MS"/>
+                <w:color w:val="000000"/>
+                <w:sz w:val="21"/>
+              </w:rPr>
+              <w:t>D01、D02、D03</w:t>
+            </w:r>
+          </w:p>
+        </w:tc>
+      </w:tr>
+      <w:tr>
+        <w:trPr>
+          <w:cantSplit/>
+        </w:trPr>
+        <w:tc>
+          <w:tcPr>
+            <w:tcW w:type="dxa" w:w="1613"/>
+            <w:vAlign w:val="center"/>
+            <w:shd w:fill="FFFFFF"/>
+            <w:tcMar>
+              <w:top w:w="90" w:type="dxa"/>
+              <w:bottom w:w="90" w:type="dxa"/>
+              <w:left w:w="100" w:type="dxa"/>
+              <w:right w:w="100" w:type="dxa"/>
+            </w:tcMar>
+          </w:tcPr>
+          <w:p>
+            <w:pPr>
+              <w:spacing w:after="0" w:line="269" w:lineRule="auto"/>
+            </w:pPr>
+            <w:r>
+              <w:rPr>
+                <w:rFonts w:ascii="Arial Unicode MS" w:hAnsi="Arial Unicode MS" w:eastAsia="Arial Unicode MS" w:cs="Arial Unicode MS"/>
+                <w:color w:val="000000"/>
+                <w:sz w:val="21"/>
+              </w:rPr>
+              <w:t>DP21 后端集成与 iOS 自动化回归</w:t>
+            </w:r>
+          </w:p>
+        </w:tc>
+        <w:tc>
+          <w:tcPr>
+            <w:tcW w:type="dxa" w:w="2822"/>
+            <w:vAlign w:val="center"/>
+            <w:shd w:fill="FFFFFF"/>
+            <w:tcMar>
+              <w:top w:w="90" w:type="dxa"/>
+              <w:bottom w:w="90" w:type="dxa"/>
+              <w:left w:w="100" w:type="dxa"/>
+              <w:right w:w="100" w:type="dxa"/>
+            </w:tcMar>
+          </w:tcPr>
+          <w:p>
+            <w:pPr>
+              <w:spacing w:after="0" w:line="269" w:lineRule="auto"/>
+            </w:pPr>
+            <w:r>
+              <w:rPr>
+                <w:rFonts w:ascii="Arial Unicode MS" w:hAnsi="Arial Unicode MS" w:eastAsia="Arial Unicode MS" w:cs="Arial Unicode MS"/>
+                <w:color w:val="000000"/>
+                <w:sz w:val="21"/>
+              </w:rPr>
+              <w:t>进行中</w:t>
+            </w:r>
+          </w:p>
+        </w:tc>
+        <w:tc>
+          <w:tcPr>
+            <w:tcW w:type="dxa" w:w="3629"/>
+            <w:vAlign w:val="center"/>
+            <w:shd w:fill="FFFFFF"/>
+            <w:tcMar>
+              <w:top w:w="90" w:type="dxa"/>
+              <w:bottom w:w="90" w:type="dxa"/>
+              <w:left w:w="100" w:type="dxa"/>
+              <w:right w:w="100" w:type="dxa"/>
+            </w:tcMar>
+          </w:tcPr>
+          <w:p>
+            <w:pPr>
+              <w:spacing w:after="0" w:line="269" w:lineRule="auto"/>
+            </w:pPr>
+            <w:r>
+              <w:rPr>
+                <w:rFonts w:ascii="Arial Unicode MS" w:hAnsi="Arial Unicode MS" w:eastAsia="Arial Unicode MS" w:cs="Arial Unicode MS"/>
+                <w:color w:val="000000"/>
+                <w:sz w:val="21"/>
+              </w:rPr>
+              <w:t>后端单测与隔离专项、Core 112 项、系统 Keychain 2 项；无 iOS UI 自动化与 iOS CI</w:t>
+            </w:r>
+          </w:p>
+        </w:tc>
+        <w:tc>
+          <w:tcPr>
+            <w:tcW w:type="dxa" w:w="2016"/>
+            <w:vAlign w:val="center"/>
+            <w:shd w:fill="FFFFFF"/>
+            <w:tcMar>
+              <w:top w:w="90" w:type="dxa"/>
+              <w:bottom w:w="90" w:type="dxa"/>
+              <w:left w:w="100" w:type="dxa"/>
+              <w:right w:w="100" w:type="dxa"/>
+            </w:tcMar>
+          </w:tcPr>
+          <w:p>
+            <w:pPr>
+              <w:spacing w:after="0" w:line="269" w:lineRule="auto"/>
+            </w:pPr>
+            <w:r>
+              <w:rPr>
+                <w:rFonts w:ascii="Arial Unicode MS" w:hAnsi="Arial Unicode MS" w:eastAsia="Arial Unicode MS" w:cs="Arial Unicode MS"/>
+                <w:color w:val="000000"/>
+                <w:sz w:val="21"/>
+              </w:rPr>
+              <w:t>随各包补充，不单独结项</w:t>
+            </w:r>
+          </w:p>
+        </w:tc>
+      </w:tr>
+      <w:tr>
+        <w:trPr>
+          <w:cantSplit/>
+        </w:trPr>
+        <w:tc>
+          <w:tcPr>
+            <w:tcW w:type="dxa" w:w="1613"/>
+            <w:vAlign w:val="center"/>
+            <w:shd w:fill="F3F6F9"/>
+            <w:tcMar>
+              <w:top w:w="90" w:type="dxa"/>
+              <w:bottom w:w="90" w:type="dxa"/>
+              <w:left w:w="100" w:type="dxa"/>
+              <w:right w:w="100" w:type="dxa"/>
+            </w:tcMar>
+          </w:tcPr>
+          <w:p>
+            <w:pPr>
+              <w:spacing w:after="0" w:line="269" w:lineRule="auto"/>
+            </w:pPr>
+            <w:r>
+              <w:rPr>
+                <w:rFonts w:ascii="Arial Unicode MS" w:hAnsi="Arial Unicode MS" w:eastAsia="Arial Unicode MS" w:cs="Arial Unicode MS"/>
+                <w:color w:val="000000"/>
+                <w:sz w:val="21"/>
+              </w:rPr>
+              <w:t>DP22 真机、签名、推送与试点发布</w:t>
+            </w:r>
+          </w:p>
+        </w:tc>
+        <w:tc>
+          <w:tcPr>
+            <w:tcW w:type="dxa" w:w="2822"/>
+            <w:vAlign w:val="center"/>
+            <w:shd w:fill="F3F6F9"/>
+            <w:tcMar>
+              <w:top w:w="90" w:type="dxa"/>
+              <w:bottom w:w="90" w:type="dxa"/>
+              <w:left w:w="100" w:type="dxa"/>
+              <w:right w:w="100" w:type="dxa"/>
+            </w:tcMar>
+          </w:tcPr>
+          <w:p>
+            <w:pPr>
+              <w:spacing w:after="0" w:line="269" w:lineRule="auto"/>
+            </w:pPr>
+            <w:r>
+              <w:rPr>
+                <w:rFonts w:ascii="Arial Unicode MS" w:hAnsi="Arial Unicode MS" w:eastAsia="Arial Unicode MS" w:cs="Arial Unicode MS"/>
+                <w:color w:val="000000"/>
+                <w:sz w:val="21"/>
+              </w:rPr>
+              <w:t>待开始</w:t>
+            </w:r>
+          </w:p>
+        </w:tc>
+        <w:tc>
+          <w:tcPr>
+            <w:tcW w:type="dxa" w:w="3629"/>
+            <w:vAlign w:val="center"/>
+            <w:shd w:fill="F3F6F9"/>
+            <w:tcMar>
+              <w:top w:w="90" w:type="dxa"/>
+              <w:bottom w:w="90" w:type="dxa"/>
+              <w:left w:w="100" w:type="dxa"/>
+              <w:right w:w="100" w:type="dxa"/>
+            </w:tcMar>
+          </w:tcPr>
+          <w:p>
+            <w:pPr>
+              <w:spacing w:after="0" w:line="269" w:lineRule="auto"/>
+            </w:pPr>
+            <w:r>
+              <w:rPr>
+                <w:rFonts w:ascii="Arial Unicode MS" w:hAnsi="Arial Unicode MS" w:eastAsia="Arial Unicode MS" w:cs="Arial Unicode MS"/>
+                <w:color w:val="000000"/>
+                <w:sz w:val="21"/>
+              </w:rPr>
+              <w:t>Debug 使用测试 IP 与单主机 ATS 例外，Release 尚无 HTTPS 地址</w:t>
+            </w:r>
+          </w:p>
+        </w:tc>
+        <w:tc>
+          <w:tcPr>
+            <w:tcW w:type="dxa" w:w="2016"/>
+            <w:vAlign w:val="center"/>
+            <w:shd w:fill="F3F6F9"/>
+            <w:tcMar>
+              <w:top w:w="90" w:type="dxa"/>
+              <w:bottom w:w="90" w:type="dxa"/>
+              <w:left w:w="100" w:type="dxa"/>
+              <w:right w:w="100" w:type="dxa"/>
+            </w:tcMar>
+          </w:tcPr>
+          <w:p>
+            <w:pPr>
+              <w:spacing w:after="0" w:line="269" w:lineRule="auto"/>
+            </w:pPr>
+            <w:r>
+              <w:rPr>
+                <w:rFonts w:ascii="Arial Unicode MS" w:hAnsi="Arial Unicode MS" w:eastAsia="Arial Unicode MS" w:cs="Arial Unicode MS"/>
+                <w:color w:val="000000"/>
+                <w:sz w:val="21"/>
+              </w:rPr>
+              <w:t>R01、R06、M05</w:t>
+            </w:r>
+          </w:p>
+        </w:tc>
+      </w:tr>
+      <w:tr>
+        <w:trPr>
+          <w:cantSplit/>
+        </w:trPr>
+        <w:tc>
+          <w:tcPr>
+            <w:tcW w:type="dxa" w:w="1613"/>
+            <w:vAlign w:val="center"/>
+            <w:shd w:fill="FFFFFF"/>
+            <w:tcMar>
+              <w:top w:w="90" w:type="dxa"/>
+              <w:bottom w:w="90" w:type="dxa"/>
+              <w:left w:w="100" w:type="dxa"/>
+              <w:right w:w="100" w:type="dxa"/>
+            </w:tcMar>
+          </w:tcPr>
+          <w:p>
+            <w:pPr>
+              <w:spacing w:after="0" w:line="269" w:lineRule="auto"/>
+            </w:pPr>
+            <w:r>
+              <w:rPr>
+                <w:rFonts w:ascii="Arial Unicode MS" w:hAnsi="Arial Unicode MS" w:eastAsia="Arial Unicode MS" w:cs="Arial Unicode MS"/>
+                <w:color w:val="000000"/>
+                <w:sz w:val="21"/>
+              </w:rPr>
+              <w:t>DP23 单机压测与容量记录</w:t>
+            </w:r>
+          </w:p>
+        </w:tc>
+        <w:tc>
+          <w:tcPr>
+            <w:tcW w:type="dxa" w:w="2822"/>
+            <w:vAlign w:val="center"/>
+            <w:shd w:fill="FFFFFF"/>
+            <w:tcMar>
+              <w:top w:w="90" w:type="dxa"/>
+              <w:bottom w:w="90" w:type="dxa"/>
+              <w:left w:w="100" w:type="dxa"/>
+              <w:right w:w="100" w:type="dxa"/>
+            </w:tcMar>
+          </w:tcPr>
+          <w:p>
+            <w:pPr>
+              <w:spacing w:after="0" w:line="269" w:lineRule="auto"/>
+            </w:pPr>
+            <w:r>
+              <w:rPr>
+                <w:rFonts w:ascii="Arial Unicode MS" w:hAnsi="Arial Unicode MS" w:eastAsia="Arial Unicode MS" w:cs="Arial Unicode MS"/>
+                <w:color w:val="000000"/>
+                <w:sz w:val="21"/>
+              </w:rPr>
+              <w:t>待开始</w:t>
+            </w:r>
+          </w:p>
+        </w:tc>
+        <w:tc>
+          <w:tcPr>
+            <w:tcW w:type="dxa" w:w="3629"/>
+            <w:vAlign w:val="center"/>
+            <w:shd w:fill="FFFFFF"/>
+            <w:tcMar>
+              <w:top w:w="90" w:type="dxa"/>
+              <w:bottom w:w="90" w:type="dxa"/>
+              <w:left w:w="100" w:type="dxa"/>
+              <w:right w:w="100" w:type="dxa"/>
+            </w:tcMar>
+          </w:tcPr>
+          <w:p>
+            <w:pPr>
+              <w:spacing w:after="0" w:line="269" w:lineRule="auto"/>
+            </w:pPr>
+            <w:r>
+              <w:rPr>
+                <w:rFonts w:ascii="Arial Unicode MS" w:hAnsi="Arial Unicode MS" w:eastAsia="Arial Unicode MS" w:cs="Arial Unicode MS"/>
+                <w:color w:val="000000"/>
+                <w:sz w:val="21"/>
+              </w:rPr>
+              <w:t>只有正确性测试，无吞吐与 P95 记录</w:t>
+            </w:r>
+          </w:p>
+        </w:tc>
+        <w:tc>
+          <w:tcPr>
+            <w:tcW w:type="dxa" w:w="2016"/>
+            <w:vAlign w:val="center"/>
+            <w:shd w:fill="FFFFFF"/>
+            <w:tcMar>
+              <w:top w:w="90" w:type="dxa"/>
+              <w:bottom w:w="90" w:type="dxa"/>
+              <w:left w:w="100" w:type="dxa"/>
+              <w:right w:w="100" w:type="dxa"/>
+            </w:tcMar>
+          </w:tcPr>
+          <w:p>
+            <w:pPr>
+              <w:spacing w:after="0" w:line="269" w:lineRule="auto"/>
+            </w:pPr>
+            <w:r>
+              <w:rPr>
+                <w:rFonts w:ascii="Arial Unicode MS" w:hAnsi="Arial Unicode MS" w:eastAsia="Arial Unicode MS" w:cs="Arial Unicode MS"/>
+                <w:color w:val="000000"/>
+                <w:sz w:val="21"/>
+              </w:rPr>
+              <w:t>M06</w:t>
+            </w:r>
+          </w:p>
+        </w:tc>
+      </w:tr>
+      <w:tr>
+        <w:trPr>
+          <w:cantSplit/>
+        </w:trPr>
+        <w:tc>
+          <w:tcPr>
+            <w:tcW w:type="dxa" w:w="1613"/>
+            <w:vAlign w:val="center"/>
+            <w:shd w:fill="F3F6F9"/>
+            <w:tcMar>
+              <w:top w:w="90" w:type="dxa"/>
+              <w:bottom w:w="90" w:type="dxa"/>
+              <w:left w:w="100" w:type="dxa"/>
+              <w:right w:w="100" w:type="dxa"/>
+            </w:tcMar>
+          </w:tcPr>
+          <w:p>
+            <w:pPr>
+              <w:spacing w:after="0" w:line="269" w:lineRule="auto"/>
+            </w:pPr>
+            <w:r>
+              <w:rPr>
+                <w:rFonts w:ascii="Arial Unicode MS" w:hAnsi="Arial Unicode MS" w:eastAsia="Arial Unicode MS" w:cs="Arial Unicode MS"/>
+                <w:color w:val="000000"/>
+                <w:sz w:val="21"/>
+              </w:rPr>
+              <w:t>DP24 试点反馈与缺陷修复</w:t>
+            </w:r>
+          </w:p>
+        </w:tc>
+        <w:tc>
+          <w:tcPr>
+            <w:tcW w:type="dxa" w:w="2822"/>
+            <w:vAlign w:val="center"/>
+            <w:shd w:fill="F3F6F9"/>
+            <w:tcMar>
+              <w:top w:w="90" w:type="dxa"/>
+              <w:bottom w:w="90" w:type="dxa"/>
+              <w:left w:w="100" w:type="dxa"/>
+              <w:right w:w="100" w:type="dxa"/>
+            </w:tcMar>
+          </w:tcPr>
+          <w:p>
+            <w:pPr>
+              <w:spacing w:after="0" w:line="269" w:lineRule="auto"/>
+            </w:pPr>
+            <w:r>
+              <w:rPr>
+                <w:rFonts w:ascii="Arial Unicode MS" w:hAnsi="Arial Unicode MS" w:eastAsia="Arial Unicode MS" w:cs="Arial Unicode MS"/>
+                <w:color w:val="000000"/>
+                <w:sz w:val="21"/>
+              </w:rPr>
+              <w:t>待开始</w:t>
+            </w:r>
+          </w:p>
+        </w:tc>
+        <w:tc>
+          <w:tcPr>
+            <w:tcW w:type="dxa" w:w="3629"/>
+            <w:vAlign w:val="center"/>
+            <w:shd w:fill="F3F6F9"/>
+            <w:tcMar>
+              <w:top w:w="90" w:type="dxa"/>
+              <w:bottom w:w="90" w:type="dxa"/>
+              <w:left w:w="100" w:type="dxa"/>
+              <w:right w:w="100" w:type="dxa"/>
+            </w:tcMar>
+          </w:tcPr>
+          <w:p>
+            <w:pPr>
+              <w:spacing w:after="0" w:line="269" w:lineRule="auto"/>
+            </w:pPr>
+            <w:r>
+              <w:rPr>
+                <w:rFonts w:ascii="Arial Unicode MS" w:hAnsi="Arial Unicode MS" w:eastAsia="Arial Unicode MS" w:cs="Arial Unicode MS"/>
+                <w:color w:val="000000"/>
+                <w:sz w:val="21"/>
+              </w:rPr>
+              <w:t>依赖 DP22</w:t>
+            </w:r>
+          </w:p>
+        </w:tc>
+        <w:tc>
+          <w:tcPr>
+            <w:tcW w:type="dxa" w:w="2016"/>
+            <w:vAlign w:val="center"/>
+            <w:shd w:fill="F3F6F9"/>
+            <w:tcMar>
+              <w:top w:w="90" w:type="dxa"/>
+              <w:bottom w:w="90" w:type="dxa"/>
+              <w:left w:w="100" w:type="dxa"/>
+              <w:right w:w="100" w:type="dxa"/>
+            </w:tcMar>
+          </w:tcPr>
+          <w:p>
+            <w:pPr>
+              <w:spacing w:after="0" w:line="269" w:lineRule="auto"/>
+            </w:pPr>
+            <w:r>
+              <w:rPr>
+                <w:rFonts w:ascii="Arial Unicode MS" w:hAnsi="Arial Unicode MS" w:eastAsia="Arial Unicode MS" w:cs="Arial Unicode MS"/>
+                <w:color w:val="000000"/>
+                <w:sz w:val="21"/>
+              </w:rPr>
+              <w:t>P01 至 P05</w:t>
             </w:r>
           </w:p>
         </w:tc>
@@ -8999,6 +11131,46 @@
           <w:color w:val="000000"/>
         </w:rPr>
         <w:t>。Outbox 的完成状态只说明对应通道的处理结束；它不构成用户设备已收到或已读回执。真实客户端仍通过消息 API 同步事实。</w:t>
+      </w:r>
+    </w:p>
+    <w:p>
+      <w:r>
+        <w:rPr>
+          <w:rFonts w:ascii="Arial Unicode MS" w:hAnsi="Arial Unicode MS" w:eastAsia="Arial Unicode MS" w:cs="Arial Unicode MS"/>
+          <w:color w:val="000000"/>
+        </w:rPr>
+        <w:t xml:space="preserve">消息分页、断线增量补齐与发送重试的证据见 </w:t>
+      </w:r>
+      <w:r>
+        <w:rPr>
+          <w:rFonts w:ascii="Arial Unicode MS" w:hAnsi="Arial Unicode MS" w:eastAsia="Arial Unicode MS" w:cs="Arial Unicode MS"/>
+          <w:color w:val="000000"/>
+        </w:rPr>
+        <w:t>DP15 验收记录</w:t>
+      </w:r>
+      <w:r>
+        <w:t>（DP15-VERIFICATION.md）</w:t>
+      </w:r>
+      <w:r>
+        <w:rPr>
+          <w:rFonts w:ascii="Arial Unicode MS" w:hAnsi="Arial Unicode MS" w:eastAsia="Arial Unicode MS" w:cs="Arial Unicode MS"/>
+          <w:color w:val="000000"/>
+        </w:rPr>
+        <w:t xml:space="preserve">，失败投递的查询与受控重试见 </w:t>
+      </w:r>
+      <w:r>
+        <w:rPr>
+          <w:rFonts w:ascii="Arial Unicode MS" w:hAnsi="Arial Unicode MS" w:eastAsia="Arial Unicode MS" w:cs="Arial Unicode MS"/>
+          <w:color w:val="000000"/>
+        </w:rPr>
+        <w:t>OUTBOX-OPERATIONS</w:t>
+      </w:r>
+      <w:r>
+        <w:rPr>
+          <w:rFonts w:ascii="Arial Unicode MS" w:hAnsi="Arial Unicode MS" w:eastAsia="Arial Unicode MS" w:cs="Arial Unicode MS"/>
+          <w:color w:val="000000"/>
+        </w:rPr>
+        <w:t>。10 月 23 日提交前在空库 V1 至 V25 上复跑了冒烟 42 项、后端打包、iOS Core 与模拟器构建，并重新生成了前端 OpenAPI 类型。</w:t>
       </w:r>
     </w:p>
     <w:p>
@@ -16065,6 +18237,115 @@
                 <w:sz w:val="21"/>
               </w:rPr>
               <w:t>仅开发 iOS、后端与基础设施；治理由受控接口和工具承接</w:t>
+            </w:r>
+          </w:p>
+        </w:tc>
+      </w:tr>
+      <w:tr>
+        <w:trPr>
+          <w:cantSplit/>
+        </w:trPr>
+        <w:tc>
+          <w:tcPr>
+            <w:tcW w:type="dxa" w:w="1613"/>
+            <w:vAlign w:val="center"/>
+            <w:shd w:fill="FFFFFF"/>
+            <w:tcMar>
+              <w:top w:w="90" w:type="dxa"/>
+              <w:bottom w:w="90" w:type="dxa"/>
+              <w:left w:w="100" w:type="dxa"/>
+              <w:right w:w="100" w:type="dxa"/>
+            </w:tcMar>
+          </w:tcPr>
+          <w:p>
+            <w:pPr>
+              <w:spacing w:after="0" w:line="269" w:lineRule="auto"/>
+            </w:pPr>
+            <w:r>
+              <w:rPr>
+                <w:rFonts w:ascii="Arial Unicode MS" w:hAnsi="Arial Unicode MS" w:eastAsia="Arial Unicode MS" w:cs="Arial Unicode MS"/>
+                <w:color w:val="000000"/>
+                <w:sz w:val="21"/>
+              </w:rPr>
+              <w:t>1.2</w:t>
+            </w:r>
+          </w:p>
+        </w:tc>
+        <w:tc>
+          <w:tcPr>
+            <w:tcW w:type="dxa" w:w="2822"/>
+            <w:vAlign w:val="center"/>
+            <w:shd w:fill="FFFFFF"/>
+            <w:tcMar>
+              <w:top w:w="90" w:type="dxa"/>
+              <w:bottom w:w="90" w:type="dxa"/>
+              <w:left w:w="100" w:type="dxa"/>
+              <w:right w:w="100" w:type="dxa"/>
+            </w:tcMar>
+          </w:tcPr>
+          <w:p>
+            <w:pPr>
+              <w:spacing w:after="0" w:line="269" w:lineRule="auto"/>
+            </w:pPr>
+            <w:r>
+              <w:rPr>
+                <w:rFonts w:ascii="Arial Unicode MS" w:hAnsi="Arial Unicode MS" w:eastAsia="Arial Unicode MS" w:cs="Arial Unicode MS"/>
+                <w:color w:val="000000"/>
+                <w:sz w:val="21"/>
+              </w:rPr>
+              <w:t>2026 年 10 月 23 日</w:t>
+            </w:r>
+          </w:p>
+        </w:tc>
+        <w:tc>
+          <w:tcPr>
+            <w:tcW w:type="dxa" w:w="3629"/>
+            <w:vAlign w:val="center"/>
+            <w:shd w:fill="FFFFFF"/>
+            <w:tcMar>
+              <w:top w:w="90" w:type="dxa"/>
+              <w:bottom w:w="90" w:type="dxa"/>
+              <w:left w:w="100" w:type="dxa"/>
+              <w:right w:w="100" w:type="dxa"/>
+            </w:tcMar>
+          </w:tcPr>
+          <w:p>
+            <w:pPr>
+              <w:spacing w:after="0" w:line="269" w:lineRule="auto"/>
+            </w:pPr>
+            <w:r>
+              <w:rPr>
+                <w:rFonts w:ascii="Arial Unicode MS" w:hAnsi="Arial Unicode MS" w:eastAsia="Arial Unicode MS" w:cs="Arial Unicode MS"/>
+                <w:color w:val="000000"/>
+                <w:sz w:val="21"/>
+              </w:rPr>
+              <w:t>补全 22 个工作包状态台账并关联小任务编号；更新基线差距、V25 迁移与消息接口状态</w:t>
+            </w:r>
+          </w:p>
+        </w:tc>
+        <w:tc>
+          <w:tcPr>
+            <w:tcW w:type="dxa" w:w="2016"/>
+            <w:vAlign w:val="center"/>
+            <w:shd w:fill="FFFFFF"/>
+            <w:tcMar>
+              <w:top w:w="90" w:type="dxa"/>
+              <w:bottom w:w="90" w:type="dxa"/>
+              <w:left w:w="100" w:type="dxa"/>
+              <w:right w:w="100" w:type="dxa"/>
+            </w:tcMar>
+          </w:tcPr>
+          <w:p>
+            <w:pPr>
+              <w:spacing w:after="0" w:line="269" w:lineRule="auto"/>
+            </w:pPr>
+            <w:r>
+              <w:rPr>
+                <w:rFonts w:ascii="Arial Unicode MS" w:hAnsi="Arial Unicode MS" w:eastAsia="Arial Unicode MS" w:cs="Arial Unicode MS"/>
+                <w:color w:val="000000"/>
+                <w:sz w:val="21"/>
+              </w:rPr>
+              <w:t>DP02、DP03、DP14、DP15、DP17 验证中；成长、治理、工具、发布与数据链路待开始</w:t>
             </w:r>
           </w:p>
         </w:tc>

</xml_diff>

<commit_message>
feat(activity): campus activities with registration and waitlist (A1)
Backend
- V27: activities and activity_registrations
- New activity module: verified organizers publish within their own scope,
  per-level reward caps, school-wide visibility with audience-limited sign-up
- Register / cancel with capacity, ordered waitlist and promotion; counters
  change only under a row lock on the activity, so concurrent sign-ups never oversell
- Cursor-paged lists (all, this week), my upcoming and past activities,
  organizer profile for the publish form; rate limits for publish and sign-up

iOS
- Weekly activities strip on home, activity list and detail with a
  status-driven primary action, my activities and organizer publish form in profile

Docs: ACTIVITY-PLAN, plan v1.4, roadmap A1-A4, API, AGENTS, DEVLOG, test environment record.

Co-Authored-By: Claude Opus 5.5 <noreply@anthropic.com>
</commit_message>
<xml_diff>
--- a/docs/UniPO-开发规划书-v1.0.docx
+++ b/docs/UniPO-开发规划书-v1.0.docx
@@ -20,7 +20,7 @@
           <w:rFonts w:ascii="Arial Unicode MS" w:hAnsi="Arial Unicode MS" w:eastAsia="Arial Unicode MS" w:cs="Arial Unicode MS"/>
           <w:color w:val="000000"/>
         </w:rPr>
-        <w:t>版本：1.3　基线日期：2026 年 10 月 21 日　更新日期：2026 年 10 月 23 日（v1.3）　适用范围：iOS 单校试点版本至可复制版本</w:t>
+        <w:t>版本：1.4　基线日期：2026 年 10 月 21 日　更新日期：2026 年 10 月 23 日（v1.4）　适用范围：iOS 单校试点版本至可复制版本</w:t>
       </w:r>
     </w:p>
     <w:p>
@@ -2134,7 +2134,24 @@
           <w:rFonts w:ascii="Arial Unicode MS" w:hAnsi="Arial Unicode MS" w:eastAsia="Arial Unicode MS" w:cs="Arial Unicode MS"/>
           <w:color w:val="000000"/>
         </w:rPr>
-        <w:t>2026 年 10 月 23 日起，工具页与图片转 PDF 暂停；本期重点为成长系统、PO 流与社交及全 App 界面设计，执行顺序见小任务路线图 C01 至 C09。课程表整体暂缓，现有实现保留，不将原网页课表任务转成新的 iOS 课表需求。本期不安排网页分享路由、SEO、响应式、网页端工具、新增管理页面或 Web E2E。</w:t>
+        <w:t xml:space="preserve">2026 年 10 月 23 日起，成长奖励改为只来自认证组织者发布的校园活动，活动的发布、报名、签到、发奖与历史构成新的成长闭环；金币进入本期范围，先只做获取与流水，详见 </w:t>
+      </w:r>
+      <w:r>
+        <w:rPr>
+          <w:rFonts w:ascii="Arial Unicode MS" w:hAnsi="Arial Unicode MS" w:eastAsia="Arial Unicode MS" w:cs="Arial Unicode MS"/>
+          <w:color w:val="000000"/>
+        </w:rPr>
+        <w:t>校园活动规划</w:t>
+      </w:r>
+      <w:r>
+        <w:t>（ACTIVITY-PLAN.md）</w:t>
+      </w:r>
+      <w:r>
+        <w:rPr>
+          <w:rFonts w:ascii="Arial Unicode MS" w:hAnsi="Arial Unicode MS" w:eastAsia="Arial Unicode MS" w:cs="Arial Unicode MS"/>
+          <w:color w:val="000000"/>
+        </w:rPr>
+        <w:t>。内容只限同校，本校公开可见。同日起，工具页与图片转 PDF 暂停；本期重点为成长系统、PO 流与社交及全 App 界面设计，执行顺序见小任务路线图 C01 至 C09。课程表整体暂缓，现有实现保留，不将原网页课表任务转成新的 iOS 课表需求。本期不安排网页分享路由、SEO、响应式、网页端工具、新增管理页面或 Web E2E。</w:t>
       </w:r>
     </w:p>
     <w:p>
@@ -2143,7 +2160,7 @@
           <w:rFonts w:ascii="Arial Unicode MS" w:hAnsi="Arial Unicode MS" w:eastAsia="Arial Unicode MS" w:cs="Arial Unicode MS"/>
           <w:color w:val="000000"/>
         </w:rPr>
-        <w:t>五工具齐发、工具配额、金币账本、商城、付费、云盘、二手交易、附件平台、复杂活动与金 V 全套审核、Android、微服务不进入本期必交范围。真实身份认证与贡献奖励分别定义，不以投稿奖励冒充校园身份认证。</w:t>
+        <w:t>五工具齐发、工具配额、商城、付费、云盘、二手交易、附件平台、复杂活动与金 V 全套审核、Android、微服务不进入本期必交范围。真实身份认证与贡献奖励分别定义，不以投稿奖励冒充校园身份认证。</w:t>
       </w:r>
     </w:p>
     <w:p>
@@ -18495,6 +18512,115 @@
                 <w:sz w:val="21"/>
               </w:rPr>
               <w:t>执行顺序见路线图 C01 至 C09</w:t>
+            </w:r>
+          </w:p>
+        </w:tc>
+      </w:tr>
+      <w:tr>
+        <w:trPr>
+          <w:cantSplit/>
+        </w:trPr>
+        <w:tc>
+          <w:tcPr>
+            <w:tcW w:type="dxa" w:w="1613"/>
+            <w:vAlign w:val="center"/>
+            <w:shd w:fill="FFFFFF"/>
+            <w:tcMar>
+              <w:top w:w="90" w:type="dxa"/>
+              <w:bottom w:w="90" w:type="dxa"/>
+              <w:left w:w="100" w:type="dxa"/>
+              <w:right w:w="100" w:type="dxa"/>
+            </w:tcMar>
+          </w:tcPr>
+          <w:p>
+            <w:pPr>
+              <w:spacing w:after="0" w:line="269" w:lineRule="auto"/>
+            </w:pPr>
+            <w:r>
+              <w:rPr>
+                <w:rFonts w:ascii="Arial Unicode MS" w:hAnsi="Arial Unicode MS" w:eastAsia="Arial Unicode MS" w:cs="Arial Unicode MS"/>
+                <w:color w:val="000000"/>
+                <w:sz w:val="21"/>
+              </w:rPr>
+              <w:t>1.4</w:t>
+            </w:r>
+          </w:p>
+        </w:tc>
+        <w:tc>
+          <w:tcPr>
+            <w:tcW w:type="dxa" w:w="2822"/>
+            <w:vAlign w:val="center"/>
+            <w:shd w:fill="FFFFFF"/>
+            <w:tcMar>
+              <w:top w:w="90" w:type="dxa"/>
+              <w:bottom w:w="90" w:type="dxa"/>
+              <w:left w:w="100" w:type="dxa"/>
+              <w:right w:w="100" w:type="dxa"/>
+            </w:tcMar>
+          </w:tcPr>
+          <w:p>
+            <w:pPr>
+              <w:spacing w:after="0" w:line="269" w:lineRule="auto"/>
+            </w:pPr>
+            <w:r>
+              <w:rPr>
+                <w:rFonts w:ascii="Arial Unicode MS" w:hAnsi="Arial Unicode MS" w:eastAsia="Arial Unicode MS" w:cs="Arial Unicode MS"/>
+                <w:color w:val="000000"/>
+                <w:sz w:val="21"/>
+              </w:rPr>
+              <w:t>2026 年 10 月 23 日</w:t>
+            </w:r>
+          </w:p>
+        </w:tc>
+        <w:tc>
+          <w:tcPr>
+            <w:tcW w:type="dxa" w:w="3629"/>
+            <w:vAlign w:val="center"/>
+            <w:shd w:fill="FFFFFF"/>
+            <w:tcMar>
+              <w:top w:w="90" w:type="dxa"/>
+              <w:bottom w:w="90" w:type="dxa"/>
+              <w:left w:w="100" w:type="dxa"/>
+              <w:right w:w="100" w:type="dxa"/>
+            </w:tcMar>
+          </w:tcPr>
+          <w:p>
+            <w:pPr>
+              <w:spacing w:after="0" w:line="269" w:lineRule="auto"/>
+            </w:pPr>
+            <w:r>
+              <w:rPr>
+                <w:rFonts w:ascii="Arial Unicode MS" w:hAnsi="Arial Unicode MS" w:eastAsia="Arial Unicode MS" w:cs="Arial Unicode MS"/>
+                <w:color w:val="000000"/>
+                <w:sz w:val="21"/>
+              </w:rPr>
+              <w:t>成长奖励改由认证组织者的校园活动发放；金币获取与流水进入本期；新增活动 A1 至 A4</w:t>
+            </w:r>
+          </w:p>
+        </w:tc>
+        <w:tc>
+          <w:tcPr>
+            <w:tcW w:type="dxa" w:w="2016"/>
+            <w:vAlign w:val="center"/>
+            <w:shd w:fill="FFFFFF"/>
+            <w:tcMar>
+              <w:top w:w="90" w:type="dxa"/>
+              <w:bottom w:w="90" w:type="dxa"/>
+              <w:left w:w="100" w:type="dxa"/>
+              <w:right w:w="100" w:type="dxa"/>
+            </w:tcMar>
+          </w:tcPr>
+          <w:p>
+            <w:pPr>
+              <w:spacing w:after="0" w:line="269" w:lineRule="auto"/>
+            </w:pPr>
+            <w:r>
+              <w:rPr>
+                <w:rFonts w:ascii="Arial Unicode MS" w:hAnsi="Arial Unicode MS" w:eastAsia="Arial Unicode MS" w:cs="Arial Unicode MS"/>
+                <w:color w:val="000000"/>
+                <w:sz w:val="21"/>
+              </w:rPr>
+              <w:t>A1 进行中，见 ACTIVITY-PLAN</w:t>
             </w:r>
           </w:p>
         </w:tc>

</xml_diff>